<commit_message>
Anpassungen Farbe Schrift und Hintergrund
</commit_message>
<xml_diff>
--- a/doc/sad/TSaS_SAD_arc42_1.docx
+++ b/doc/sad/TSaS_SAD_arc42_1.docx
@@ -2,33 +2,7 @@
 <file path=word/document.xml><?xml version="1.0" encoding="utf-8"?>
 <w:document xmlns:w="http://schemas.openxmlformats.org/wordprocessingml/2006/main" xmlns:m="http://schemas.openxmlformats.org/officeDocument/2006/math" xmlns:r="http://schemas.openxmlformats.org/officeDocument/2006/relationships" xmlns:o="urn:schemas-microsoft-com:office:office" xmlns:v="urn:schemas-microsoft-com:vml" xmlns:w10="urn:schemas-microsoft-com:office:word" xmlns:a="http://schemas.openxmlformats.org/drawingml/2006/main" xmlns:pic="http://schemas.openxmlformats.org/drawingml/2006/picture" xmlns:wp="http://schemas.openxmlformats.org/drawingml/2006/wordprocessingDrawing">
   <w:body>
-    <w:sdt>
-      <w:sdtPr>
-        <w:docPartObj>
-          <w:docPartGallery w:val="Table of Contents"/>
-          <w:docPartUnique/>
-        </w:docPartObj>
-      </w:sdtPr>
-      <w:sdtContent>
-        <w:p>
-          <w:pPr>
-            <w:pStyle w:val="TOCHeading"/>
-          </w:pPr>
-          <w:r>
-            <w:t xml:space="preserve">Table of Contents</w:t>
-          </w:r>
-        </w:p>
-        <w:p>
-          <w:r>
-            <w:fldChar w:fldCharType="begin" w:dirty="true"/>
-            <w:instrText xml:space="preserve">TOC \o "1-3" \h \z \u</w:instrText>
-            <w:fldChar w:fldCharType="separate"/>
-            <w:fldChar w:fldCharType="end"/>
-          </w:r>
-        </w:p>
-      </w:sdtContent>
-    </w:sdt>
-    <w:bookmarkStart w:id="71" w:name="X8e4ebc2e1f4eb088d047a6684ad88a5c65a2b31"/>
+    <w:bookmarkStart w:id="70" w:name="X8e4ebc2e1f4eb088d047a6684ad88a5c65a2b31"/>
     <w:p>
       <w:pPr>
         <w:pStyle w:val="Heading1"/>
@@ -234,171 +208,32 @@
         </w:pict>
       </w:r>
     </w:p>
-    <w:bookmarkStart w:id="9" w:name="inhaltsverzeichnis"/>
-    <w:p>
-      <w:pPr>
-        <w:pStyle w:val="Heading2"/>
-      </w:pPr>
-      <w:r>
-        <w:t xml:space="preserve">Inhaltsverzeichnis</w:t>
-      </w:r>
-    </w:p>
-    <w:p>
-      <w:pPr>
-        <w:pStyle w:val="Compact"/>
-        <w:numPr>
-          <w:ilvl w:val="0"/>
-          <w:numId w:val="1001"/>
-        </w:numPr>
-      </w:pPr>
-      <w:r>
-        <w:t xml:space="preserve">Einführung und Ziele</w:t>
-      </w:r>
-    </w:p>
-    <w:p>
-      <w:pPr>
-        <w:pStyle w:val="Compact"/>
-        <w:numPr>
-          <w:ilvl w:val="0"/>
-          <w:numId w:val="1001"/>
-        </w:numPr>
-      </w:pPr>
-      <w:r>
-        <w:t xml:space="preserve">Randbedingungen</w:t>
-      </w:r>
-    </w:p>
-    <w:p>
-      <w:pPr>
-        <w:pStyle w:val="Compact"/>
-        <w:numPr>
-          <w:ilvl w:val="0"/>
-          <w:numId w:val="1001"/>
-        </w:numPr>
-      </w:pPr>
-      <w:r>
-        <w:t xml:space="preserve">Kontextabgrenzung</w:t>
-      </w:r>
-    </w:p>
-    <w:p>
-      <w:pPr>
-        <w:pStyle w:val="Compact"/>
-        <w:numPr>
-          <w:ilvl w:val="0"/>
-          <w:numId w:val="1001"/>
-        </w:numPr>
-      </w:pPr>
-      <w:r>
-        <w:t xml:space="preserve">Lösungsstrategie</w:t>
-      </w:r>
-    </w:p>
-    <w:p>
-      <w:pPr>
-        <w:pStyle w:val="Compact"/>
-        <w:numPr>
-          <w:ilvl w:val="0"/>
-          <w:numId w:val="1001"/>
-        </w:numPr>
-      </w:pPr>
-      <w:r>
-        <w:t xml:space="preserve">Bausteinsicht</w:t>
-      </w:r>
-    </w:p>
-    <w:p>
-      <w:pPr>
-        <w:pStyle w:val="Compact"/>
-        <w:numPr>
-          <w:ilvl w:val="0"/>
-          <w:numId w:val="1001"/>
-        </w:numPr>
-      </w:pPr>
-      <w:r>
-        <w:t xml:space="preserve">Laufzeitsicht</w:t>
-      </w:r>
-    </w:p>
-    <w:p>
-      <w:pPr>
-        <w:pStyle w:val="Compact"/>
-        <w:numPr>
-          <w:ilvl w:val="0"/>
-          <w:numId w:val="1001"/>
-        </w:numPr>
-      </w:pPr>
-      <w:r>
-        <w:t xml:space="preserve">Verteilungssicht</w:t>
-      </w:r>
-    </w:p>
-    <w:p>
-      <w:pPr>
-        <w:pStyle w:val="Compact"/>
-        <w:numPr>
-          <w:ilvl w:val="0"/>
-          <w:numId w:val="1001"/>
-        </w:numPr>
-      </w:pPr>
-      <w:r>
-        <w:t xml:space="preserve">Querschnittliche Konzepte</w:t>
-      </w:r>
-    </w:p>
-    <w:p>
-      <w:pPr>
-        <w:pStyle w:val="Compact"/>
-        <w:numPr>
-          <w:ilvl w:val="0"/>
-          <w:numId w:val="1001"/>
-        </w:numPr>
-      </w:pPr>
-      <w:r>
-        <w:t xml:space="preserve">Architekturentscheidungen</w:t>
-      </w:r>
-    </w:p>
-    <w:p>
-      <w:pPr>
-        <w:pStyle w:val="Compact"/>
-        <w:numPr>
-          <w:ilvl w:val="0"/>
-          <w:numId w:val="1001"/>
-        </w:numPr>
-      </w:pPr>
-      <w:r>
-        <w:t xml:space="preserve">Qualitätsanforderungen</w:t>
-      </w:r>
-    </w:p>
-    <w:p>
-      <w:pPr>
-        <w:pStyle w:val="Compact"/>
-        <w:numPr>
-          <w:ilvl w:val="0"/>
-          <w:numId w:val="1001"/>
-        </w:numPr>
-      </w:pPr>
-      <w:r>
-        <w:t xml:space="preserve">Datenmodell</w:t>
-      </w:r>
-    </w:p>
-    <w:p>
-      <w:pPr>
-        <w:pStyle w:val="Compact"/>
-        <w:numPr>
-          <w:ilvl w:val="0"/>
-          <w:numId w:val="1001"/>
-        </w:numPr>
-      </w:pPr>
-      <w:r>
-        <w:t xml:space="preserve">Risiken und technische Schulden</w:t>
-      </w:r>
-    </w:p>
-    <w:p>
-      <w:pPr>
-        <w:pStyle w:val="Compact"/>
-        <w:numPr>
-          <w:ilvl w:val="0"/>
-          <w:numId w:val="1001"/>
-        </w:numPr>
-      </w:pPr>
-      <w:r>
-        <w:t xml:space="preserve">Glossar</w:t>
-      </w:r>
-    </w:p>
+    <w:sdt>
+      <w:sdtPr>
+        <w:docPartObj>
+          <w:docPartGallery w:val="Inhaltsverzeichnis"/>
+          <w:docPartUnique/>
+        </w:docPartObj>
+      </w:sdtPr>
+      <w:sdtContent>
+        <w:p>
+          <w:pPr>
+            <w:pStyle w:val="TOCHeading"/>
+          </w:pPr>
+          <w:r>
+            <w:t xml:space="preserve">Inhaltsverzeichnis</w:t>
+          </w:r>
+        </w:p>
+        <w:p>
+          <w:r>
+            <w:fldChar w:fldCharType="begin" w:dirty="true"/>
+            <w:instrText xml:space="preserve">TOC \o "1-3" \h \z \u</w:instrText>
+            <w:fldChar w:fldCharType="separate"/>
+            <w:fldChar w:fldCharType="end"/>
+          </w:r>
+        </w:p>
+      </w:sdtContent>
+    </w:sdt>
     <w:p>
       <w:r>
         <w:pict>
@@ -406,51 +241,50 @@
         </w:pict>
       </w:r>
     </w:p>
+    <w:bookmarkStart w:id="12" w:name="einführung-und-ziele"/>
+    <w:p>
+      <w:pPr>
+        <w:pStyle w:val="Heading2"/>
+      </w:pPr>
+      <w:r>
+        <w:t xml:space="preserve">1. Einführung und Ziele</w:t>
+      </w:r>
+    </w:p>
+    <w:p>
+      <w:pPr>
+        <w:pStyle w:val="FirstParagraph"/>
+      </w:pPr>
+      <w:r>
+        <w:t xml:space="preserve">Für die gezielte Vorbereitung auf ein Tennismatch fehlt derzeit eine geeignete Anwendung, welche es Eltern und Trainern ermöglicht, Statistiken und Informationen über die Spielweise und Eigenheiten des eigenen Spielers sowie des Gegners zu erfassen und auszuwerten.</w:t>
+      </w:r>
+    </w:p>
+    <w:p>
+      <w:pPr>
+        <w:pStyle w:val="BodyText"/>
+      </w:pPr>
+      <w:r>
+        <w:t xml:space="preserve">Diese Lücke soll die Anwendung Tennis Score and Statistic (TSaS) schliessen. Ziel ist die Entwicklung einer Web-App (später zusätzlich einer iOS-App), mit der Trainer oder Eltern ein Tennismatch Punkt für Punkt mit vordefinierten und frei definierbaren Angaben dokumentieren können.</w:t>
+      </w:r>
+    </w:p>
+    <w:bookmarkStart w:id="9" w:name="aufgabenstellung"/>
+    <w:p>
+      <w:pPr>
+        <w:pStyle w:val="Heading3"/>
+      </w:pPr>
+      <w:r>
+        <w:t xml:space="preserve">1.1 Aufgabenstellung</w:t>
+      </w:r>
+    </w:p>
+    <w:p>
+      <w:pPr>
+        <w:pStyle w:val="FirstParagraph"/>
+      </w:pPr>
+      <w:r>
+        <w:t xml:space="preserve">TSaS soll eine webbasierte Applikation bereitstellen, mit der der aktuelle Spielstand eines Tennismatches festgehalten und jeder Punkt mit fixen Attributen dokumentiert werden kann. Zusätzlich sollen einfache statistische Auswertungen ermöglicht werden.</w:t>
+      </w:r>
+    </w:p>
     <w:bookmarkEnd w:id="9"/>
-    <w:bookmarkStart w:id="13" w:name="einführung-und-ziele"/>
-    <w:p>
-      <w:pPr>
-        <w:pStyle w:val="Heading2"/>
-      </w:pPr>
-      <w:r>
-        <w:t xml:space="preserve">1. Einführung und Ziele</w:t>
-      </w:r>
-    </w:p>
-    <w:p>
-      <w:pPr>
-        <w:pStyle w:val="FirstParagraph"/>
-      </w:pPr>
-      <w:r>
-        <w:t xml:space="preserve">Für die gezielte Vorbereitung auf ein Tennismatch fehlt derzeit eine geeignete Anwendung, welche es Eltern und Trainern ermöglicht, Statistiken und Informationen über die Spielweise und Eigenheiten des eigenen Spielers sowie des Gegners zu erfassen und auszuwerten.</w:t>
-      </w:r>
-    </w:p>
-    <w:p>
-      <w:pPr>
-        <w:pStyle w:val="BodyText"/>
-      </w:pPr>
-      <w:r>
-        <w:t xml:space="preserve">Diese Lücke soll die Anwendung Tennis Score and Statistic (TSaS) schliessen. Ziel ist die Entwicklung einer Web-App (später zusätzlich einer iOS-App), mit der Trainer oder Eltern ein Tennismatch Punkt für Punkt mit vordefinierten und frei definierbaren Angaben dokumentieren können.</w:t>
-      </w:r>
-    </w:p>
-    <w:bookmarkStart w:id="10" w:name="aufgabenstellung"/>
-    <w:p>
-      <w:pPr>
-        <w:pStyle w:val="Heading3"/>
-      </w:pPr>
-      <w:r>
-        <w:t xml:space="preserve">1.1 Aufgabenstellung</w:t>
-      </w:r>
-    </w:p>
-    <w:p>
-      <w:pPr>
-        <w:pStyle w:val="FirstParagraph"/>
-      </w:pPr>
-      <w:r>
-        <w:t xml:space="preserve">TSaS soll eine webbasierte Applikation bereitstellen, mit der der aktuelle Spielstand eines Tennismatches festgehalten und jeder Punkt mit fixen Attributen dokumentiert werden kann. Zusätzlich sollen einfache statistische Auswertungen ermöglicht werden.</w:t>
-      </w:r>
-    </w:p>
-    <w:bookmarkEnd w:id="10"/>
-    <w:bookmarkStart w:id="11" w:name="qualitätsziele"/>
+    <w:bookmarkStart w:id="10" w:name="qualitätsziele"/>
     <w:p>
       <w:pPr>
         <w:pStyle w:val="Heading3"/>
@@ -798,8 +632,8 @@
         </w:tc>
       </w:tr>
     </w:tbl>
-    <w:bookmarkEnd w:id="11"/>
-    <w:bookmarkStart w:id="12" w:name="stakeholder"/>
+    <w:bookmarkEnd w:id="10"/>
+    <w:bookmarkStart w:id="11" w:name="stakeholder"/>
     <w:p>
       <w:pPr>
         <w:pStyle w:val="Heading3"/>
@@ -938,9 +772,9 @@
         </w:pict>
       </w:r>
     </w:p>
+    <w:bookmarkEnd w:id="11"/>
     <w:bookmarkEnd w:id="12"/>
-    <w:bookmarkEnd w:id="13"/>
-    <w:bookmarkStart w:id="16" w:name="randbedingungen"/>
+    <w:bookmarkStart w:id="15" w:name="randbedingungen"/>
     <w:p>
       <w:pPr>
         <w:pStyle w:val="Heading2"/>
@@ -949,7 +783,7 @@
         <w:t xml:space="preserve">2. Randbedingungen</w:t>
       </w:r>
     </w:p>
-    <w:bookmarkStart w:id="14" w:name="technische-randbedingungen"/>
+    <w:bookmarkStart w:id="13" w:name="technische-randbedingungen"/>
     <w:p>
       <w:pPr>
         <w:pStyle w:val="Heading3"/>
@@ -1224,8 +1058,8 @@
         </w:tc>
       </w:tr>
     </w:tbl>
-    <w:bookmarkEnd w:id="14"/>
-    <w:bookmarkStart w:id="15" w:name="organisatorische-randbedingungen"/>
+    <w:bookmarkEnd w:id="13"/>
+    <w:bookmarkStart w:id="14" w:name="organisatorische-randbedingungen"/>
     <w:p>
       <w:pPr>
         <w:pStyle w:val="Heading3"/>
@@ -1239,7 +1073,7 @@
         <w:pStyle w:val="Compact"/>
         <w:numPr>
           <w:ilvl w:val="0"/>
-          <w:numId w:val="1002"/>
+          <w:numId w:val="1001"/>
         </w:numPr>
       </w:pPr>
       <w:r>
@@ -1251,7 +1085,7 @@
         <w:pStyle w:val="Compact"/>
         <w:numPr>
           <w:ilvl w:val="0"/>
-          <w:numId w:val="1002"/>
+          <w:numId w:val="1001"/>
         </w:numPr>
       </w:pPr>
       <w:r>
@@ -1263,7 +1097,7 @@
         <w:pStyle w:val="Compact"/>
         <w:numPr>
           <w:ilvl w:val="0"/>
-          <w:numId w:val="1002"/>
+          <w:numId w:val="1001"/>
         </w:numPr>
       </w:pPr>
       <w:r>
@@ -1277,9 +1111,9 @@
         </w:pict>
       </w:r>
     </w:p>
+    <w:bookmarkEnd w:id="14"/>
     <w:bookmarkEnd w:id="15"/>
-    <w:bookmarkEnd w:id="16"/>
-    <w:bookmarkStart w:id="23" w:name="kontextabgrenzung"/>
+    <w:bookmarkStart w:id="22" w:name="kontextabgrenzung"/>
     <w:p>
       <w:pPr>
         <w:pStyle w:val="Heading2"/>
@@ -1288,7 +1122,7 @@
         <w:t xml:space="preserve">3. Kontextabgrenzung</w:t>
       </w:r>
     </w:p>
-    <w:bookmarkStart w:id="21" w:name="fachlicher-kontext"/>
+    <w:bookmarkStart w:id="20" w:name="fachlicher-kontext"/>
     <w:p>
       <w:pPr>
         <w:pStyle w:val="Heading3"/>
@@ -1314,18 +1148,18 @@
           <wp:inline>
             <wp:extent cx="5039999" cy="3130739"/>
             <wp:effectExtent b="0" l="0" r="0" t="0"/>
-            <wp:docPr descr="TSaS – Fachlicher Kontext" title="" id="18" name="Picture"/>
+            <wp:docPr descr="TSaS – Fachlicher Kontext" title="" id="17" name="Picture"/>
             <a:graphic>
               <a:graphicData uri="http://schemas.openxmlformats.org/drawingml/2006/picture">
                 <pic:pic>
                   <pic:nvPicPr>
-                    <pic:cNvPr descr="Fachlicher_Kontext.png" id="19" name="Picture"/>
+                    <pic:cNvPr descr="Fachlicher_Kontext.png" id="18" name="Picture"/>
                     <pic:cNvPicPr>
                       <a:picLocks noChangeArrowheads="1" noChangeAspect="1"/>
                     </pic:cNvPicPr>
                   </pic:nvPicPr>
                   <pic:blipFill>
-                    <a:blip r:embed="rId17"/>
+                    <a:blip r:embed="rId16"/>
                     <a:stretch>
                       <a:fillRect/>
                     </a:stretch>
@@ -1378,7 +1212,7 @@
         </w:rPr>
         <w:t xml:space="preserve"> </w:t>
       </w:r>
-      <w:hyperlink r:id="rId20">
+      <w:hyperlink r:id="rId19">
         <w:r>
           <w:rPr>
             <w:rStyle w:val="VerbatimChar"/>
@@ -1540,8 +1374,8 @@
         </w:tc>
       </w:tr>
     </w:tbl>
-    <w:bookmarkEnd w:id="21"/>
-    <w:bookmarkStart w:id="22" w:name="technischer-kontext"/>
+    <w:bookmarkEnd w:id="20"/>
+    <w:bookmarkStart w:id="21" w:name="technischer-kontext"/>
     <w:p>
       <w:pPr>
         <w:pStyle w:val="Heading3"/>
@@ -1699,9 +1533,9 @@
         </w:pict>
       </w:r>
     </w:p>
+    <w:bookmarkEnd w:id="21"/>
     <w:bookmarkEnd w:id="22"/>
-    <w:bookmarkEnd w:id="23"/>
-    <w:bookmarkStart w:id="27" w:name="lösungsstrategie"/>
+    <w:bookmarkStart w:id="26" w:name="lösungsstrategie"/>
     <w:p>
       <w:pPr>
         <w:pStyle w:val="Heading2"/>
@@ -1710,7 +1544,7 @@
         <w:t xml:space="preserve">4. Lösungsstrategie</w:t>
       </w:r>
     </w:p>
-    <w:bookmarkStart w:id="24" w:name="architekturansatz-modularer-monolith"/>
+    <w:bookmarkStart w:id="23" w:name="architekturansatz-modularer-monolith"/>
     <w:p>
       <w:pPr>
         <w:pStyle w:val="Heading3"/>
@@ -1732,7 +1566,7 @@
         <w:pStyle w:val="Compact"/>
         <w:numPr>
           <w:ilvl w:val="0"/>
-          <w:numId w:val="1003"/>
+          <w:numId w:val="1002"/>
         </w:numPr>
       </w:pPr>
       <w:r>
@@ -1744,7 +1578,7 @@
         <w:pStyle w:val="Compact"/>
         <w:numPr>
           <w:ilvl w:val="0"/>
-          <w:numId w:val="1003"/>
+          <w:numId w:val="1002"/>
         </w:numPr>
       </w:pPr>
       <w:r>
@@ -1756,7 +1590,7 @@
         <w:pStyle w:val="Compact"/>
         <w:numPr>
           <w:ilvl w:val="0"/>
-          <w:numId w:val="1003"/>
+          <w:numId w:val="1002"/>
         </w:numPr>
       </w:pPr>
       <w:r>
@@ -1768,15 +1602,15 @@
         <w:pStyle w:val="Compact"/>
         <w:numPr>
           <w:ilvl w:val="0"/>
-          <w:numId w:val="1003"/>
+          <w:numId w:val="1002"/>
         </w:numPr>
       </w:pPr>
       <w:r>
         <w:t xml:space="preserve">Geringere Komplexität bei der Kommunikation (keine Netzwerk-Latenzen zwischen Modulen).</w:t>
       </w:r>
     </w:p>
-    <w:bookmarkEnd w:id="24"/>
-    <w:bookmarkStart w:id="25" w:name="technologieentscheidungen"/>
+    <w:bookmarkEnd w:id="23"/>
+    <w:bookmarkStart w:id="24" w:name="technologieentscheidungen"/>
     <w:p>
       <w:pPr>
         <w:pStyle w:val="Heading3"/>
@@ -2112,8 +1946,8 @@
         </w:tc>
       </w:tr>
     </w:tbl>
-    <w:bookmarkEnd w:id="25"/>
-    <w:bookmarkStart w:id="26" w:name="release-planung"/>
+    <w:bookmarkEnd w:id="24"/>
+    <w:bookmarkStart w:id="25" w:name="release-planung"/>
     <w:p>
       <w:pPr>
         <w:pStyle w:val="Heading3"/>
@@ -2336,9 +2170,9 @@
         </w:pict>
       </w:r>
     </w:p>
+    <w:bookmarkEnd w:id="25"/>
     <w:bookmarkEnd w:id="26"/>
-    <w:bookmarkEnd w:id="27"/>
-    <w:bookmarkStart w:id="39" w:name="bausteinsicht"/>
+    <w:bookmarkStart w:id="38" w:name="bausteinsicht"/>
     <w:p>
       <w:pPr>
         <w:pStyle w:val="Heading2"/>
@@ -2347,7 +2181,7 @@
         <w:t xml:space="preserve">5. Bausteinsicht</w:t>
       </w:r>
     </w:p>
-    <w:bookmarkStart w:id="28" w:name="whitebox-gesamtsystem"/>
+    <w:bookmarkStart w:id="27" w:name="whitebox-gesamtsystem"/>
     <w:p>
       <w:pPr>
         <w:pStyle w:val="Heading3"/>
@@ -2418,8 +2252,8 @@
         <w:t xml:space="preserve">Identity Provider für Authentifizierung und Autorisierung.</w:t>
       </w:r>
     </w:p>
-    <w:bookmarkEnd w:id="28"/>
-    <w:bookmarkStart w:id="33" w:name="backend-module-modularer-monolith"/>
+    <w:bookmarkEnd w:id="27"/>
+    <w:bookmarkStart w:id="32" w:name="backend-module-modularer-monolith"/>
     <w:p>
       <w:pPr>
         <w:pStyle w:val="Heading3"/>
@@ -2821,18 +2655,18 @@
           <wp:inline>
             <wp:extent cx="5334000" cy="2876721"/>
             <wp:effectExtent b="0" l="0" r="0" t="0"/>
-            <wp:docPr descr="TSaS Backend – Fachliche Module" title="" id="30" name="Picture"/>
+            <wp:docPr descr="TSaS Backend – Fachliche Module" title="" id="29" name="Picture"/>
             <a:graphic>
               <a:graphicData uri="http://schemas.openxmlformats.org/drawingml/2006/picture">
                 <pic:pic>
                   <pic:nvPicPr>
-                    <pic:cNvPr descr="Backend_Module.png" id="31" name="Picture"/>
+                    <pic:cNvPr descr="Backend_Module.png" id="30" name="Picture"/>
                     <pic:cNvPicPr>
                       <a:picLocks noChangeArrowheads="1" noChangeAspect="1"/>
                     </pic:cNvPicPr>
                   </pic:nvPicPr>
                   <pic:blipFill>
-                    <a:blip r:embed="rId29"/>
+                    <a:blip r:embed="rId28"/>
                     <a:stretch>
                       <a:fillRect/>
                     </a:stretch>
@@ -2885,7 +2719,7 @@
         </w:rPr>
         <w:t xml:space="preserve"> </w:t>
       </w:r>
-      <w:hyperlink r:id="rId32">
+      <w:hyperlink r:id="rId31">
         <w:r>
           <w:rPr>
             <w:rStyle w:val="VerbatimChar"/>
@@ -2896,8 +2730,8 @@
         </w:r>
       </w:hyperlink>
     </w:p>
-    <w:bookmarkEnd w:id="33"/>
-    <w:bookmarkStart w:id="38" w:name="Xdde48f936cf8430c2326803bb37fe317373f62f"/>
+    <w:bookmarkEnd w:id="32"/>
+    <w:bookmarkStart w:id="37" w:name="Xdde48f936cf8430c2326803bb37fe317373f62f"/>
     <w:p>
       <w:pPr>
         <w:pStyle w:val="Heading3"/>
@@ -2932,7 +2766,7 @@
         <w:pStyle w:val="Compact"/>
         <w:numPr>
           <w:ilvl w:val="0"/>
-          <w:numId w:val="1004"/>
+          <w:numId w:val="1003"/>
         </w:numPr>
       </w:pPr>
       <w:r>
@@ -3026,7 +2860,7 @@
         <w:pStyle w:val="Compact"/>
         <w:numPr>
           <w:ilvl w:val="0"/>
-          <w:numId w:val="1004"/>
+          <w:numId w:val="1003"/>
         </w:numPr>
       </w:pPr>
       <w:r>
@@ -3243,7 +3077,7 @@
         <w:pStyle w:val="Compact"/>
         <w:numPr>
           <w:ilvl w:val="0"/>
-          <w:numId w:val="1004"/>
+          <w:numId w:val="1003"/>
         </w:numPr>
       </w:pPr>
       <w:r>
@@ -3361,18 +3195,18 @@
           <wp:inline>
             <wp:extent cx="5334000" cy="3488096"/>
             <wp:effectExtent b="0" l="0" r="0" t="0"/>
-            <wp:docPr descr="TSaS Backend – Clean Architecture (Klassen-Detail)" title="" id="35" name="Picture"/>
+            <wp:docPr descr="TSaS Backend – Clean Architecture (Klassen-Detail)" title="" id="34" name="Picture"/>
             <a:graphic>
               <a:graphicData uri="http://schemas.openxmlformats.org/drawingml/2006/picture">
                 <pic:pic>
                   <pic:nvPicPr>
-                    <pic:cNvPr descr="Backend_CleanArchitecture.png" id="36" name="Picture"/>
+                    <pic:cNvPr descr="Backend_CleanArchitecture.png" id="35" name="Picture"/>
                     <pic:cNvPicPr>
                       <a:picLocks noChangeArrowheads="1" noChangeAspect="1"/>
                     </pic:cNvPicPr>
                   </pic:nvPicPr>
                   <pic:blipFill>
-                    <a:blip r:embed="rId34"/>
+                    <a:blip r:embed="rId33"/>
                     <a:stretch>
                       <a:fillRect/>
                     </a:stretch>
@@ -3425,7 +3259,7 @@
         </w:rPr>
         <w:t xml:space="preserve"> </w:t>
       </w:r>
-      <w:hyperlink r:id="rId37">
+      <w:hyperlink r:id="rId36">
         <w:r>
           <w:rPr>
             <w:rStyle w:val="VerbatimChar"/>
@@ -3443,24 +3277,126 @@
         </w:pict>
       </w:r>
     </w:p>
+    <w:bookmarkEnd w:id="37"/>
     <w:bookmarkEnd w:id="38"/>
+    <w:bookmarkStart w:id="42" w:name="laufzeitsicht"/>
+    <w:p>
+      <w:pPr>
+        <w:pStyle w:val="Heading2"/>
+      </w:pPr>
+      <w:r>
+        <w:t xml:space="preserve">6. Laufzeitsicht</w:t>
+      </w:r>
+    </w:p>
+    <w:bookmarkStart w:id="39" w:name="szenario-punkt-erfassen"/>
+    <w:p>
+      <w:pPr>
+        <w:pStyle w:val="Heading3"/>
+      </w:pPr>
+      <w:r>
+        <w:t xml:space="preserve">6.1 Szenario: Punkt erfassen</w:t>
+      </w:r>
+    </w:p>
+    <w:p>
+      <w:pPr>
+        <w:pStyle w:val="FirstParagraph"/>
+      </w:pPr>
+      <w:r>
+        <w:t xml:space="preserve">Dieses Szenario beschreibt den typischen Ablauf, wenn ein Trainer während eines Matches einen Punkt erfasst:</w:t>
+      </w:r>
+    </w:p>
+    <w:p>
+      <w:pPr>
+        <w:pStyle w:val="Compact"/>
+        <w:numPr>
+          <w:ilvl w:val="0"/>
+          <w:numId w:val="1004"/>
+        </w:numPr>
+      </w:pPr>
+      <w:r>
+        <w:t xml:space="preserve">Der Trainer klickt im Angular-Frontend auf die Schaltfläche für den Punkttyp (z.B. „Forehand Winner”).</w:t>
+      </w:r>
+    </w:p>
+    <w:p>
+      <w:pPr>
+        <w:pStyle w:val="Compact"/>
+        <w:numPr>
+          <w:ilvl w:val="0"/>
+          <w:numId w:val="1004"/>
+        </w:numPr>
+      </w:pPr>
+      <w:r>
+        <w:t xml:space="preserve">Das Frontend sendet einen POST-Request an /api/matches/{id}/points mit dem Bearer Token im Authorization-Header.</w:t>
+      </w:r>
+    </w:p>
+    <w:p>
+      <w:pPr>
+        <w:pStyle w:val="Compact"/>
+        <w:numPr>
+          <w:ilvl w:val="0"/>
+          <w:numId w:val="1004"/>
+        </w:numPr>
+      </w:pPr>
+      <w:r>
+        <w:t xml:space="preserve">Das Spring Boot API validiert das Token via Keycloak.</w:t>
+      </w:r>
+    </w:p>
+    <w:p>
+      <w:pPr>
+        <w:pStyle w:val="Compact"/>
+        <w:numPr>
+          <w:ilvl w:val="0"/>
+          <w:numId w:val="1004"/>
+        </w:numPr>
+      </w:pPr>
+      <w:r>
+        <w:t xml:space="preserve">Das match-module (Scoring-Logik) verarbeitet den Punkt: Aktualisierung des Spielstands (Punkte, Games, Sets), Persistierung in der POINT-Tabelle.</w:t>
+      </w:r>
+    </w:p>
+    <w:p>
+      <w:pPr>
+        <w:pStyle w:val="Compact"/>
+        <w:numPr>
+          <w:ilvl w:val="0"/>
+          <w:numId w:val="1004"/>
+        </w:numPr>
+      </w:pPr>
+      <w:r>
+        <w:t xml:space="preserve">Das match-module aktualisiert die CURRENT_SCORE-Tabelle; aggregierte Statistiken werden vom statistics-module on-the-fly aus den Points berechnet.</w:t>
+      </w:r>
+    </w:p>
+    <w:p>
+      <w:pPr>
+        <w:pStyle w:val="Compact"/>
+        <w:numPr>
+          <w:ilvl w:val="0"/>
+          <w:numId w:val="1004"/>
+        </w:numPr>
+      </w:pPr>
+      <w:r>
+        <w:t xml:space="preserve">Das API gibt den aktualisierten Spielstand als JSON zurück (HTTP 200).</w:t>
+      </w:r>
+    </w:p>
+    <w:p>
+      <w:pPr>
+        <w:pStyle w:val="Compact"/>
+        <w:numPr>
+          <w:ilvl w:val="0"/>
+          <w:numId w:val="1004"/>
+        </w:numPr>
+      </w:pPr>
+      <w:r>
+        <w:t xml:space="preserve">Das Frontend aktualisiert die Anzeige des Spielstands.</w:t>
+      </w:r>
+    </w:p>
     <w:bookmarkEnd w:id="39"/>
-    <w:bookmarkStart w:id="43" w:name="laufzeitsicht"/>
-    <w:p>
-      <w:pPr>
-        <w:pStyle w:val="Heading2"/>
-      </w:pPr>
-      <w:r>
-        <w:t xml:space="preserve">6. Laufzeitsicht</w:t>
-      </w:r>
-    </w:p>
-    <w:bookmarkStart w:id="40" w:name="szenario-punkt-erfassen"/>
+    <w:bookmarkStart w:id="40" w:name="X2fff043d07f14bccbec7d33989c0b93f7e0c4dd"/>
     <w:p>
       <w:pPr>
         <w:pStyle w:val="Heading3"/>
       </w:pPr>
       <w:r>
-        <w:t xml:space="preserve">6.1 Szenario: Punkt erfassen</w:t>
+        <w:t xml:space="preserve">6.2 Szenario: KI-gestützte Match-Analyse (Postmortem)</w:t>
       </w:r>
     </w:p>
     <w:p>
@@ -3468,7 +3404,7 @@
         <w:pStyle w:val="FirstParagraph"/>
       </w:pPr>
       <w:r>
-        <w:t xml:space="preserve">Dieses Szenario beschreibt den typischen Ablauf, wenn ein Trainer während eines Matches einen Punkt erfasst:</w:t>
+        <w:t xml:space="preserve">Dieses Szenario beschreibt die Generierung einer taktischen Match-Analyse nach Match-Ende:</w:t>
       </w:r>
     </w:p>
     <w:p>
@@ -3480,7 +3416,16 @@
         </w:numPr>
       </w:pPr>
       <w:r>
-        <w:t xml:space="preserve">Der Trainer klickt im Angular-Frontend auf die Schaltfläche für den Punkttyp (z.B. „Forehand Winner”).</w:t>
+        <w:t xml:space="preserve">Der Coach öffnet ein beendetes Match (</w:t>
+      </w:r>
+      <w:r>
+        <w:rPr>
+          <w:rStyle w:val="VerbatimChar"/>
+        </w:rPr>
+        <w:t xml:space="preserve">MatchStatus = COMPLETED</w:t>
+      </w:r>
+      <w:r>
+        <w:t xml:space="preserve">) im Frontend und klickt auf „Taktische Analyse generieren”.</w:t>
       </w:r>
     </w:p>
     <w:p>
@@ -3492,7 +3437,22 @@
         </w:numPr>
       </w:pPr>
       <w:r>
-        <w:t xml:space="preserve">Das Frontend sendet einen POST-Request an /api/matches/{id}/points mit dem Bearer Token im Authorization-Header.</w:t>
+        <w:t xml:space="preserve">Das Frontend sendet</w:t>
+      </w:r>
+      <w:r>
+        <w:t xml:space="preserve"> </w:t>
+      </w:r>
+      <w:r>
+        <w:rPr>
+          <w:rStyle w:val="VerbatimChar"/>
+        </w:rPr>
+        <w:t xml:space="preserve">POST /api/matches/{id}/analysis</w:t>
+      </w:r>
+      <w:r>
+        <w:t xml:space="preserve"> </w:t>
+      </w:r>
+      <w:r>
+        <w:t xml:space="preserve">mit Bearer Token.</w:t>
       </w:r>
     </w:p>
     <w:p>
@@ -3504,7 +3464,61 @@
         </w:numPr>
       </w:pPr>
       <w:r>
-        <w:t xml:space="preserve">Das Spring Boot API validiert das Token via Keycloak.</w:t>
+        <w:t xml:space="preserve">Der</w:t>
+      </w:r>
+      <w:r>
+        <w:t xml:space="preserve"> </w:t>
+      </w:r>
+      <w:r>
+        <w:rPr>
+          <w:rStyle w:val="VerbatimChar"/>
+        </w:rPr>
+        <w:t xml:space="preserve">MatchAnalysisController</w:t>
+      </w:r>
+      <w:r>
+        <w:t xml:space="preserve"> </w:t>
+      </w:r>
+      <w:r>
+        <w:t xml:space="preserve">im</w:t>
+      </w:r>
+      <w:r>
+        <w:t xml:space="preserve"> </w:t>
+      </w:r>
+      <w:r>
+        <w:rPr>
+          <w:rStyle w:val="VerbatimChar"/>
+        </w:rPr>
+        <w:t xml:space="preserve">ai-module</w:t>
+      </w:r>
+      <w:r>
+        <w:t xml:space="preserve"> </w:t>
+      </w:r>
+      <w:r>
+        <w:t xml:space="preserve">ruft den</w:t>
+      </w:r>
+      <w:r>
+        <w:t xml:space="preserve"> </w:t>
+      </w:r>
+      <w:r>
+        <w:rPr>
+          <w:rStyle w:val="VerbatimChar"/>
+        </w:rPr>
+        <w:t xml:space="preserve">GenerateMatchAnalysisUseCase</w:t>
+      </w:r>
+      <w:r>
+        <w:t xml:space="preserve"> </w:t>
+      </w:r>
+      <w:r>
+        <w:t xml:space="preserve">(</w:t>
+      </w:r>
+      <w:r>
+        <w:rPr>
+          <w:rStyle w:val="VerbatimChar"/>
+        </w:rPr>
+        <w:t xml:space="preserve">MatchAnalysisService</w:t>
+      </w:r>
+      <w:r>
+        <w:t xml:space="preserve">) auf.</w:t>
       </w:r>
     </w:p>
     <w:p>
@@ -3516,7 +3530,7 @@
         </w:numPr>
       </w:pPr>
       <w:r>
-        <w:t xml:space="preserve">Das match-module (Scoring-Logik) verarbeitet den Punkt: Aktualisierung des Spielstands (Punkte, Games, Sets), Persistierung in der POINT-Tabelle.</w:t>
+        <w:t xml:space="preserve">Der Service prüft: Match-Status = COMPLETED (sonst HTTP 409), Punktzahl ≥ 10 (sonst HTTP 422, Kostenschutz).</w:t>
       </w:r>
     </w:p>
     <w:p>
@@ -3528,7 +3542,37 @@
         </w:numPr>
       </w:pPr>
       <w:r>
-        <w:t xml:space="preserve">Das match-module aktualisiert die CURRENT_SCORE-Tabelle; aggregierte Statistiken werden vom statistics-module on-the-fly aus den Points berechnet.</w:t>
+        <w:t xml:space="preserve">Der Service ruft das</w:t>
+      </w:r>
+      <w:r>
+        <w:t xml:space="preserve"> </w:t>
+      </w:r>
+      <w:r>
+        <w:rPr>
+          <w:rStyle w:val="VerbatimChar"/>
+        </w:rPr>
+        <w:t xml:space="preserve">statistics-module</w:t>
+      </w:r>
+      <w:r>
+        <w:t xml:space="preserve"> </w:t>
+      </w:r>
+      <w:r>
+        <w:t xml:space="preserve">für die aggregierten Kennzahlen und das</w:t>
+      </w:r>
+      <w:r>
+        <w:t xml:space="preserve"> </w:t>
+      </w:r>
+      <w:r>
+        <w:rPr>
+          <w:rStyle w:val="VerbatimChar"/>
+        </w:rPr>
+        <w:t xml:space="preserve">player-module</w:t>
+      </w:r>
+      <w:r>
+        <w:t xml:space="preserve"> </w:t>
+      </w:r>
+      <w:r>
+        <w:t xml:space="preserve">für Spielermetadaten (Name, Ranking, Handedness, Backhand-Typ).</w:t>
       </w:r>
     </w:p>
     <w:p>
@@ -3540,7 +3584,64 @@
         </w:numPr>
       </w:pPr>
       <w:r>
-        <w:t xml:space="preserve">Das API gibt den aktualisierten Spielstand als JSON zurück (HTTP 200).</w:t>
+        <w:t xml:space="preserve">Der Service ruft</w:t>
+      </w:r>
+      <w:r>
+        <w:t xml:space="preserve"> </w:t>
+      </w:r>
+      <w:r>
+        <w:rPr>
+          <w:rStyle w:val="VerbatimChar"/>
+        </w:rPr>
+        <w:t xml:space="preserve">LlmClientPort.generateAnalysis(stats, metadata)</w:t>
+      </w:r>
+      <w:r>
+        <w:t xml:space="preserve">. Im Default-Profil ist dies der</w:t>
+      </w:r>
+      <w:r>
+        <w:t xml:space="preserve"> </w:t>
+      </w:r>
+      <w:r>
+        <w:rPr>
+          <w:rStyle w:val="VerbatimChar"/>
+        </w:rPr>
+        <w:t xml:space="preserve">OpenAiLlmAdapter</w:t>
+      </w:r>
+      <w:r>
+        <w:t xml:space="preserve"> </w:t>
+      </w:r>
+      <w:r>
+        <w:t xml:space="preserve">(Spring AI ChatClient → OpenAI Chat Completions API mit strukturiertem JSON-Output via BeanOutputConverter). Bei fehlendem oder leerem</w:t>
+      </w:r>
+      <w:r>
+        <w:t xml:space="preserve"> </w:t>
+      </w:r>
+      <w:r>
+        <w:rPr>
+          <w:rStyle w:val="VerbatimChar"/>
+        </w:rPr>
+        <w:t xml:space="preserve">OPENAI_API_KEY</w:t>
+      </w:r>
+      <w:r>
+        <w:t xml:space="preserve"> </w:t>
+      </w:r>
+      <w:r>
+        <w:t xml:space="preserve">übernimmt der</w:t>
+      </w:r>
+      <w:r>
+        <w:t xml:space="preserve"> </w:t>
+      </w:r>
+      <w:r>
+        <w:rPr>
+          <w:rStyle w:val="VerbatimChar"/>
+        </w:rPr>
+        <w:t xml:space="preserve">FakeLlmClientAdapter</w:t>
+      </w:r>
+      <w:r>
+        <w:t xml:space="preserve"> </w:t>
+      </w:r>
+      <w:r>
+        <w:t xml:space="preserve">(deterministisches Stub-Result) — nützlich für Tests und Entwicklung ohne Provider.</w:t>
       </w:r>
     </w:p>
     <w:p>
@@ -3552,17 +3653,149 @@
         </w:numPr>
       </w:pPr>
       <w:r>
-        <w:t xml:space="preserve">Das Frontend aktualisiert die Anzeige des Spielstands.</w:t>
+        <w:t xml:space="preserve">Die strukturierte Antwort (Schlüsselmomente, eigene/gegnerische Stärken/Schwächen, 3–5 priorisierte Empfehlungen) wird als</w:t>
+      </w:r>
+      <w:r>
+        <w:t xml:space="preserve"> </w:t>
+      </w:r>
+      <w:r>
+        <w:rPr>
+          <w:rStyle w:val="VerbatimChar"/>
+        </w:rPr>
+        <w:t xml:space="preserve">MatchAnalysis</w:t>
+      </w:r>
+      <w:r>
+        <w:t xml:space="preserve"> </w:t>
+      </w:r>
+      <w:r>
+        <w:t xml:space="preserve">mit Status</w:t>
+      </w:r>
+      <w:r>
+        <w:t xml:space="preserve"> </w:t>
+      </w:r>
+      <w:r>
+        <w:rPr>
+          <w:rStyle w:val="VerbatimChar"/>
+        </w:rPr>
+        <w:t xml:space="preserve">COMPLETED</w:t>
+      </w:r>
+      <w:r>
+        <w:t xml:space="preserve"> </w:t>
+      </w:r>
+      <w:r>
+        <w:t xml:space="preserve">in der Tabelle</w:t>
+      </w:r>
+      <w:r>
+        <w:t xml:space="preserve"> </w:t>
+      </w:r>
+      <w:r>
+        <w:rPr>
+          <w:rStyle w:val="VerbatimChar"/>
+        </w:rPr>
+        <w:t xml:space="preserve">match_analysis</w:t>
+      </w:r>
+      <w:r>
+        <w:t xml:space="preserve"> </w:t>
+      </w:r>
+      <w:r>
+        <w:t xml:space="preserve">persistiert (1:1 zum Match, überschreibbar via UNIQUE-Constraint).</w:t>
+      </w:r>
+    </w:p>
+    <w:p>
+      <w:pPr>
+        <w:pStyle w:val="Compact"/>
+        <w:numPr>
+          <w:ilvl w:val="0"/>
+          <w:numId w:val="1005"/>
+        </w:numPr>
+      </w:pPr>
+      <w:r>
+        <w:t xml:space="preserve">Das API antwortet mit HTTP 200 und der vollständigen Analyse.</w:t>
+      </w:r>
+    </w:p>
+    <w:p>
+      <w:pPr>
+        <w:pStyle w:val="Compact"/>
+        <w:numPr>
+          <w:ilvl w:val="0"/>
+          <w:numId w:val="1005"/>
+        </w:numPr>
+      </w:pPr>
+      <w:r>
+        <w:t xml:space="preserve">Bei LLM-Fehlern (Netzwerk, 5xx, Parse-Fehler) wird ein</w:t>
+      </w:r>
+      <w:r>
+        <w:t xml:space="preserve"> </w:t>
+      </w:r>
+      <w:r>
+        <w:rPr>
+          <w:rStyle w:val="VerbatimChar"/>
+        </w:rPr>
+        <w:t xml:space="preserve">MatchAnalysis</w:t>
+      </w:r>
+      <w:r>
+        <w:t xml:space="preserve">-Datensatz mit Status</w:t>
+      </w:r>
+      <w:r>
+        <w:t xml:space="preserve"> </w:t>
+      </w:r>
+      <w:r>
+        <w:rPr>
+          <w:rStyle w:val="VerbatimChar"/>
+        </w:rPr>
+        <w:t xml:space="preserve">FAILED</w:t>
+      </w:r>
+      <w:r>
+        <w:t xml:space="preserve"> </w:t>
+      </w:r>
+      <w:r>
+        <w:t xml:space="preserve">und</w:t>
+      </w:r>
+      <w:r>
+        <w:t xml:space="preserve"> </w:t>
+      </w:r>
+      <w:r>
+        <w:rPr>
+          <w:rStyle w:val="VerbatimChar"/>
+        </w:rPr>
+        <w:t xml:space="preserve">errorMessage</w:t>
+      </w:r>
+      <w:r>
+        <w:t xml:space="preserve"> </w:t>
+      </w:r>
+      <w:r>
+        <w:t xml:space="preserve">persistiert, das API antwortet mit HTTP 502. Der Coach kann „Erneut versuchen” klicken; der nächste erfolgreiche Aufruf überschreibt den FAILED-Datensatz.</w:t>
+      </w:r>
+    </w:p>
+    <w:p>
+      <w:pPr>
+        <w:pStyle w:val="Compact"/>
+        <w:numPr>
+          <w:ilvl w:val="0"/>
+          <w:numId w:val="1005"/>
+        </w:numPr>
+      </w:pPr>
+      <w:r>
+        <w:rPr>
+          <w:rStyle w:val="VerbatimChar"/>
+        </w:rPr>
+        <w:t xml:space="preserve">GET /api/matches/{id}/analysis</w:t>
+      </w:r>
+      <w:r>
+        <w:t xml:space="preserve"> </w:t>
+      </w:r>
+      <w:r>
+        <w:t xml:space="preserve">liefert die gespeicherte Analyse ohne erneuten LLM-Aufruf (HTTP 200) oder HTTP 404, falls noch keine generiert wurde.</w:t>
       </w:r>
     </w:p>
     <w:bookmarkEnd w:id="40"/>
-    <w:bookmarkStart w:id="41" w:name="X2fff043d07f14bccbec7d33989c0b93f7e0c4dd"/>
+    <w:bookmarkStart w:id="41" w:name="szenario-benutzer-authentifizierung"/>
     <w:p>
       <w:pPr>
         <w:pStyle w:val="Heading3"/>
       </w:pPr>
       <w:r>
-        <w:t xml:space="preserve">6.2 Szenario: KI-gestützte Match-Analyse (Postmortem)</w:t>
+        <w:t xml:space="preserve">6.3 Szenario: Benutzer-Authentifizierung</w:t>
       </w:r>
     </w:p>
     <w:p>
@@ -3570,7 +3803,7 @@
         <w:pStyle w:val="FirstParagraph"/>
       </w:pPr>
       <w:r>
-        <w:t xml:space="preserve">Dieses Szenario beschreibt die Generierung einer taktischen Match-Analyse nach Match-Ende:</w:t>
+        <w:t xml:space="preserve">Der Login-Flow folgt dem Standard OAuth2 Authorization Code Flow mit PKCE:</w:t>
       </w:r>
     </w:p>
     <w:p>
@@ -3582,16 +3815,7 @@
         </w:numPr>
       </w:pPr>
       <w:r>
-        <w:t xml:space="preserve">Der Coach öffnet ein beendetes Match (</w:t>
-      </w:r>
-      <w:r>
-        <w:rPr>
-          <w:rStyle w:val="VerbatimChar"/>
-        </w:rPr>
-        <w:t xml:space="preserve">MatchStatus = COMPLETED</w:t>
-      </w:r>
-      <w:r>
-        <w:t xml:space="preserve">) im Frontend und klickt auf „Taktische Analyse generieren”.</w:t>
+        <w:t xml:space="preserve">Benutzer öffnet TSaS im Browser und wird zum Keycloak-Login weitergeleitet.</w:t>
       </w:r>
     </w:p>
     <w:p>
@@ -3603,22 +3827,7 @@
         </w:numPr>
       </w:pPr>
       <w:r>
-        <w:t xml:space="preserve">Das Frontend sendet</w:t>
-      </w:r>
-      <w:r>
-        <w:t xml:space="preserve"> </w:t>
-      </w:r>
-      <w:r>
-        <w:rPr>
-          <w:rStyle w:val="VerbatimChar"/>
-        </w:rPr>
-        <w:t xml:space="preserve">POST /api/matches/{id}/analysis</w:t>
-      </w:r>
-      <w:r>
-        <w:t xml:space="preserve"> </w:t>
-      </w:r>
-      <w:r>
-        <w:t xml:space="preserve">mit Bearer Token.</w:t>
+        <w:t xml:space="preserve">Benutzer authentifiziert sich (Benutzername/Passwort oder Google IDP ab V2).</w:t>
       </w:r>
     </w:p>
     <w:p>
@@ -3630,61 +3839,7 @@
         </w:numPr>
       </w:pPr>
       <w:r>
-        <w:t xml:space="preserve">Der</w:t>
-      </w:r>
-      <w:r>
-        <w:t xml:space="preserve"> </w:t>
-      </w:r>
-      <w:r>
-        <w:rPr>
-          <w:rStyle w:val="VerbatimChar"/>
-        </w:rPr>
-        <w:t xml:space="preserve">MatchAnalysisController</w:t>
-      </w:r>
-      <w:r>
-        <w:t xml:space="preserve"> </w:t>
-      </w:r>
-      <w:r>
-        <w:t xml:space="preserve">im</w:t>
-      </w:r>
-      <w:r>
-        <w:t xml:space="preserve"> </w:t>
-      </w:r>
-      <w:r>
-        <w:rPr>
-          <w:rStyle w:val="VerbatimChar"/>
-        </w:rPr>
-        <w:t xml:space="preserve">ai-module</w:t>
-      </w:r>
-      <w:r>
-        <w:t xml:space="preserve"> </w:t>
-      </w:r>
-      <w:r>
-        <w:t xml:space="preserve">ruft den</w:t>
-      </w:r>
-      <w:r>
-        <w:t xml:space="preserve"> </w:t>
-      </w:r>
-      <w:r>
-        <w:rPr>
-          <w:rStyle w:val="VerbatimChar"/>
-        </w:rPr>
-        <w:t xml:space="preserve">GenerateMatchAnalysisUseCase</w:t>
-      </w:r>
-      <w:r>
-        <w:t xml:space="preserve"> </w:t>
-      </w:r>
-      <w:r>
-        <w:t xml:space="preserve">(</w:t>
-      </w:r>
-      <w:r>
-        <w:rPr>
-          <w:rStyle w:val="VerbatimChar"/>
-        </w:rPr>
-        <w:t xml:space="preserve">MatchAnalysisService</w:t>
-      </w:r>
-      <w:r>
-        <w:t xml:space="preserve">) auf.</w:t>
+        <w:t xml:space="preserve">Keycloak stellt Authorization Code aus und leitet zurück an TSaS.</w:t>
       </w:r>
     </w:p>
     <w:p>
@@ -3696,7 +3851,7 @@
         </w:numPr>
       </w:pPr>
       <w:r>
-        <w:t xml:space="preserve">Der Service prüft: Match-Status = COMPLETED (sonst HTTP 409), Punktzahl ≥ 10 (sonst HTTP 422, Kostenschutz).</w:t>
+        <w:t xml:space="preserve">Das Frontend tauscht den Code gegen Access- und Refresh-Token.</w:t>
       </w:r>
     </w:p>
     <w:p>
@@ -3708,327 +3863,6 @@
         </w:numPr>
       </w:pPr>
       <w:r>
-        <w:t xml:space="preserve">Der Service ruft das</w:t>
-      </w:r>
-      <w:r>
-        <w:t xml:space="preserve"> </w:t>
-      </w:r>
-      <w:r>
-        <w:rPr>
-          <w:rStyle w:val="VerbatimChar"/>
-        </w:rPr>
-        <w:t xml:space="preserve">statistics-module</w:t>
-      </w:r>
-      <w:r>
-        <w:t xml:space="preserve"> </w:t>
-      </w:r>
-      <w:r>
-        <w:t xml:space="preserve">für die aggregierten Kennzahlen und das</w:t>
-      </w:r>
-      <w:r>
-        <w:t xml:space="preserve"> </w:t>
-      </w:r>
-      <w:r>
-        <w:rPr>
-          <w:rStyle w:val="VerbatimChar"/>
-        </w:rPr>
-        <w:t xml:space="preserve">player-module</w:t>
-      </w:r>
-      <w:r>
-        <w:t xml:space="preserve"> </w:t>
-      </w:r>
-      <w:r>
-        <w:t xml:space="preserve">für Spielermetadaten (Name, Ranking, Handedness, Backhand-Typ).</w:t>
-      </w:r>
-    </w:p>
-    <w:p>
-      <w:pPr>
-        <w:pStyle w:val="Compact"/>
-        <w:numPr>
-          <w:ilvl w:val="0"/>
-          <w:numId w:val="1006"/>
-        </w:numPr>
-      </w:pPr>
-      <w:r>
-        <w:t xml:space="preserve">Der Service ruft</w:t>
-      </w:r>
-      <w:r>
-        <w:t xml:space="preserve"> </w:t>
-      </w:r>
-      <w:r>
-        <w:rPr>
-          <w:rStyle w:val="VerbatimChar"/>
-        </w:rPr>
-        <w:t xml:space="preserve">LlmClientPort.generateAnalysis(stats, metadata)</w:t>
-      </w:r>
-      <w:r>
-        <w:t xml:space="preserve">. Im Default-Profil ist dies der</w:t>
-      </w:r>
-      <w:r>
-        <w:t xml:space="preserve"> </w:t>
-      </w:r>
-      <w:r>
-        <w:rPr>
-          <w:rStyle w:val="VerbatimChar"/>
-        </w:rPr>
-        <w:t xml:space="preserve">OpenAiLlmAdapter</w:t>
-      </w:r>
-      <w:r>
-        <w:t xml:space="preserve"> </w:t>
-      </w:r>
-      <w:r>
-        <w:t xml:space="preserve">(Spring AI ChatClient → OpenAI Chat Completions API mit strukturiertem JSON-Output via BeanOutputConverter). Bei fehlendem oder leerem</w:t>
-      </w:r>
-      <w:r>
-        <w:t xml:space="preserve"> </w:t>
-      </w:r>
-      <w:r>
-        <w:rPr>
-          <w:rStyle w:val="VerbatimChar"/>
-        </w:rPr>
-        <w:t xml:space="preserve">OPENAI_API_KEY</w:t>
-      </w:r>
-      <w:r>
-        <w:t xml:space="preserve"> </w:t>
-      </w:r>
-      <w:r>
-        <w:t xml:space="preserve">übernimmt der</w:t>
-      </w:r>
-      <w:r>
-        <w:t xml:space="preserve"> </w:t>
-      </w:r>
-      <w:r>
-        <w:rPr>
-          <w:rStyle w:val="VerbatimChar"/>
-        </w:rPr>
-        <w:t xml:space="preserve">FakeLlmClientAdapter</w:t>
-      </w:r>
-      <w:r>
-        <w:t xml:space="preserve"> </w:t>
-      </w:r>
-      <w:r>
-        <w:t xml:space="preserve">(deterministisches Stub-Result) — nützlich für Tests und Entwicklung ohne Provider.</w:t>
-      </w:r>
-    </w:p>
-    <w:p>
-      <w:pPr>
-        <w:pStyle w:val="Compact"/>
-        <w:numPr>
-          <w:ilvl w:val="0"/>
-          <w:numId w:val="1006"/>
-        </w:numPr>
-      </w:pPr>
-      <w:r>
-        <w:t xml:space="preserve">Die strukturierte Antwort (Schlüsselmomente, eigene/gegnerische Stärken/Schwächen, 3–5 priorisierte Empfehlungen) wird als</w:t>
-      </w:r>
-      <w:r>
-        <w:t xml:space="preserve"> </w:t>
-      </w:r>
-      <w:r>
-        <w:rPr>
-          <w:rStyle w:val="VerbatimChar"/>
-        </w:rPr>
-        <w:t xml:space="preserve">MatchAnalysis</w:t>
-      </w:r>
-      <w:r>
-        <w:t xml:space="preserve"> </w:t>
-      </w:r>
-      <w:r>
-        <w:t xml:space="preserve">mit Status</w:t>
-      </w:r>
-      <w:r>
-        <w:t xml:space="preserve"> </w:t>
-      </w:r>
-      <w:r>
-        <w:rPr>
-          <w:rStyle w:val="VerbatimChar"/>
-        </w:rPr>
-        <w:t xml:space="preserve">COMPLETED</w:t>
-      </w:r>
-      <w:r>
-        <w:t xml:space="preserve"> </w:t>
-      </w:r>
-      <w:r>
-        <w:t xml:space="preserve">in der Tabelle</w:t>
-      </w:r>
-      <w:r>
-        <w:t xml:space="preserve"> </w:t>
-      </w:r>
-      <w:r>
-        <w:rPr>
-          <w:rStyle w:val="VerbatimChar"/>
-        </w:rPr>
-        <w:t xml:space="preserve">match_analysis</w:t>
-      </w:r>
-      <w:r>
-        <w:t xml:space="preserve"> </w:t>
-      </w:r>
-      <w:r>
-        <w:t xml:space="preserve">persistiert (1:1 zum Match, überschreibbar via UNIQUE-Constraint).</w:t>
-      </w:r>
-    </w:p>
-    <w:p>
-      <w:pPr>
-        <w:pStyle w:val="Compact"/>
-        <w:numPr>
-          <w:ilvl w:val="0"/>
-          <w:numId w:val="1006"/>
-        </w:numPr>
-      </w:pPr>
-      <w:r>
-        <w:t xml:space="preserve">Das API antwortet mit HTTP 200 und der vollständigen Analyse.</w:t>
-      </w:r>
-    </w:p>
-    <w:p>
-      <w:pPr>
-        <w:pStyle w:val="Compact"/>
-        <w:numPr>
-          <w:ilvl w:val="0"/>
-          <w:numId w:val="1006"/>
-        </w:numPr>
-      </w:pPr>
-      <w:r>
-        <w:t xml:space="preserve">Bei LLM-Fehlern (Netzwerk, 5xx, Parse-Fehler) wird ein</w:t>
-      </w:r>
-      <w:r>
-        <w:t xml:space="preserve"> </w:t>
-      </w:r>
-      <w:r>
-        <w:rPr>
-          <w:rStyle w:val="VerbatimChar"/>
-        </w:rPr>
-        <w:t xml:space="preserve">MatchAnalysis</w:t>
-      </w:r>
-      <w:r>
-        <w:t xml:space="preserve">-Datensatz mit Status</w:t>
-      </w:r>
-      <w:r>
-        <w:t xml:space="preserve"> </w:t>
-      </w:r>
-      <w:r>
-        <w:rPr>
-          <w:rStyle w:val="VerbatimChar"/>
-        </w:rPr>
-        <w:t xml:space="preserve">FAILED</w:t>
-      </w:r>
-      <w:r>
-        <w:t xml:space="preserve"> </w:t>
-      </w:r>
-      <w:r>
-        <w:t xml:space="preserve">und</w:t>
-      </w:r>
-      <w:r>
-        <w:t xml:space="preserve"> </w:t>
-      </w:r>
-      <w:r>
-        <w:rPr>
-          <w:rStyle w:val="VerbatimChar"/>
-        </w:rPr>
-        <w:t xml:space="preserve">errorMessage</w:t>
-      </w:r>
-      <w:r>
-        <w:t xml:space="preserve"> </w:t>
-      </w:r>
-      <w:r>
-        <w:t xml:space="preserve">persistiert, das API antwortet mit HTTP 502. Der Coach kann „Erneut versuchen” klicken; der nächste erfolgreiche Aufruf überschreibt den FAILED-Datensatz.</w:t>
-      </w:r>
-    </w:p>
-    <w:p>
-      <w:pPr>
-        <w:pStyle w:val="Compact"/>
-        <w:numPr>
-          <w:ilvl w:val="0"/>
-          <w:numId w:val="1006"/>
-        </w:numPr>
-      </w:pPr>
-      <w:r>
-        <w:rPr>
-          <w:rStyle w:val="VerbatimChar"/>
-        </w:rPr>
-        <w:t xml:space="preserve">GET /api/matches/{id}/analysis</w:t>
-      </w:r>
-      <w:r>
-        <w:t xml:space="preserve"> </w:t>
-      </w:r>
-      <w:r>
-        <w:t xml:space="preserve">liefert die gespeicherte Analyse ohne erneuten LLM-Aufruf (HTTP 200) oder HTTP 404, falls noch keine generiert wurde.</w:t>
-      </w:r>
-    </w:p>
-    <w:bookmarkEnd w:id="41"/>
-    <w:bookmarkStart w:id="42" w:name="szenario-benutzer-authentifizierung"/>
-    <w:p>
-      <w:pPr>
-        <w:pStyle w:val="Heading3"/>
-      </w:pPr>
-      <w:r>
-        <w:t xml:space="preserve">6.3 Szenario: Benutzer-Authentifizierung</w:t>
-      </w:r>
-    </w:p>
-    <w:p>
-      <w:pPr>
-        <w:pStyle w:val="FirstParagraph"/>
-      </w:pPr>
-      <w:r>
-        <w:t xml:space="preserve">Der Login-Flow folgt dem Standard OAuth2 Authorization Code Flow mit PKCE:</w:t>
-      </w:r>
-    </w:p>
-    <w:p>
-      <w:pPr>
-        <w:pStyle w:val="Compact"/>
-        <w:numPr>
-          <w:ilvl w:val="0"/>
-          <w:numId w:val="1007"/>
-        </w:numPr>
-      </w:pPr>
-      <w:r>
-        <w:t xml:space="preserve">Benutzer öffnet TSaS im Browser und wird zum Keycloak-Login weitergeleitet.</w:t>
-      </w:r>
-    </w:p>
-    <w:p>
-      <w:pPr>
-        <w:pStyle w:val="Compact"/>
-        <w:numPr>
-          <w:ilvl w:val="0"/>
-          <w:numId w:val="1007"/>
-        </w:numPr>
-      </w:pPr>
-      <w:r>
-        <w:t xml:space="preserve">Benutzer authentifiziert sich (Benutzername/Passwort oder Google IDP ab V2).</w:t>
-      </w:r>
-    </w:p>
-    <w:p>
-      <w:pPr>
-        <w:pStyle w:val="Compact"/>
-        <w:numPr>
-          <w:ilvl w:val="0"/>
-          <w:numId w:val="1007"/>
-        </w:numPr>
-      </w:pPr>
-      <w:r>
-        <w:t xml:space="preserve">Keycloak stellt Authorization Code aus und leitet zurück an TSaS.</w:t>
-      </w:r>
-    </w:p>
-    <w:p>
-      <w:pPr>
-        <w:pStyle w:val="Compact"/>
-        <w:numPr>
-          <w:ilvl w:val="0"/>
-          <w:numId w:val="1007"/>
-        </w:numPr>
-      </w:pPr>
-      <w:r>
-        <w:t xml:space="preserve">Das Frontend tauscht den Code gegen Access- und Refresh-Token.</w:t>
-      </w:r>
-    </w:p>
-    <w:p>
-      <w:pPr>
-        <w:pStyle w:val="Compact"/>
-        <w:numPr>
-          <w:ilvl w:val="0"/>
-          <w:numId w:val="1007"/>
-        </w:numPr>
-      </w:pPr>
-      <w:r>
         <w:t xml:space="preserve">Bei jedem API-Call wird das Access-Token im Authorization-Header mitgesendet.</w:t>
       </w:r>
     </w:p>
@@ -4039,9 +3873,9 @@
         </w:pict>
       </w:r>
     </w:p>
+    <w:bookmarkEnd w:id="41"/>
     <w:bookmarkEnd w:id="42"/>
-    <w:bookmarkEnd w:id="43"/>
-    <w:bookmarkStart w:id="50" w:name="verteilungssicht"/>
+    <w:bookmarkStart w:id="49" w:name="verteilungssicht"/>
     <w:p>
       <w:pPr>
         <w:pStyle w:val="Heading2"/>
@@ -4050,7 +3884,7 @@
         <w:t xml:space="preserve">7. Verteilungssicht</w:t>
       </w:r>
     </w:p>
-    <w:bookmarkStart w:id="48" w:name="infrastruktur"/>
+    <w:bookmarkStart w:id="47" w:name="infrastruktur"/>
     <w:p>
       <w:pPr>
         <w:pStyle w:val="Heading3"/>
@@ -4076,18 +3910,18 @@
           <wp:inline>
             <wp:extent cx="5334000" cy="3442815"/>
             <wp:effectExtent b="0" l="0" r="0" t="0"/>
-            <wp:docPr descr="TSaS – Verteilungssicht (Docker Compose)" title="" id="45" name="Picture"/>
+            <wp:docPr descr="TSaS – Verteilungssicht (Docker Compose)" title="" id="44" name="Picture"/>
             <a:graphic>
               <a:graphicData uri="http://schemas.openxmlformats.org/drawingml/2006/picture">
                 <pic:pic>
                   <pic:nvPicPr>
-                    <pic:cNvPr descr="Deployment.png" id="46" name="Picture"/>
+                    <pic:cNvPr descr="Deployment.png" id="45" name="Picture"/>
                     <pic:cNvPicPr>
                       <a:picLocks noChangeArrowheads="1" noChangeAspect="1"/>
                     </pic:cNvPicPr>
                   </pic:nvPicPr>
                   <pic:blipFill>
-                    <a:blip r:embed="rId44"/>
+                    <a:blip r:embed="rId43"/>
                     <a:stretch>
                       <a:fillRect/>
                     </a:stretch>
@@ -4140,7 +3974,7 @@
         </w:rPr>
         <w:t xml:space="preserve"> </w:t>
       </w:r>
-      <w:hyperlink r:id="rId47">
+      <w:hyperlink r:id="rId46">
         <w:r>
           <w:rPr>
             <w:rStyle w:val="VerbatimChar"/>
@@ -4444,8 +4278,8 @@
         </w:tc>
       </w:tr>
     </w:tbl>
-    <w:bookmarkEnd w:id="48"/>
-    <w:bookmarkStart w:id="49" w:name="docker-compose-struktur"/>
+    <w:bookmarkEnd w:id="47"/>
+    <w:bookmarkStart w:id="48" w:name="docker-compose-struktur"/>
     <w:p>
       <w:pPr>
         <w:pStyle w:val="Heading3"/>
@@ -5308,36 +5142,36 @@
         </w:pict>
       </w:r>
     </w:p>
+    <w:bookmarkEnd w:id="48"/>
     <w:bookmarkEnd w:id="49"/>
+    <w:bookmarkStart w:id="57" w:name="querschnittliche-konzepte"/>
+    <w:p>
+      <w:pPr>
+        <w:pStyle w:val="Heading2"/>
+      </w:pPr>
+      <w:r>
+        <w:t xml:space="preserve">8. Querschnittliche Konzepte</w:t>
+      </w:r>
+    </w:p>
+    <w:bookmarkStart w:id="50" w:name="sicherheitskonzept"/>
+    <w:p>
+      <w:pPr>
+        <w:pStyle w:val="Heading3"/>
+      </w:pPr>
+      <w:r>
+        <w:t xml:space="preserve">8.1 Sicherheitskonzept</w:t>
+      </w:r>
+    </w:p>
+    <w:p>
+      <w:pPr>
+        <w:pStyle w:val="FirstParagraph"/>
+      </w:pPr>
+      <w:r>
+        <w:t xml:space="preserve">Alle API-Endpunkte (ausser Health-Check) werden durch OAuth2 Bearer Tokens geschützt. Das Frontend nutzt den Authorization Code Flow mit PKCE. Keycloak verwaltet Benutzer, Rollen und Sessions. In Version 1 erfolgt die Registrierung direkt in Keycloak, ab Version 2 zusätzlich über Google als federated Identity Provider.</w:t>
+      </w:r>
+    </w:p>
     <w:bookmarkEnd w:id="50"/>
-    <w:bookmarkStart w:id="58" w:name="querschnittliche-konzepte"/>
-    <w:p>
-      <w:pPr>
-        <w:pStyle w:val="Heading2"/>
-      </w:pPr>
-      <w:r>
-        <w:t xml:space="preserve">8. Querschnittliche Konzepte</w:t>
-      </w:r>
-    </w:p>
-    <w:bookmarkStart w:id="51" w:name="sicherheitskonzept"/>
-    <w:p>
-      <w:pPr>
-        <w:pStyle w:val="Heading3"/>
-      </w:pPr>
-      <w:r>
-        <w:t xml:space="preserve">8.1 Sicherheitskonzept</w:t>
-      </w:r>
-    </w:p>
-    <w:p>
-      <w:pPr>
-        <w:pStyle w:val="FirstParagraph"/>
-      </w:pPr>
-      <w:r>
-        <w:t xml:space="preserve">Alle API-Endpunkte (ausser Health-Check) werden durch OAuth2 Bearer Tokens geschützt. Das Frontend nutzt den Authorization Code Flow mit PKCE. Keycloak verwaltet Benutzer, Rollen und Sessions. In Version 1 erfolgt die Registrierung direkt in Keycloak, ab Version 2 zusätzlich über Google als federated Identity Provider.</w:t>
-      </w:r>
-    </w:p>
-    <w:bookmarkEnd w:id="51"/>
-    <w:bookmarkStart w:id="52" w:name="persistenz"/>
+    <w:bookmarkStart w:id="51" w:name="persistenz"/>
     <w:p>
       <w:pPr>
         <w:pStyle w:val="Heading3"/>
@@ -5364,6 +5198,487 @@
           <w:bCs/>
         </w:rPr>
         <w:t xml:space="preserve">Flyway-Konfiguration:</w:t>
+      </w:r>
+    </w:p>
+    <w:p>
+      <w:pPr>
+        <w:pStyle w:val="Compact"/>
+        <w:numPr>
+          <w:ilvl w:val="0"/>
+          <w:numId w:val="1007"/>
+        </w:numPr>
+      </w:pPr>
+      <w:r>
+        <w:t xml:space="preserve">Die Flyway-Dependency (</w:t>
+      </w:r>
+      <w:r>
+        <w:rPr>
+          <w:rStyle w:val="VerbatimChar"/>
+        </w:rPr>
+        <w:t xml:space="preserve">flyway-core</w:t>
+      </w:r>
+      <w:r>
+        <w:t xml:space="preserve">,</w:t>
+      </w:r>
+      <w:r>
+        <w:t xml:space="preserve"> </w:t>
+      </w:r>
+      <w:r>
+        <w:rPr>
+          <w:rStyle w:val="VerbatimChar"/>
+        </w:rPr>
+        <w:t xml:space="preserve">flyway-database-postgresql</w:t>
+      </w:r>
+      <w:r>
+        <w:t xml:space="preserve">) ist im</w:t>
+      </w:r>
+      <w:r>
+        <w:t xml:space="preserve"> </w:t>
+      </w:r>
+      <w:r>
+        <w:rPr>
+          <w:rStyle w:val="VerbatimChar"/>
+        </w:rPr>
+        <w:t xml:space="preserve">app</w:t>
+      </w:r>
+      <w:r>
+        <w:t xml:space="preserve">-Modul deklariert – dem natürlichen Aggregator aller fachlichen Module.</w:t>
+      </w:r>
+    </w:p>
+    <w:p>
+      <w:pPr>
+        <w:pStyle w:val="Compact"/>
+        <w:numPr>
+          <w:ilvl w:val="0"/>
+          <w:numId w:val="1007"/>
+        </w:numPr>
+      </w:pPr>
+      <w:r>
+        <w:t xml:space="preserve">Migrationsskripte liegen unter</w:t>
+      </w:r>
+      <w:r>
+        <w:t xml:space="preserve"> </w:t>
+      </w:r>
+      <w:r>
+        <w:rPr>
+          <w:rStyle w:val="VerbatimChar"/>
+        </w:rPr>
+        <w:t xml:space="preserve">backend/app/src/main/resources/db/migration/</w:t>
+      </w:r>
+      <w:r>
+        <w:t xml:space="preserve"> </w:t>
+      </w:r>
+      <w:r>
+        <w:t xml:space="preserve">und folgen dem Namensschema</w:t>
+      </w:r>
+      <w:r>
+        <w:t xml:space="preserve"> </w:t>
+      </w:r>
+      <w:r>
+        <w:rPr>
+          <w:rStyle w:val="VerbatimChar"/>
+        </w:rPr>
+        <w:t xml:space="preserve">V{n}__{beschreibung}.sql</w:t>
+      </w:r>
+      <w:r>
+        <w:t xml:space="preserve">.</w:t>
+      </w:r>
+    </w:p>
+    <w:p>
+      <w:pPr>
+        <w:pStyle w:val="Compact"/>
+        <w:numPr>
+          <w:ilvl w:val="0"/>
+          <w:numId w:val="1007"/>
+        </w:numPr>
+      </w:pPr>
+      <w:r>
+        <w:rPr>
+          <w:rStyle w:val="VerbatimChar"/>
+        </w:rPr>
+        <w:t xml:space="preserve">V1__baseline.sql</w:t>
+      </w:r>
+      <w:r>
+        <w:t xml:space="preserve"> </w:t>
+      </w:r>
+      <w:r>
+        <w:t xml:space="preserve">enthält das initiale Schema aller Tabellen (</w:t>
+      </w:r>
+      <w:r>
+        <w:rPr>
+          <w:rStyle w:val="VerbatimChar"/>
+        </w:rPr>
+        <w:t xml:space="preserve">players</w:t>
+      </w:r>
+      <w:r>
+        <w:t xml:space="preserve">,</w:t>
+      </w:r>
+      <w:r>
+        <w:t xml:space="preserve"> </w:t>
+      </w:r>
+      <w:r>
+        <w:rPr>
+          <w:rStyle w:val="VerbatimChar"/>
+        </w:rPr>
+        <w:t xml:space="preserve">matches</w:t>
+      </w:r>
+      <w:r>
+        <w:t xml:space="preserve">,</w:t>
+      </w:r>
+      <w:r>
+        <w:t xml:space="preserve"> </w:t>
+      </w:r>
+      <w:r>
+        <w:rPr>
+          <w:rStyle w:val="VerbatimChar"/>
+        </w:rPr>
+        <w:t xml:space="preserve">match_scores</w:t>
+      </w:r>
+      <w:r>
+        <w:t xml:space="preserve">), abgeleitet aus den bestehenden JPA-Entitäten.</w:t>
+      </w:r>
+    </w:p>
+    <w:p>
+      <w:pPr>
+        <w:pStyle w:val="Compact"/>
+        <w:numPr>
+          <w:ilvl w:val="0"/>
+          <w:numId w:val="1007"/>
+        </w:numPr>
+      </w:pPr>
+      <w:r>
+        <w:t xml:space="preserve">Hibernate</w:t>
+      </w:r>
+      <w:r>
+        <w:t xml:space="preserve"> </w:t>
+      </w:r>
+      <w:r>
+        <w:rPr>
+          <w:rStyle w:val="VerbatimChar"/>
+        </w:rPr>
+        <w:t xml:space="preserve">ddl-auto</w:t>
+      </w:r>
+      <w:r>
+        <w:t xml:space="preserve"> </w:t>
+      </w:r>
+      <w:r>
+        <w:t xml:space="preserve">ist auf</w:t>
+      </w:r>
+      <w:r>
+        <w:t xml:space="preserve"> </w:t>
+      </w:r>
+      <w:r>
+        <w:rPr>
+          <w:rStyle w:val="VerbatimChar"/>
+        </w:rPr>
+        <w:t xml:space="preserve">validate</w:t>
+      </w:r>
+      <w:r>
+        <w:t xml:space="preserve"> </w:t>
+      </w:r>
+      <w:r>
+        <w:t xml:space="preserve">(PostgreSQL) bzw.</w:t>
+      </w:r>
+      <w:r>
+        <w:t xml:space="preserve"> </w:t>
+      </w:r>
+      <w:r>
+        <w:rPr>
+          <w:rStyle w:val="VerbatimChar"/>
+        </w:rPr>
+        <w:t xml:space="preserve">none</w:t>
+      </w:r>
+      <w:r>
+        <w:t xml:space="preserve"> </w:t>
+      </w:r>
+      <w:r>
+        <w:t xml:space="preserve">(H2/lokal) gesetzt – Flyway ist die einzige Quelle für Schema-Änderungen.</w:t>
+      </w:r>
+    </w:p>
+    <w:p>
+      <w:pPr>
+        <w:pStyle w:val="Compact"/>
+        <w:numPr>
+          <w:ilvl w:val="0"/>
+          <w:numId w:val="1007"/>
+        </w:numPr>
+      </w:pPr>
+      <w:r>
+        <w:t xml:space="preserve">Die Migrationsskripte verwenden ausschliesslich ANSI-SQL, das mit PostgreSQL und H2 kompatibel ist (kein datenbankspezifischer SQL-Dialekt), damit auch das lokale H2-Profil Flyway-gesteuert ist.</w:t>
+      </w:r>
+    </w:p>
+    <w:bookmarkEnd w:id="51"/>
+    <w:bookmarkStart w:id="52" w:name="fehlerbehandlung"/>
+    <w:p>
+      <w:pPr>
+        <w:pStyle w:val="Heading3"/>
+      </w:pPr>
+      <w:r>
+        <w:t xml:space="preserve">8.3 Fehlerbehandlung</w:t>
+      </w:r>
+    </w:p>
+    <w:p>
+      <w:pPr>
+        <w:pStyle w:val="FirstParagraph"/>
+      </w:pPr>
+      <w:r>
+        <w:t xml:space="preserve">Die Fehlerbehandlung erfolgt deklarativ über</w:t>
+      </w:r>
+      <w:r>
+        <w:t xml:space="preserve"> </w:t>
+      </w:r>
+      <w:r>
+        <w:rPr>
+          <w:rStyle w:val="VerbatimChar"/>
+        </w:rPr>
+        <w:t xml:space="preserve">@RestControllerAdvice</w:t>
+      </w:r>
+      <w:r>
+        <w:t xml:space="preserve">. Querschnittliche Fälle liegen zentral im</w:t>
+      </w:r>
+      <w:r>
+        <w:t xml:space="preserve"> </w:t>
+      </w:r>
+      <w:r>
+        <w:rPr>
+          <w:rStyle w:val="VerbatimChar"/>
+        </w:rPr>
+        <w:t xml:space="preserve">common-module</w:t>
+      </w:r>
+      <w:r>
+        <w:t xml:space="preserve"> </w:t>
+      </w:r>
+      <w:r>
+        <w:t xml:space="preserve">(</w:t>
+      </w:r>
+      <w:r>
+        <w:rPr>
+          <w:rStyle w:val="VerbatimChar"/>
+        </w:rPr>
+        <w:t xml:space="preserve">CommonExceptionHandler</w:t>
+      </w:r>
+      <w:r>
+        <w:t xml:space="preserve">): fachliche Zustandskonflikte (Basisklasse</w:t>
+      </w:r>
+      <w:r>
+        <w:t xml:space="preserve"> </w:t>
+      </w:r>
+      <w:r>
+        <w:rPr>
+          <w:rStyle w:val="VerbatimChar"/>
+        </w:rPr>
+        <w:t xml:space="preserve">ConflictException</w:t>
+      </w:r>
+      <w:r>
+        <w:t xml:space="preserve">) → HTTP 409, Bean-Validation-Fehler (</w:t>
+      </w:r>
+      <w:r>
+        <w:rPr>
+          <w:rStyle w:val="VerbatimChar"/>
+        </w:rPr>
+        <w:t xml:space="preserve">MethodArgumentNotValidException</w:t>
+      </w:r>
+      <w:r>
+        <w:t xml:space="preserve">) → HTTP 400 mit Feld-Details, ungültige Argumente (z. B. unbekannter Enum-Wert) → HTTP 400. Modulspezifische Domain-Exceptions werden in den jeweiligen Advices abgebildet:</w:t>
+      </w:r>
+      <w:r>
+        <w:t xml:space="preserve"> </w:t>
+      </w:r>
+      <w:r>
+        <w:rPr>
+          <w:rStyle w:val="VerbatimChar"/>
+        </w:rPr>
+        <w:t xml:space="preserve">GlobalExceptionHandler</w:t>
+      </w:r>
+      <w:r>
+        <w:t xml:space="preserve"> </w:t>
+      </w:r>
+      <w:r>
+        <w:t xml:space="preserve">(Player/Match „nicht gefunden” → 404) und</w:t>
+      </w:r>
+      <w:r>
+        <w:t xml:space="preserve"> </w:t>
+      </w:r>
+      <w:r>
+        <w:rPr>
+          <w:rStyle w:val="VerbatimChar"/>
+        </w:rPr>
+        <w:t xml:space="preserve">AiExceptionHandler</w:t>
+      </w:r>
+      <w:r>
+        <w:t xml:space="preserve"> </w:t>
+      </w:r>
+      <w:r>
+        <w:t xml:space="preserve">(</w:t>
+      </w:r>
+      <w:r>
+        <w:rPr>
+          <w:rStyle w:val="VerbatimChar"/>
+        </w:rPr>
+        <w:t xml:space="preserve">InsufficientMatchDataException</w:t>
+      </w:r>
+      <w:r>
+        <w:t xml:space="preserve"> </w:t>
+      </w:r>
+      <w:r>
+        <w:t xml:space="preserve">→ 422,</w:t>
+      </w:r>
+      <w:r>
+        <w:t xml:space="preserve"> </w:t>
+      </w:r>
+      <w:r>
+        <w:rPr>
+          <w:rStyle w:val="VerbatimChar"/>
+        </w:rPr>
+        <w:t xml:space="preserve">AnalysisGenerationException</w:t>
+      </w:r>
+      <w:r>
+        <w:t xml:space="preserve"> </w:t>
+      </w:r>
+      <w:r>
+        <w:t xml:space="preserve">→ 502). Technische Fehler ergeben HTTP 5xx.</w:t>
+      </w:r>
+    </w:p>
+    <w:p>
+      <w:pPr>
+        <w:pStyle w:val="BodyText"/>
+      </w:pPr>
+      <w:r>
+        <w:t xml:space="preserve">Das Antwortformat folgt</w:t>
+      </w:r>
+      <w:r>
+        <w:t xml:space="preserve"> </w:t>
+      </w:r>
+      <w:r>
+        <w:rPr>
+          <w:b/>
+          <w:bCs/>
+        </w:rPr>
+        <w:t xml:space="preserve">RFC 7807</w:t>
+      </w:r>
+      <w:r>
+        <w:t xml:space="preserve"> </w:t>
+      </w:r>
+      <w:r>
+        <w:t xml:space="preserve">über Springs</w:t>
+      </w:r>
+      <w:r>
+        <w:t xml:space="preserve"> </w:t>
+      </w:r>
+      <w:r>
+        <w:rPr>
+          <w:rStyle w:val="VerbatimChar"/>
+        </w:rPr>
+        <w:t xml:space="preserve">ProblemDetail</w:t>
+      </w:r>
+      <w:r>
+        <w:t xml:space="preserve"> </w:t>
+      </w:r>
+      <w:r>
+        <w:t xml:space="preserve">(Felder</w:t>
+      </w:r>
+      <w:r>
+        <w:t xml:space="preserve"> </w:t>
+      </w:r>
+      <w:r>
+        <w:rPr>
+          <w:rStyle w:val="VerbatimChar"/>
+        </w:rPr>
+        <w:t xml:space="preserve">type</w:t>
+      </w:r>
+      <w:r>
+        <w:t xml:space="preserve">,</w:t>
+      </w:r>
+      <w:r>
+        <w:t xml:space="preserve"> </w:t>
+      </w:r>
+      <w:r>
+        <w:rPr>
+          <w:rStyle w:val="VerbatimChar"/>
+        </w:rPr>
+        <w:t xml:space="preserve">title</w:t>
+      </w:r>
+      <w:r>
+        <w:t xml:space="preserve">,</w:t>
+      </w:r>
+      <w:r>
+        <w:t xml:space="preserve"> </w:t>
+      </w:r>
+      <w:r>
+        <w:rPr>
+          <w:rStyle w:val="VerbatimChar"/>
+        </w:rPr>
+        <w:t xml:space="preserve">status</w:t>
+      </w:r>
+      <w:r>
+        <w:t xml:space="preserve">,</w:t>
+      </w:r>
+      <w:r>
+        <w:t xml:space="preserve"> </w:t>
+      </w:r>
+      <w:r>
+        <w:rPr>
+          <w:rStyle w:val="VerbatimChar"/>
+        </w:rPr>
+        <w:t xml:space="preserve">detail</w:t>
+      </w:r>
+      <w:r>
+        <w:t xml:space="preserve">, ggf. zusätzliche Properties wie</w:t>
+      </w:r>
+      <w:r>
+        <w:t xml:space="preserve"> </w:t>
+      </w:r>
+      <w:r>
+        <w:rPr>
+          <w:rStyle w:val="VerbatimChar"/>
+        </w:rPr>
+        <w:t xml:space="preserve">errors</w:t>
+      </w:r>
+      <w:r>
+        <w:t xml:space="preserve">) — der Spring-native Standard, der das früher geplante Ad-hoc-Format</w:t>
+      </w:r>
+      <w:r>
+        <w:t xml:space="preserve"> </w:t>
+      </w:r>
+      <w:r>
+        <w:rPr>
+          <w:rStyle w:val="VerbatimChar"/>
+        </w:rPr>
+        <w:t xml:space="preserve">{error-code, message, timestamp}</w:t>
+      </w:r>
+      <w:r>
+        <w:t xml:space="preserve"> </w:t>
+      </w:r>
+      <w:r>
+        <w:t xml:space="preserve">ablöst.</w:t>
+      </w:r>
+    </w:p>
+    <w:bookmarkEnd w:id="52"/>
+    <w:bookmarkStart w:id="53" w:name="logging-und-monitoring"/>
+    <w:p>
+      <w:pPr>
+        <w:pStyle w:val="Heading3"/>
+      </w:pPr>
+      <w:r>
+        <w:t xml:space="preserve">8.4 Logging und Monitoring</w:t>
+      </w:r>
+    </w:p>
+    <w:p>
+      <w:pPr>
+        <w:pStyle w:val="FirstParagraph"/>
+      </w:pPr>
+      <w:r>
+        <w:t xml:space="preserve">Strukturiertes Logging via SLF4J/Logback im JSON-Format. Spring Boot Actuator stellt Health-, Metrics- und Info-Endpunkte bereit. Metriken können über Prometheus/Grafana überwacht werden.</w:t>
+      </w:r>
+    </w:p>
+    <w:bookmarkEnd w:id="53"/>
+    <w:bookmarkStart w:id="54" w:name="testkonzept"/>
+    <w:p>
+      <w:pPr>
+        <w:pStyle w:val="Heading3"/>
+      </w:pPr>
+      <w:r>
+        <w:t xml:space="preserve">8.5 Testkonzept</w:t>
       </w:r>
     </w:p>
     <w:p>
@@ -5375,40 +5690,17 @@
         </w:numPr>
       </w:pPr>
       <w:r>
-        <w:t xml:space="preserve">Die Flyway-Dependency (</w:t>
-      </w:r>
-      <w:r>
-        <w:rPr>
-          <w:rStyle w:val="VerbatimChar"/>
-        </w:rPr>
-        <w:t xml:space="preserve">flyway-core</w:t>
-      </w:r>
-      <w:r>
-        <w:t xml:space="preserve">,</w:t>
-      </w:r>
-      <w:r>
-        <w:t xml:space="preserve"> </w:t>
-      </w:r>
-      <w:r>
-        <w:rPr>
-          <w:rStyle w:val="VerbatimChar"/>
-        </w:rPr>
-        <w:t xml:space="preserve">flyway-database-postgresql</w:t>
-      </w:r>
-      <w:r>
-        <w:t xml:space="preserve">) ist im</w:t>
-      </w:r>
-      <w:r>
-        <w:t xml:space="preserve"> </w:t>
-      </w:r>
-      <w:r>
-        <w:rPr>
-          <w:rStyle w:val="VerbatimChar"/>
-        </w:rPr>
-        <w:t xml:space="preserve">app</w:t>
-      </w:r>
-      <w:r>
-        <w:t xml:space="preserve">-Modul deklariert – dem natürlichen Aggregator aller fachlichen Module.</w:t>
+        <w:rPr>
+          <w:b/>
+          <w:bCs/>
+        </w:rPr>
+        <w:t xml:space="preserve">Unit Tests (Backend):</w:t>
+      </w:r>
+      <w:r>
+        <w:t xml:space="preserve"> </w:t>
+      </w:r>
+      <w:r>
+        <w:t xml:space="preserve">JUnit 5 (Jupiter) für Domänenlogik und Services; Mockito für das Mocking von Ports und externen Abhängigkeiten.</w:t>
       </w:r>
     </w:p>
     <w:p>
@@ -5420,34 +5712,26 @@
         </w:numPr>
       </w:pPr>
       <w:r>
-        <w:t xml:space="preserve">Migrationsskripte liegen unter</w:t>
-      </w:r>
-      <w:r>
-        <w:t xml:space="preserve"> </w:t>
+        <w:rPr>
+          <w:b/>
+          <w:bCs/>
+        </w:rPr>
+        <w:t xml:space="preserve">Integrations-/API-Tests (Backend):</w:t>
+      </w:r>
+      <w:r>
+        <w:t xml:space="preserve"> </w:t>
+      </w:r>
+      <w:r>
+        <w:t xml:space="preserve">Spring Boot Test mit Testcontainers (PostgreSQL) und MockMvc (</w:t>
       </w:r>
       <w:r>
         <w:rPr>
           <w:rStyle w:val="VerbatimChar"/>
         </w:rPr>
-        <w:t xml:space="preserve">backend/app/src/main/resources/db/migration/</w:t>
-      </w:r>
-      <w:r>
-        <w:t xml:space="preserve"> </w:t>
-      </w:r>
-      <w:r>
-        <w:t xml:space="preserve">und folgen dem Namensschema</w:t>
-      </w:r>
-      <w:r>
-        <w:t xml:space="preserve"> </w:t>
-      </w:r>
-      <w:r>
-        <w:rPr>
-          <w:rStyle w:val="VerbatimChar"/>
-        </w:rPr>
-        <w:t xml:space="preserve">V{n}__{beschreibung}.sql</w:t>
-      </w:r>
-      <w:r>
-        <w:t xml:space="preserve">.</w:t>
+        <w:t xml:space="preserve">AbstractIntegrationTest</w:t>
+      </w:r>
+      <w:r>
+        <w:t xml:space="preserve">); die JWT-Validierung wird via Spring Security Test gemockt — kein laufendes Keycloak nötig.</w:t>
       </w:r>
     </w:p>
     <w:p>
@@ -5460,24 +5744,40 @@
       </w:pPr>
       <w:r>
         <w:rPr>
+          <w:b/>
+          <w:bCs/>
+        </w:rPr>
+        <w:t xml:space="preserve">Coverage-Gate (Backend):</w:t>
+      </w:r>
+      <w:r>
+        <w:t xml:space="preserve"> </w:t>
+      </w:r>
+      <w:r>
+        <w:t xml:space="preserve">JaCoCo, modulübergreifend aggregiert. Die</w:t>
+      </w:r>
+      <w:r>
+        <w:t xml:space="preserve"> </w:t>
+      </w:r>
+      <w:r>
+        <w:rPr>
           <w:rStyle w:val="VerbatimChar"/>
         </w:rPr>
-        <w:t xml:space="preserve">V1__baseline.sql</w:t>
-      </w:r>
-      <w:r>
-        <w:t xml:space="preserve"> </w:t>
-      </w:r>
-      <w:r>
-        <w:t xml:space="preserve">enthält das initiale Schema aller Tabellen (</w:t>
+        <w:t xml:space="preserve">*IT</w:t>
+      </w:r>
+      <w:r>
+        <w:t xml:space="preserve">-Integrationstests liegen im</w:t>
+      </w:r>
+      <w:r>
+        <w:t xml:space="preserve"> </w:t>
       </w:r>
       <w:r>
         <w:rPr>
           <w:rStyle w:val="VerbatimChar"/>
         </w:rPr>
-        <w:t xml:space="preserve">players</w:t>
-      </w:r>
-      <w:r>
-        <w:t xml:space="preserve">,</w:t>
+        <w:t xml:space="preserve">app</w:t>
+      </w:r>
+      <w:r>
+        <w:t xml:space="preserve">-Modul, decken aber Klassen aller Module ab — per-Modul-Reports würden unterzählen. Die Root-Tasks</w:t>
       </w:r>
       <w:r>
         <w:t xml:space="preserve"> </w:t>
@@ -5486,10 +5786,13 @@
         <w:rPr>
           <w:rStyle w:val="VerbatimChar"/>
         </w:rPr>
-        <w:t xml:space="preserve">matches</w:t>
-      </w:r>
-      <w:r>
-        <w:t xml:space="preserve">,</w:t>
+        <w:t xml:space="preserve">jacocoRootReport</w:t>
+      </w:r>
+      <w:r>
+        <w:t xml:space="preserve"> </w:t>
+      </w:r>
+      <w:r>
+        <w:t xml:space="preserve">(Report) und</w:t>
       </w:r>
       <w:r>
         <w:t xml:space="preserve"> </w:t>
@@ -5498,10 +5801,92 @@
         <w:rPr>
           <w:rStyle w:val="VerbatimChar"/>
         </w:rPr>
-        <w:t xml:space="preserve">match_scores</w:t>
-      </w:r>
-      <w:r>
-        <w:t xml:space="preserve">), abgeleitet aus den bestehenden JPA-Entitäten.</w:t>
+        <w:t xml:space="preserve">jacocoRootCoverageVerification</w:t>
+      </w:r>
+      <w:r>
+        <w:t xml:space="preserve"> </w:t>
+      </w:r>
+      <w:r>
+        <w:t xml:space="preserve">(Gate) kombinieren die</w:t>
+      </w:r>
+      <w:r>
+        <w:t xml:space="preserve"> </w:t>
+      </w:r>
+      <w:r>
+        <w:rPr>
+          <w:rStyle w:val="VerbatimChar"/>
+        </w:rPr>
+        <w:t xml:space="preserve">test.exec</w:t>
+      </w:r>
+      <w:r>
+        <w:t xml:space="preserve">-Daten aller Module gegen alle</w:t>
+      </w:r>
+      <w:r>
+        <w:t xml:space="preserve"> </w:t>
+      </w:r>
+      <w:r>
+        <w:rPr>
+          <w:rStyle w:val="VerbatimChar"/>
+        </w:rPr>
+        <w:t xml:space="preserve">main</w:t>
+      </w:r>
+      <w:r>
+        <w:t xml:space="preserve">-Sources. Das Gate ist in</w:t>
+      </w:r>
+      <w:r>
+        <w:t xml:space="preserve"> </w:t>
+      </w:r>
+      <w:r>
+        <w:rPr>
+          <w:rStyle w:val="VerbatimChar"/>
+        </w:rPr>
+        <w:t xml:space="preserve">check</w:t>
+      </w:r>
+      <w:r>
+        <w:t xml:space="preserve"> </w:t>
+      </w:r>
+      <w:r>
+        <w:t xml:space="preserve">eingehängt und bricht den Build unter</w:t>
+      </w:r>
+      <w:r>
+        <w:t xml:space="preserve"> </w:t>
+      </w:r>
+      <w:r>
+        <w:rPr>
+          <w:b/>
+          <w:bCs/>
+        </w:rPr>
+        <w:t xml:space="preserve">85 % Line / 70 % Branch</w:t>
+      </w:r>
+      <w:r>
+        <w:t xml:space="preserve"> </w:t>
+      </w:r>
+      <w:r>
+        <w:t xml:space="preserve">(aktueller Stand ~95 % / ~80 %). Schwellen in</w:t>
+      </w:r>
+      <w:r>
+        <w:t xml:space="preserve"> </w:t>
+      </w:r>
+      <w:r>
+        <w:rPr>
+          <w:rStyle w:val="VerbatimChar"/>
+        </w:rPr>
+        <w:t xml:space="preserve">backend/build.gradle.kts</w:t>
+      </w:r>
+      <w:r>
+        <w:t xml:space="preserve"> </w:t>
+      </w:r>
+      <w:r>
+        <w:t xml:space="preserve">(</w:t>
+      </w:r>
+      <w:r>
+        <w:rPr>
+          <w:rStyle w:val="VerbatimChar"/>
+        </w:rPr>
+        <w:t xml:space="preserve">violationRules</w:t>
+      </w:r>
+      <w:r>
+        <w:t xml:space="preserve">).</w:t>
       </w:r>
     </w:p>
     <w:p>
@@ -5513,235 +5898,26 @@
         </w:numPr>
       </w:pPr>
       <w:r>
-        <w:t xml:space="preserve">Hibernate</w:t>
-      </w:r>
-      <w:r>
-        <w:t xml:space="preserve"> </w:t>
-      </w:r>
-      <w:r>
-        <w:rPr>
-          <w:rStyle w:val="VerbatimChar"/>
-        </w:rPr>
-        <w:t xml:space="preserve">ddl-auto</w:t>
-      </w:r>
-      <w:r>
-        <w:t xml:space="preserve"> </w:t>
-      </w:r>
-      <w:r>
-        <w:t xml:space="preserve">ist auf</w:t>
-      </w:r>
-      <w:r>
-        <w:t xml:space="preserve"> </w:t>
-      </w:r>
-      <w:r>
-        <w:rPr>
-          <w:rStyle w:val="VerbatimChar"/>
-        </w:rPr>
-        <w:t xml:space="preserve">validate</w:t>
-      </w:r>
-      <w:r>
-        <w:t xml:space="preserve"> </w:t>
-      </w:r>
-      <w:r>
-        <w:t xml:space="preserve">(PostgreSQL) bzw.</w:t>
-      </w:r>
-      <w:r>
-        <w:t xml:space="preserve"> </w:t>
-      </w:r>
-      <w:r>
-        <w:rPr>
-          <w:rStyle w:val="VerbatimChar"/>
-        </w:rPr>
-        <w:t xml:space="preserve">none</w:t>
-      </w:r>
-      <w:r>
-        <w:t xml:space="preserve"> </w:t>
-      </w:r>
-      <w:r>
-        <w:t xml:space="preserve">(H2/lokal) gesetzt – Flyway ist die einzige Quelle für Schema-Änderungen.</w:t>
-      </w:r>
-    </w:p>
-    <w:p>
-      <w:pPr>
-        <w:pStyle w:val="Compact"/>
-        <w:numPr>
-          <w:ilvl w:val="0"/>
-          <w:numId w:val="1008"/>
-        </w:numPr>
-      </w:pPr>
-      <w:r>
-        <w:t xml:space="preserve">Die Migrationsskripte verwenden ausschliesslich ANSI-SQL, das mit PostgreSQL und H2 kompatibel ist (kein datenbankspezifischer SQL-Dialekt), damit auch das lokale H2-Profil Flyway-gesteuert ist.</w:t>
-      </w:r>
-    </w:p>
-    <w:bookmarkEnd w:id="52"/>
-    <w:bookmarkStart w:id="53" w:name="fehlerbehandlung"/>
-    <w:p>
-      <w:pPr>
-        <w:pStyle w:val="Heading3"/>
-      </w:pPr>
-      <w:r>
-        <w:t xml:space="preserve">8.3 Fehlerbehandlung</w:t>
-      </w:r>
-    </w:p>
-    <w:p>
-      <w:pPr>
-        <w:pStyle w:val="FirstParagraph"/>
-      </w:pPr>
-      <w:r>
-        <w:t xml:space="preserve">Die Fehlerbehandlung erfolgt deklarativ über</w:t>
-      </w:r>
-      <w:r>
-        <w:t xml:space="preserve"> </w:t>
-      </w:r>
-      <w:r>
-        <w:rPr>
-          <w:rStyle w:val="VerbatimChar"/>
-        </w:rPr>
-        <w:t xml:space="preserve">@RestControllerAdvice</w:t>
-      </w:r>
-      <w:r>
-        <w:t xml:space="preserve">. Querschnittliche Fälle liegen zentral im</w:t>
-      </w:r>
-      <w:r>
-        <w:t xml:space="preserve"> </w:t>
-      </w:r>
-      <w:r>
-        <w:rPr>
-          <w:rStyle w:val="VerbatimChar"/>
-        </w:rPr>
-        <w:t xml:space="preserve">common-module</w:t>
-      </w:r>
-      <w:r>
-        <w:t xml:space="preserve"> </w:t>
-      </w:r>
-      <w:r>
-        <w:t xml:space="preserve">(</w:t>
-      </w:r>
-      <w:r>
-        <w:rPr>
-          <w:rStyle w:val="VerbatimChar"/>
-        </w:rPr>
-        <w:t xml:space="preserve">CommonExceptionHandler</w:t>
-      </w:r>
-      <w:r>
-        <w:t xml:space="preserve">): fachliche Zustandskonflikte (Basisklasse</w:t>
-      </w:r>
-      <w:r>
-        <w:t xml:space="preserve"> </w:t>
-      </w:r>
-      <w:r>
-        <w:rPr>
-          <w:rStyle w:val="VerbatimChar"/>
-        </w:rPr>
-        <w:t xml:space="preserve">ConflictException</w:t>
-      </w:r>
-      <w:r>
-        <w:t xml:space="preserve">) → HTTP 409, Bean-Validation-Fehler (</w:t>
-      </w:r>
-      <w:r>
-        <w:rPr>
-          <w:rStyle w:val="VerbatimChar"/>
-        </w:rPr>
-        <w:t xml:space="preserve">MethodArgumentNotValidException</w:t>
-      </w:r>
-      <w:r>
-        <w:t xml:space="preserve">) → HTTP 400 mit Feld-Details, ungültige Argumente (z. B. unbekannter Enum-Wert) → HTTP 400. Modulspezifische Domain-Exceptions werden in den jeweiligen Advices abgebildet:</w:t>
-      </w:r>
-      <w:r>
-        <w:t xml:space="preserve"> </w:t>
-      </w:r>
-      <w:r>
-        <w:rPr>
-          <w:rStyle w:val="VerbatimChar"/>
-        </w:rPr>
-        <w:t xml:space="preserve">GlobalExceptionHandler</w:t>
-      </w:r>
-      <w:r>
-        <w:t xml:space="preserve"> </w:t>
-      </w:r>
-      <w:r>
-        <w:t xml:space="preserve">(Player/Match „nicht gefunden” → 404) und</w:t>
-      </w:r>
-      <w:r>
-        <w:t xml:space="preserve"> </w:t>
-      </w:r>
-      <w:r>
-        <w:rPr>
-          <w:rStyle w:val="VerbatimChar"/>
-        </w:rPr>
-        <w:t xml:space="preserve">AiExceptionHandler</w:t>
-      </w:r>
-      <w:r>
-        <w:t xml:space="preserve"> </w:t>
-      </w:r>
-      <w:r>
-        <w:t xml:space="preserve">(</w:t>
-      </w:r>
-      <w:r>
-        <w:rPr>
-          <w:rStyle w:val="VerbatimChar"/>
-        </w:rPr>
-        <w:t xml:space="preserve">InsufficientMatchDataException</w:t>
-      </w:r>
-      <w:r>
-        <w:t xml:space="preserve"> </w:t>
-      </w:r>
-      <w:r>
-        <w:t xml:space="preserve">→ 422,</w:t>
-      </w:r>
-      <w:r>
-        <w:t xml:space="preserve"> </w:t>
-      </w:r>
-      <w:r>
-        <w:rPr>
-          <w:rStyle w:val="VerbatimChar"/>
-        </w:rPr>
-        <w:t xml:space="preserve">AnalysisGenerationException</w:t>
-      </w:r>
-      <w:r>
-        <w:t xml:space="preserve"> </w:t>
-      </w:r>
-      <w:r>
-        <w:t xml:space="preserve">→ 502). Technische Fehler ergeben HTTP 5xx.</w:t>
-      </w:r>
-    </w:p>
-    <w:p>
-      <w:pPr>
-        <w:pStyle w:val="BodyText"/>
-      </w:pPr>
-      <w:r>
-        <w:t xml:space="preserve">Das Antwortformat folgt</w:t>
-      </w:r>
-      <w:r>
-        <w:t xml:space="preserve"> </w:t>
-      </w:r>
-      <w:r>
         <w:rPr>
           <w:b/>
           <w:bCs/>
         </w:rPr>
-        <w:t xml:space="preserve">RFC 7807</w:t>
-      </w:r>
-      <w:r>
-        <w:t xml:space="preserve"> </w:t>
-      </w:r>
-      <w:r>
-        <w:t xml:space="preserve">über Springs</w:t>
-      </w:r>
-      <w:r>
-        <w:t xml:space="preserve"> </w:t>
+        <w:t xml:space="preserve">Frontend-Tests:</w:t>
+      </w:r>
+      <w:r>
+        <w:t xml:space="preserve"> </w:t>
+      </w:r>
+      <w:r>
+        <w:t xml:space="preserve">Vitest (</w:t>
       </w:r>
       <w:r>
         <w:rPr>
           <w:rStyle w:val="VerbatimChar"/>
         </w:rPr>
-        <w:t xml:space="preserve">ProblemDetail</w:t>
-      </w:r>
-      <w:r>
-        <w:t xml:space="preserve"> </w:t>
-      </w:r>
-      <w:r>
-        <w:t xml:space="preserve">(Felder</w:t>
+        <w:t xml:space="preserve">@angular/build:unit-test</w:t>
+      </w:r>
+      <w:r>
+        <w:t xml:space="preserve">-Builder,</w:t>
       </w:r>
       <w:r>
         <w:t xml:space="preserve"> </w:t>
@@ -5750,374 +5926,32 @@
         <w:rPr>
           <w:rStyle w:val="VerbatimChar"/>
         </w:rPr>
-        <w:t xml:space="preserve">type</w:t>
-      </w:r>
-      <w:r>
-        <w:t xml:space="preserve">,</w:t>
-      </w:r>
-      <w:r>
-        <w:t xml:space="preserve"> </w:t>
+        <w:t xml:space="preserve">*.spec.ts</w:t>
+      </w:r>
+      <w:r>
+        <w:t xml:space="preserve">) für Unit-Tests sowie Cypress Component Testing (</w:t>
       </w:r>
       <w:r>
         <w:rPr>
           <w:rStyle w:val="VerbatimChar"/>
         </w:rPr>
-        <w:t xml:space="preserve">title</w:t>
-      </w:r>
-      <w:r>
-        <w:t xml:space="preserve">,</w:t>
-      </w:r>
-      <w:r>
-        <w:t xml:space="preserve"> </w:t>
+        <w:t xml:space="preserve">*.cy.ts</w:t>
+      </w:r>
+      <w:r>
+        <w:t xml:space="preserve">) für Komponenten-/Integrationstests mit gemockten HTTP-Calls (</w:t>
       </w:r>
       <w:r>
         <w:rPr>
           <w:rStyle w:val="VerbatimChar"/>
         </w:rPr>
-        <w:t xml:space="preserve">status</w:t>
-      </w:r>
-      <w:r>
-        <w:t xml:space="preserve">,</w:t>
-      </w:r>
-      <w:r>
-        <w:t xml:space="preserve"> </w:t>
-      </w:r>
-      <w:r>
-        <w:rPr>
-          <w:rStyle w:val="VerbatimChar"/>
-        </w:rPr>
-        <w:t xml:space="preserve">detail</w:t>
-      </w:r>
-      <w:r>
-        <w:t xml:space="preserve">, ggf. zusätzliche Properties wie</w:t>
-      </w:r>
-      <w:r>
-        <w:t xml:space="preserve"> </w:t>
-      </w:r>
-      <w:r>
-        <w:rPr>
-          <w:rStyle w:val="VerbatimChar"/>
-        </w:rPr>
-        <w:t xml:space="preserve">errors</w:t>
-      </w:r>
-      <w:r>
-        <w:t xml:space="preserve">) — der Spring-native Standard, der das früher geplante Ad-hoc-Format</w:t>
-      </w:r>
-      <w:r>
-        <w:t xml:space="preserve"> </w:t>
-      </w:r>
-      <w:r>
-        <w:rPr>
-          <w:rStyle w:val="VerbatimChar"/>
-        </w:rPr>
-        <w:t xml:space="preserve">{error-code, message, timestamp}</w:t>
-      </w:r>
-      <w:r>
-        <w:t xml:space="preserve"> </w:t>
-      </w:r>
-      <w:r>
-        <w:t xml:space="preserve">ablöst.</w:t>
-      </w:r>
-    </w:p>
-    <w:bookmarkEnd w:id="53"/>
-    <w:bookmarkStart w:id="54" w:name="logging-und-monitoring"/>
-    <w:p>
-      <w:pPr>
-        <w:pStyle w:val="Heading3"/>
-      </w:pPr>
-      <w:r>
-        <w:t xml:space="preserve">8.4 Logging und Monitoring</w:t>
-      </w:r>
-    </w:p>
-    <w:p>
-      <w:pPr>
-        <w:pStyle w:val="FirstParagraph"/>
-      </w:pPr>
-      <w:r>
-        <w:t xml:space="preserve">Strukturiertes Logging via SLF4J/Logback im JSON-Format. Spring Boot Actuator stellt Health-, Metrics- und Info-Endpunkte bereit. Metriken können über Prometheus/Grafana überwacht werden.</w:t>
+        <w:t xml:space="preserve">cy.intercept</w:t>
+      </w:r>
+      <w:r>
+        <w:t xml:space="preserve">).</w:t>
       </w:r>
     </w:p>
     <w:bookmarkEnd w:id="54"/>
-    <w:bookmarkStart w:id="55" w:name="testkonzept"/>
-    <w:p>
-      <w:pPr>
-        <w:pStyle w:val="Heading3"/>
-      </w:pPr>
-      <w:r>
-        <w:t xml:space="preserve">8.5 Testkonzept</w:t>
-      </w:r>
-    </w:p>
-    <w:p>
-      <w:pPr>
-        <w:pStyle w:val="Compact"/>
-        <w:numPr>
-          <w:ilvl w:val="0"/>
-          <w:numId w:val="1009"/>
-        </w:numPr>
-      </w:pPr>
-      <w:r>
-        <w:rPr>
-          <w:b/>
-          <w:bCs/>
-        </w:rPr>
-        <w:t xml:space="preserve">Unit Tests (Backend):</w:t>
-      </w:r>
-      <w:r>
-        <w:t xml:space="preserve"> </w:t>
-      </w:r>
-      <w:r>
-        <w:t xml:space="preserve">JUnit 5 (Jupiter) für Domänenlogik und Services; Mockito für das Mocking von Ports und externen Abhängigkeiten.</w:t>
-      </w:r>
-    </w:p>
-    <w:p>
-      <w:pPr>
-        <w:pStyle w:val="Compact"/>
-        <w:numPr>
-          <w:ilvl w:val="0"/>
-          <w:numId w:val="1009"/>
-        </w:numPr>
-      </w:pPr>
-      <w:r>
-        <w:rPr>
-          <w:b/>
-          <w:bCs/>
-        </w:rPr>
-        <w:t xml:space="preserve">Integrations-/API-Tests (Backend):</w:t>
-      </w:r>
-      <w:r>
-        <w:t xml:space="preserve"> </w:t>
-      </w:r>
-      <w:r>
-        <w:t xml:space="preserve">Spring Boot Test mit Testcontainers (PostgreSQL) und MockMvc (</w:t>
-      </w:r>
-      <w:r>
-        <w:rPr>
-          <w:rStyle w:val="VerbatimChar"/>
-        </w:rPr>
-        <w:t xml:space="preserve">AbstractIntegrationTest</w:t>
-      </w:r>
-      <w:r>
-        <w:t xml:space="preserve">); die JWT-Validierung wird via Spring Security Test gemockt — kein laufendes Keycloak nötig.</w:t>
-      </w:r>
-    </w:p>
-    <w:p>
-      <w:pPr>
-        <w:pStyle w:val="Compact"/>
-        <w:numPr>
-          <w:ilvl w:val="0"/>
-          <w:numId w:val="1009"/>
-        </w:numPr>
-      </w:pPr>
-      <w:r>
-        <w:rPr>
-          <w:b/>
-          <w:bCs/>
-        </w:rPr>
-        <w:t xml:space="preserve">Coverage-Gate (Backend):</w:t>
-      </w:r>
-      <w:r>
-        <w:t xml:space="preserve"> </w:t>
-      </w:r>
-      <w:r>
-        <w:t xml:space="preserve">JaCoCo, modulübergreifend aggregiert. Die</w:t>
-      </w:r>
-      <w:r>
-        <w:t xml:space="preserve"> </w:t>
-      </w:r>
-      <w:r>
-        <w:rPr>
-          <w:rStyle w:val="VerbatimChar"/>
-        </w:rPr>
-        <w:t xml:space="preserve">*IT</w:t>
-      </w:r>
-      <w:r>
-        <w:t xml:space="preserve">-Integrationstests liegen im</w:t>
-      </w:r>
-      <w:r>
-        <w:t xml:space="preserve"> </w:t>
-      </w:r>
-      <w:r>
-        <w:rPr>
-          <w:rStyle w:val="VerbatimChar"/>
-        </w:rPr>
-        <w:t xml:space="preserve">app</w:t>
-      </w:r>
-      <w:r>
-        <w:t xml:space="preserve">-Modul, decken aber Klassen aller Module ab — per-Modul-Reports würden unterzählen. Die Root-Tasks</w:t>
-      </w:r>
-      <w:r>
-        <w:t xml:space="preserve"> </w:t>
-      </w:r>
-      <w:r>
-        <w:rPr>
-          <w:rStyle w:val="VerbatimChar"/>
-        </w:rPr>
-        <w:t xml:space="preserve">jacocoRootReport</w:t>
-      </w:r>
-      <w:r>
-        <w:t xml:space="preserve"> </w:t>
-      </w:r>
-      <w:r>
-        <w:t xml:space="preserve">(Report) und</w:t>
-      </w:r>
-      <w:r>
-        <w:t xml:space="preserve"> </w:t>
-      </w:r>
-      <w:r>
-        <w:rPr>
-          <w:rStyle w:val="VerbatimChar"/>
-        </w:rPr>
-        <w:t xml:space="preserve">jacocoRootCoverageVerification</w:t>
-      </w:r>
-      <w:r>
-        <w:t xml:space="preserve"> </w:t>
-      </w:r>
-      <w:r>
-        <w:t xml:space="preserve">(Gate) kombinieren die</w:t>
-      </w:r>
-      <w:r>
-        <w:t xml:space="preserve"> </w:t>
-      </w:r>
-      <w:r>
-        <w:rPr>
-          <w:rStyle w:val="VerbatimChar"/>
-        </w:rPr>
-        <w:t xml:space="preserve">test.exec</w:t>
-      </w:r>
-      <w:r>
-        <w:t xml:space="preserve">-Daten aller Module gegen alle</w:t>
-      </w:r>
-      <w:r>
-        <w:t xml:space="preserve"> </w:t>
-      </w:r>
-      <w:r>
-        <w:rPr>
-          <w:rStyle w:val="VerbatimChar"/>
-        </w:rPr>
-        <w:t xml:space="preserve">main</w:t>
-      </w:r>
-      <w:r>
-        <w:t xml:space="preserve">-Sources. Das Gate ist in</w:t>
-      </w:r>
-      <w:r>
-        <w:t xml:space="preserve"> </w:t>
-      </w:r>
-      <w:r>
-        <w:rPr>
-          <w:rStyle w:val="VerbatimChar"/>
-        </w:rPr>
-        <w:t xml:space="preserve">check</w:t>
-      </w:r>
-      <w:r>
-        <w:t xml:space="preserve"> </w:t>
-      </w:r>
-      <w:r>
-        <w:t xml:space="preserve">eingehängt und bricht den Build unter</w:t>
-      </w:r>
-      <w:r>
-        <w:t xml:space="preserve"> </w:t>
-      </w:r>
-      <w:r>
-        <w:rPr>
-          <w:b/>
-          <w:bCs/>
-        </w:rPr>
-        <w:t xml:space="preserve">85 % Line / 70 % Branch</w:t>
-      </w:r>
-      <w:r>
-        <w:t xml:space="preserve"> </w:t>
-      </w:r>
-      <w:r>
-        <w:t xml:space="preserve">(aktueller Stand ~95 % / ~80 %). Schwellen in</w:t>
-      </w:r>
-      <w:r>
-        <w:t xml:space="preserve"> </w:t>
-      </w:r>
-      <w:r>
-        <w:rPr>
-          <w:rStyle w:val="VerbatimChar"/>
-        </w:rPr>
-        <w:t xml:space="preserve">backend/build.gradle.kts</w:t>
-      </w:r>
-      <w:r>
-        <w:t xml:space="preserve"> </w:t>
-      </w:r>
-      <w:r>
-        <w:t xml:space="preserve">(</w:t>
-      </w:r>
-      <w:r>
-        <w:rPr>
-          <w:rStyle w:val="VerbatimChar"/>
-        </w:rPr>
-        <w:t xml:space="preserve">violationRules</w:t>
-      </w:r>
-      <w:r>
-        <w:t xml:space="preserve">).</w:t>
-      </w:r>
-    </w:p>
-    <w:p>
-      <w:pPr>
-        <w:pStyle w:val="Compact"/>
-        <w:numPr>
-          <w:ilvl w:val="0"/>
-          <w:numId w:val="1009"/>
-        </w:numPr>
-      </w:pPr>
-      <w:r>
-        <w:rPr>
-          <w:b/>
-          <w:bCs/>
-        </w:rPr>
-        <w:t xml:space="preserve">Frontend-Tests:</w:t>
-      </w:r>
-      <w:r>
-        <w:t xml:space="preserve"> </w:t>
-      </w:r>
-      <w:r>
-        <w:t xml:space="preserve">Vitest (</w:t>
-      </w:r>
-      <w:r>
-        <w:rPr>
-          <w:rStyle w:val="VerbatimChar"/>
-        </w:rPr>
-        <w:t xml:space="preserve">@angular/build:unit-test</w:t>
-      </w:r>
-      <w:r>
-        <w:t xml:space="preserve">-Builder,</w:t>
-      </w:r>
-      <w:r>
-        <w:t xml:space="preserve"> </w:t>
-      </w:r>
-      <w:r>
-        <w:rPr>
-          <w:rStyle w:val="VerbatimChar"/>
-        </w:rPr>
-        <w:t xml:space="preserve">*.spec.ts</w:t>
-      </w:r>
-      <w:r>
-        <w:t xml:space="preserve">) für Unit-Tests sowie Cypress Component Testing (</w:t>
-      </w:r>
-      <w:r>
-        <w:rPr>
-          <w:rStyle w:val="VerbatimChar"/>
-        </w:rPr>
-        <w:t xml:space="preserve">*.cy.ts</w:t>
-      </w:r>
-      <w:r>
-        <w:t xml:space="preserve">) für Komponenten-/Integrationstests mit gemockten HTTP-Calls (</w:t>
-      </w:r>
-      <w:r>
-        <w:rPr>
-          <w:rStyle w:val="VerbatimChar"/>
-        </w:rPr>
-        <w:t xml:space="preserve">cy.intercept</w:t>
-      </w:r>
-      <w:r>
-        <w:t xml:space="preserve">).</w:t>
-      </w:r>
-    </w:p>
-    <w:bookmarkEnd w:id="55"/>
-    <w:bookmarkStart w:id="56" w:name="continuous-integration-build-gate"/>
+    <w:bookmarkStart w:id="55" w:name="continuous-integration-build-gate"/>
     <w:p>
       <w:pPr>
         <w:pStyle w:val="Heading3"/>
@@ -6413,8 +6247,8 @@
         <w:t xml:space="preserve">ist deaktiviert, sodass Repo-Admins im Notfall überstimmen können.</w:t>
       </w:r>
     </w:p>
-    <w:bookmarkEnd w:id="56"/>
-    <w:bookmarkStart w:id="57" w:name="testergebnisse"/>
+    <w:bookmarkEnd w:id="55"/>
+    <w:bookmarkStart w:id="56" w:name="testergebnisse"/>
     <w:p>
       <w:pPr>
         <w:pStyle w:val="Heading3"/>
@@ -7404,7 +7238,7 @@
         <w:pStyle w:val="Compact"/>
         <w:numPr>
           <w:ilvl w:val="0"/>
-          <w:numId w:val="1010"/>
+          <w:numId w:val="1009"/>
         </w:numPr>
       </w:pPr>
       <w:r>
@@ -7478,7 +7312,7 @@
         <w:pStyle w:val="Compact"/>
         <w:numPr>
           <w:ilvl w:val="0"/>
-          <w:numId w:val="1010"/>
+          <w:numId w:val="1009"/>
         </w:numPr>
       </w:pPr>
       <w:r>
@@ -7525,7 +7359,7 @@
         <w:pStyle w:val="Compact"/>
         <w:numPr>
           <w:ilvl w:val="0"/>
-          <w:numId w:val="1010"/>
+          <w:numId w:val="1009"/>
         </w:numPr>
       </w:pPr>
       <w:r>
@@ -7613,9 +7447,9 @@
         </w:pict>
       </w:r>
     </w:p>
+    <w:bookmarkEnd w:id="56"/>
     <w:bookmarkEnd w:id="57"/>
-    <w:bookmarkEnd w:id="58"/>
-    <w:bookmarkStart w:id="59" w:name="architekturentscheidungen"/>
+    <w:bookmarkStart w:id="58" w:name="architekturentscheidungen"/>
     <w:p>
       <w:pPr>
         <w:pStyle w:val="Heading2"/>
@@ -9255,8 +9089,8 @@
         </w:pict>
       </w:r>
     </w:p>
-    <w:bookmarkEnd w:id="59"/>
-    <w:bookmarkStart w:id="62" w:name="qualitätsanforderungen"/>
+    <w:bookmarkEnd w:id="58"/>
+    <w:bookmarkStart w:id="61" w:name="qualitätsanforderungen"/>
     <w:p>
       <w:pPr>
         <w:pStyle w:val="Heading2"/>
@@ -9265,7 +9099,7 @@
         <w:t xml:space="preserve">10. Qualitätsanforderungen</w:t>
       </w:r>
     </w:p>
-    <w:bookmarkStart w:id="60" w:name="funktionale-anforderungen-smart"/>
+    <w:bookmarkStart w:id="59" w:name="funktionale-anforderungen-smart"/>
     <w:p>
       <w:pPr>
         <w:pStyle w:val="Heading3"/>
@@ -11380,8 +11214,8 @@
         </w:tc>
       </w:tr>
     </w:tbl>
-    <w:bookmarkEnd w:id="60"/>
-    <w:bookmarkStart w:id="61" w:name="nicht-funktionale-anforderungen-smart"/>
+    <w:bookmarkEnd w:id="59"/>
+    <w:bookmarkStart w:id="60" w:name="nicht-funktionale-anforderungen-smart"/>
     <w:p>
       <w:pPr>
         <w:pStyle w:val="Heading3"/>
@@ -11645,9 +11479,9 @@
         </w:pict>
       </w:r>
     </w:p>
+    <w:bookmarkEnd w:id="60"/>
     <w:bookmarkEnd w:id="61"/>
-    <w:bookmarkEnd w:id="62"/>
-    <w:bookmarkStart w:id="68" w:name="datenmodell"/>
+    <w:bookmarkStart w:id="67" w:name="datenmodell"/>
     <w:p>
       <w:pPr>
         <w:pStyle w:val="Heading2"/>
@@ -11673,18 +11507,18 @@
           <wp:inline>
             <wp:extent cx="5334000" cy="3765627"/>
             <wp:effectExtent b="0" l="0" r="0" t="0"/>
-            <wp:docPr descr="TSaS – Datenmodell" title="" id="64" name="Picture"/>
+            <wp:docPr descr="TSaS – Datenmodell" title="" id="63" name="Picture"/>
             <a:graphic>
               <a:graphicData uri="http://schemas.openxmlformats.org/drawingml/2006/picture">
                 <pic:pic>
                   <pic:nvPicPr>
-                    <pic:cNvPr descr="Datenmodell.png" id="65" name="Picture"/>
+                    <pic:cNvPr descr="Datenmodell.png" id="64" name="Picture"/>
                     <pic:cNvPicPr>
                       <a:picLocks noChangeArrowheads="1" noChangeAspect="1"/>
                     </pic:cNvPicPr>
                   </pic:nvPicPr>
                   <pic:blipFill>
-                    <a:blip r:embed="rId63"/>
+                    <a:blip r:embed="rId62"/>
                     <a:stretch>
                       <a:fillRect/>
                     </a:stretch>
@@ -11737,7 +11571,7 @@
         </w:rPr>
         <w:t xml:space="preserve"> </w:t>
       </w:r>
-      <w:hyperlink r:id="rId66">
+      <w:hyperlink r:id="rId65">
         <w:r>
           <w:rPr>
             <w:rStyle w:val="VerbatimChar"/>
@@ -11755,7 +11589,7 @@
         <w:t xml:space="preserve">. Authoritatives Schema: Flyway-Migrationen V1–V5.</w:t>
       </w:r>
     </w:p>
-    <w:bookmarkStart w:id="67" w:name="entitätenübersicht"/>
+    <w:bookmarkStart w:id="66" w:name="entitätenübersicht"/>
     <w:p>
       <w:pPr>
         <w:pStyle w:val="Heading3"/>
@@ -12245,9 +12079,9 @@
         </w:pict>
       </w:r>
     </w:p>
+    <w:bookmarkEnd w:id="66"/>
     <w:bookmarkEnd w:id="67"/>
-    <w:bookmarkEnd w:id="68"/>
-    <w:bookmarkStart w:id="69" w:name="risiken-und-technische-schulden"/>
+    <w:bookmarkStart w:id="68" w:name="risiken-und-technische-schulden"/>
     <w:p>
       <w:pPr>
         <w:pStyle w:val="Heading2"/>
@@ -12724,8 +12558,8 @@
         </w:pict>
       </w:r>
     </w:p>
-    <w:bookmarkEnd w:id="69"/>
-    <w:bookmarkStart w:id="70" w:name="glossar"/>
+    <w:bookmarkEnd w:id="68"/>
+    <w:bookmarkStart w:id="69" w:name="glossar"/>
     <w:p>
       <w:pPr>
         <w:pStyle w:val="Heading2"/>
@@ -13249,8 +13083,8 @@
         </w:tc>
       </w:tr>
     </w:tbl>
+    <w:bookmarkEnd w:id="69"/>
     <w:bookmarkEnd w:id="70"/>
-    <w:bookmarkEnd w:id="71"/>
     <w:sectPr>
       <w:footnotePr>
         <w:numRestart w:val="eachSect"/>
@@ -13361,6 +13195,109 @@
       </w:pPr>
     </w:lvl>
   </w:abstractNum>
+  <w:abstractNum w:abstractNumId="991">
+    <w:nsid w:val="0000A991"/>
+    <w:multiLevelType w:val="multilevel"/>
+    <w:lvl w:ilvl="0">
+      <w:numFmt w:val="bullet"/>
+      <w:lvlText w:val=""/>
+      <w:lvlJc w:val="left"/>
+      <w:pPr>
+        <w:ind w:left="720" w:hanging="360"/>
+      </w:pPr>
+      <w:rPr>
+        <w:rFonts w:ascii="Symbol" w:hAnsi="Symbol" w:cs="Symbol" w:hint="default"/>
+      </w:rPr>
+    </w:lvl>
+    <w:lvl w:ilvl="1">
+      <w:numFmt w:val="bullet"/>
+      <w:lvlText w:val="o"/>
+      <w:lvlJc w:val="left"/>
+      <w:pPr>
+        <w:ind w:left="1440" w:hanging="360"/>
+      </w:pPr>
+      <w:rPr>
+        <w:rFonts w:ascii="Courier New" w:hAnsi="Courier New" w:cs="Courier New" w:hint="default"/>
+      </w:rPr>
+    </w:lvl>
+    <w:lvl w:ilvl="2">
+      <w:numFmt w:val="bullet"/>
+      <w:lvlText w:val=""/>
+      <w:lvlJc w:val="left"/>
+      <w:pPr>
+        <w:ind w:left="2160" w:hanging="360"/>
+      </w:pPr>
+      <w:rPr>
+        <w:rFonts w:ascii="Wingdings" w:hAnsi="Wingdings" w:cs="Wingdings" w:hint="default"/>
+      </w:rPr>
+    </w:lvl>
+    <w:lvl w:ilvl="3">
+      <w:numFmt w:val="bullet"/>
+      <w:lvlText w:val=""/>
+      <w:lvlJc w:val="left"/>
+      <w:pPr>
+        <w:ind w:left="2880" w:hanging="360"/>
+      </w:pPr>
+      <w:rPr>
+        <w:rFonts w:ascii="Symbol" w:hAnsi="Symbol" w:cs="Symbol" w:hint="default"/>
+      </w:rPr>
+    </w:lvl>
+    <w:lvl w:ilvl="4">
+      <w:numFmt w:val="bullet"/>
+      <w:lvlText w:val="o"/>
+      <w:lvlJc w:val="left"/>
+      <w:pPr>
+        <w:ind w:left="3600" w:hanging="360"/>
+      </w:pPr>
+      <w:rPr>
+        <w:rFonts w:ascii="Courier New" w:hAnsi="Courier New" w:cs="Courier New" w:hint="default"/>
+      </w:rPr>
+    </w:lvl>
+    <w:lvl w:ilvl="5">
+      <w:numFmt w:val="bullet"/>
+      <w:lvlText w:val=""/>
+      <w:lvlJc w:val="left"/>
+      <w:pPr>
+        <w:ind w:left="4320" w:hanging="360"/>
+      </w:pPr>
+      <w:rPr>
+        <w:rFonts w:ascii="Wingdings" w:hAnsi="Wingdings" w:cs="Wingdings" w:hint="default"/>
+      </w:rPr>
+    </w:lvl>
+    <w:lvl w:ilvl="6">
+      <w:numFmt w:val="bullet"/>
+      <w:lvlText w:val=""/>
+      <w:lvlJc w:val="left"/>
+      <w:pPr>
+        <w:ind w:left="5040" w:hanging="360"/>
+      </w:pPr>
+      <w:rPr>
+        <w:rFonts w:ascii="Symbol" w:hAnsi="Symbol" w:cs="Symbol" w:hint="default"/>
+      </w:rPr>
+    </w:lvl>
+    <w:lvl w:ilvl="7">
+      <w:numFmt w:val="bullet"/>
+      <w:lvlText w:val="o"/>
+      <w:lvlJc w:val="left"/>
+      <w:pPr>
+        <w:ind w:left="5760" w:hanging="360"/>
+      </w:pPr>
+      <w:rPr>
+        <w:rFonts w:ascii="Courier New" w:hAnsi="Courier New" w:cs="Courier New" w:hint="default"/>
+      </w:rPr>
+    </w:lvl>
+    <w:lvl w:ilvl="8">
+      <w:numFmt w:val="bullet"/>
+      <w:lvlText w:val=""/>
+      <w:lvlJc w:val="left"/>
+      <w:pPr>
+        <w:ind w:left="6480" w:hanging="360"/>
+      </w:pPr>
+      <w:rPr>
+        <w:rFonts w:ascii="Wingdings" w:hAnsi="Wingdings" w:cs="Wingdings" w:hint="default"/>
+      </w:rPr>
+    </w:lvl>
+  </w:abstractNum>
   <w:abstractNum w:abstractNumId="99411">
     <w:nsid w:val="00A99411"/>
     <w:multiLevelType w:val="multilevel"/>
@@ -13446,113 +13383,19 @@
       </w:pPr>
     </w:lvl>
   </w:abstractNum>
-  <w:abstractNum w:abstractNumId="991">
-    <w:nsid w:val="0000A991"/>
-    <w:multiLevelType w:val="multilevel"/>
-    <w:lvl w:ilvl="0">
-      <w:numFmt w:val="bullet"/>
-      <w:lvlText w:val=""/>
-      <w:lvlJc w:val="left"/>
-      <w:pPr>
-        <w:ind w:left="720" w:hanging="360"/>
-      </w:pPr>
-      <w:rPr>
-        <w:rFonts w:ascii="Symbol" w:hAnsi="Symbol" w:cs="Symbol" w:hint="default"/>
-      </w:rPr>
-    </w:lvl>
-    <w:lvl w:ilvl="1">
-      <w:numFmt w:val="bullet"/>
-      <w:lvlText w:val="o"/>
-      <w:lvlJc w:val="left"/>
-      <w:pPr>
-        <w:ind w:left="1440" w:hanging="360"/>
-      </w:pPr>
-      <w:rPr>
-        <w:rFonts w:ascii="Courier New" w:hAnsi="Courier New" w:cs="Courier New" w:hint="default"/>
-      </w:rPr>
-    </w:lvl>
-    <w:lvl w:ilvl="2">
-      <w:numFmt w:val="bullet"/>
-      <w:lvlText w:val=""/>
-      <w:lvlJc w:val="left"/>
-      <w:pPr>
-        <w:ind w:left="2160" w:hanging="360"/>
-      </w:pPr>
-      <w:rPr>
-        <w:rFonts w:ascii="Wingdings" w:hAnsi="Wingdings" w:cs="Wingdings" w:hint="default"/>
-      </w:rPr>
-    </w:lvl>
-    <w:lvl w:ilvl="3">
-      <w:numFmt w:val="bullet"/>
-      <w:lvlText w:val=""/>
-      <w:lvlJc w:val="left"/>
-      <w:pPr>
-        <w:ind w:left="2880" w:hanging="360"/>
-      </w:pPr>
-      <w:rPr>
-        <w:rFonts w:ascii="Symbol" w:hAnsi="Symbol" w:cs="Symbol" w:hint="default"/>
-      </w:rPr>
-    </w:lvl>
-    <w:lvl w:ilvl="4">
-      <w:numFmt w:val="bullet"/>
-      <w:lvlText w:val="o"/>
-      <w:lvlJc w:val="left"/>
-      <w:pPr>
-        <w:ind w:left="3600" w:hanging="360"/>
-      </w:pPr>
-      <w:rPr>
-        <w:rFonts w:ascii="Courier New" w:hAnsi="Courier New" w:cs="Courier New" w:hint="default"/>
-      </w:rPr>
-    </w:lvl>
-    <w:lvl w:ilvl="5">
-      <w:numFmt w:val="bullet"/>
-      <w:lvlText w:val=""/>
-      <w:lvlJc w:val="left"/>
-      <w:pPr>
-        <w:ind w:left="4320" w:hanging="360"/>
-      </w:pPr>
-      <w:rPr>
-        <w:rFonts w:ascii="Wingdings" w:hAnsi="Wingdings" w:cs="Wingdings" w:hint="default"/>
-      </w:rPr>
-    </w:lvl>
-    <w:lvl w:ilvl="6">
-      <w:numFmt w:val="bullet"/>
-      <w:lvlText w:val=""/>
-      <w:lvlJc w:val="left"/>
-      <w:pPr>
-        <w:ind w:left="5040" w:hanging="360"/>
-      </w:pPr>
-      <w:rPr>
-        <w:rFonts w:ascii="Symbol" w:hAnsi="Symbol" w:cs="Symbol" w:hint="default"/>
-      </w:rPr>
-    </w:lvl>
-    <w:lvl w:ilvl="7">
-      <w:numFmt w:val="bullet"/>
-      <w:lvlText w:val="o"/>
-      <w:lvlJc w:val="left"/>
-      <w:pPr>
-        <w:ind w:left="5760" w:hanging="360"/>
-      </w:pPr>
-      <w:rPr>
-        <w:rFonts w:ascii="Courier New" w:hAnsi="Courier New" w:cs="Courier New" w:hint="default"/>
-      </w:rPr>
-    </w:lvl>
-    <w:lvl w:ilvl="8">
-      <w:numFmt w:val="bullet"/>
-      <w:lvlText w:val=""/>
-      <w:lvlJc w:val="left"/>
-      <w:pPr>
-        <w:ind w:left="6480" w:hanging="360"/>
-      </w:pPr>
-      <w:rPr>
-        <w:rFonts w:ascii="Wingdings" w:hAnsi="Wingdings" w:cs="Wingdings" w:hint="default"/>
-      </w:rPr>
-    </w:lvl>
-  </w:abstractNum>
   <w:num w:numId="1000">
     <w:abstractNumId w:val="990"/>
   </w:num>
   <w:num w:numId="1001">
+    <w:abstractNumId w:val="991"/>
+  </w:num>
+  <w:num w:numId="1002">
+    <w:abstractNumId w:val="991"/>
+  </w:num>
+  <w:num w:numId="1003">
+    <w:abstractNumId w:val="991"/>
+  </w:num>
+  <w:num w:numId="1004">
     <w:abstractNumId w:val="99411"/>
     <w:lvlOverride w:ilvl="0">
       <w:startOverride w:val="1"/>
@@ -13581,15 +13424,6 @@
     <w:lvlOverride w:ilvl="8">
       <w:startOverride w:val="1"/>
     </w:lvlOverride>
-  </w:num>
-  <w:num w:numId="1002">
-    <w:abstractNumId w:val="991"/>
-  </w:num>
-  <w:num w:numId="1003">
-    <w:abstractNumId w:val="991"/>
-  </w:num>
-  <w:num w:numId="1004">
-    <w:abstractNumId w:val="991"/>
   </w:num>
   <w:num w:numId="1005">
     <w:abstractNumId w:val="99411"/>
@@ -13652,42 +13486,12 @@
     </w:lvlOverride>
   </w:num>
   <w:num w:numId="1007">
-    <w:abstractNumId w:val="99411"/>
-    <w:lvlOverride w:ilvl="0">
-      <w:startOverride w:val="1"/>
-    </w:lvlOverride>
-    <w:lvlOverride w:ilvl="1">
-      <w:startOverride w:val="1"/>
-    </w:lvlOverride>
-    <w:lvlOverride w:ilvl="2">
-      <w:startOverride w:val="1"/>
-    </w:lvlOverride>
-    <w:lvlOverride w:ilvl="3">
-      <w:startOverride w:val="1"/>
-    </w:lvlOverride>
-    <w:lvlOverride w:ilvl="4">
-      <w:startOverride w:val="1"/>
-    </w:lvlOverride>
-    <w:lvlOverride w:ilvl="5">
-      <w:startOverride w:val="1"/>
-    </w:lvlOverride>
-    <w:lvlOverride w:ilvl="6">
-      <w:startOverride w:val="1"/>
-    </w:lvlOverride>
-    <w:lvlOverride w:ilvl="7">
-      <w:startOverride w:val="1"/>
-    </w:lvlOverride>
-    <w:lvlOverride w:ilvl="8">
-      <w:startOverride w:val="1"/>
-    </w:lvlOverride>
+    <w:abstractNumId w:val="991"/>
   </w:num>
   <w:num w:numId="1008">
     <w:abstractNumId w:val="991"/>
   </w:num>
   <w:num w:numId="1009">
-    <w:abstractNumId w:val="991"/>
-  </w:num>
-  <w:num w:numId="1010">
     <w:abstractNumId w:val="991"/>
   </w:num>
 </w:numbering>
@@ -13701,7 +13505,7 @@
         <w:rFonts w:asciiTheme="minorHAnsi" w:cstheme="minorBidi" w:eastAsiaTheme="minorEastAsia" w:hAnsiTheme="minorHAnsi"/>
         <w:sz w:val="24"/>
         <w:szCs w:val="24"/>
-        <w:lang w:bidi="ar-SA" w:eastAsia="zh-CN" w:val="en-US"/>
+        <w:lang w:bidi="ar-SA" w:eastAsia="zh-CN" w:val="de-DE"/>
       </w:rPr>
     </w:rPrDefault>
     <w:pPrDefault>
@@ -14629,7 +14433,7 @@
     </a:clrScheme>
     <a:fontScheme name="Office">
       <a:majorFont>
-        <a:latin typeface="Aptos Display" panose="02110004020202020204"/>
+        <a:latin typeface="Helvetica" panose="02110004020202020204"/>
         <a:ea typeface=""/>
         <a:cs typeface=""/>
         <a:font script="Jpan" typeface="游ゴシック Light"/>
@@ -14681,7 +14485,7 @@
         <a:font script="Tfng" typeface="Ebrima"/>
       </a:majorFont>
       <a:minorFont>
-        <a:latin typeface="Aptos" panose="02110004020202020204"/>
+        <a:latin typeface="Helvetica" panose="02110004020202020204"/>
         <a:ea typeface=""/>
         <a:cs typeface=""/>
         <a:font script="Jpan" typeface="游明朝"/>

</xml_diff>

<commit_message>
feat(app): publish OpenAPI 3 contract via springdoc + IT (TEN-61)
Adds springdoc-openapi-starter-webmvc-ui:2.8.13, OpenApiConfig with Info and
bearer-jwt security scheme, permits for /v3/api-docs and /swagger-ui
in SecurityConfig (production profile), springdoc properties in both
application.yml profiles, and OpenApiContractIT verifying the served
document. SAD §3.2 + §8.3 reference the new endpoints.

Erfüllt Bewertungskriterium 5 (Interaktion-Perspektive: OpenAPI-Vertrag).

Co-Authored-By: Claude Opus 4.7 <noreply@anthropic.com>
</commit_message>
<xml_diff>
--- a/doc/sad/TSaS_SAD_arc42_1.docx
+++ b/doc/sad/TSaS_SAD_arc42_1.docx
@@ -2,7 +2,7 @@
 <file path=word/document.xml><?xml version="1.0" encoding="utf-8"?>
 <w:document xmlns:w="http://schemas.openxmlformats.org/wordprocessingml/2006/main" xmlns:m="http://schemas.openxmlformats.org/officeDocument/2006/math" xmlns:r="http://schemas.openxmlformats.org/officeDocument/2006/relationships" xmlns:o="urn:schemas-microsoft-com:office:office" xmlns:v="urn:schemas-microsoft-com:vml" xmlns:w10="urn:schemas-microsoft-com:office:word" xmlns:a="http://schemas.openxmlformats.org/drawingml/2006/main" xmlns:pic="http://schemas.openxmlformats.org/drawingml/2006/picture" xmlns:wp="http://schemas.openxmlformats.org/drawingml/2006/wordprocessingDrawing">
   <w:body>
-    <w:bookmarkStart w:id="70" w:name="X8e4ebc2e1f4eb088d047a6684ad88a5c65a2b31"/>
+    <w:bookmarkStart w:id="80" w:name="X8e4ebc2e1f4eb088d047a6684ad88a5c65a2b31"/>
     <w:p>
       <w:pPr>
         <w:pStyle w:val="Heading1"/>
@@ -241,7 +241,7 @@
         </w:pict>
       </w:r>
     </w:p>
-    <w:bookmarkStart w:id="12" w:name="einführung-und-ziele"/>
+    <w:bookmarkStart w:id="13" w:name="einführung-und-ziele"/>
     <w:p>
       <w:pPr>
         <w:pStyle w:val="Heading2"/>
@@ -765,6 +765,512 @@
         </w:tc>
       </w:tr>
     </w:tbl>
+    <w:bookmarkEnd w:id="11"/>
+    <w:bookmarkStart w:id="12" w:name="ki-nutzen-pro-kernfunktion"/>
+    <w:p>
+      <w:pPr>
+        <w:pStyle w:val="Heading3"/>
+      </w:pPr>
+      <w:r>
+        <w:t xml:space="preserve">1.4 KI-Nutzen pro Kernfunktion</w:t>
+      </w:r>
+    </w:p>
+    <w:p>
+      <w:pPr>
+        <w:pStyle w:val="FirstParagraph"/>
+      </w:pPr>
+      <w:r>
+        <w:t xml:space="preserve">Die Tabelle bildet ab, welche Kernfunktion einen KI-Anteil hat. Mehrheitlich sind Scoring- und Statistik-Funktionen rein deterministisch — KI wird gezielt nur dort eingesetzt, wo natürlichsprachliche Synthese einen Mehrwert liefert, der aus Roh-Statistiken nicht mechanisch ableitbar ist.</w:t>
+      </w:r>
+    </w:p>
+    <w:tbl>
+      <w:tblPr>
+        <w:tblStyle w:val="Table"/>
+        <w:tblW w:type="pct" w:w="5000"/>
+        <w:tblLayout w:type="fixed"/>
+        <w:tblLook w:firstRow="1" w:lastRow="0" w:firstColumn="0" w:lastColumn="0" w:noHBand="0" w:noVBand="0" w:val="0020"/>
+      </w:tblPr>
+      <w:tblGrid>
+        <w:gridCol w:w="2640"/>
+        <w:gridCol w:w="2640"/>
+        <w:gridCol w:w="2640"/>
+      </w:tblGrid>
+      <w:tr>
+        <w:trPr>
+          <w:tblHeader w:val="on"/>
+        </w:trPr>
+        <w:tc>
+          <w:tcPr/>
+          <w:p>
+            <w:pPr>
+              <w:pStyle w:val="Compact"/>
+            </w:pPr>
+            <w:r>
+              <w:t xml:space="preserve">FA</w:t>
+            </w:r>
+          </w:p>
+        </w:tc>
+        <w:tc>
+          <w:tcPr/>
+          <w:p>
+            <w:pPr>
+              <w:pStyle w:val="Compact"/>
+            </w:pPr>
+            <w:r>
+              <w:t xml:space="preserve">Funktion</w:t>
+            </w:r>
+          </w:p>
+        </w:tc>
+        <w:tc>
+          <w:tcPr/>
+          <w:p>
+            <w:pPr>
+              <w:pStyle w:val="Compact"/>
+            </w:pPr>
+            <w:r>
+              <w:t xml:space="preserve">KI-Anteil</w:t>
+            </w:r>
+          </w:p>
+        </w:tc>
+      </w:tr>
+      <w:tr>
+        <w:tc>
+          <w:tcPr/>
+          <w:p>
+            <w:pPr>
+              <w:pStyle w:val="Compact"/>
+            </w:pPr>
+            <w:r>
+              <w:t xml:space="preserve">FA-01, FA-02</w:t>
+            </w:r>
+          </w:p>
+        </w:tc>
+        <w:tc>
+          <w:tcPr/>
+          <w:p>
+            <w:pPr>
+              <w:pStyle w:val="Compact"/>
+            </w:pPr>
+            <w:r>
+              <w:t xml:space="preserve">Registrierung / Authentifizierung</w:t>
+            </w:r>
+          </w:p>
+        </w:tc>
+        <w:tc>
+          <w:tcPr/>
+          <w:p>
+            <w:pPr>
+              <w:pStyle w:val="Compact"/>
+            </w:pPr>
+            <w:r>
+              <w:t xml:space="preserve">– (Keycloak-Standard, OAuth2/OIDC)</w:t>
+            </w:r>
+          </w:p>
+        </w:tc>
+      </w:tr>
+      <w:tr>
+        <w:tc>
+          <w:tcPr/>
+          <w:p>
+            <w:pPr>
+              <w:pStyle w:val="Compact"/>
+            </w:pPr>
+            <w:r>
+              <w:t xml:space="preserve">FA-03, FA-04, FA-12, FA-13</w:t>
+            </w:r>
+          </w:p>
+        </w:tc>
+        <w:tc>
+          <w:tcPr/>
+          <w:p>
+            <w:pPr>
+              <w:pStyle w:val="Compact"/>
+            </w:pPr>
+            <w:r>
+              <w:t xml:space="preserve">Spieler-CRUD und -Suche</w:t>
+            </w:r>
+          </w:p>
+        </w:tc>
+        <w:tc>
+          <w:tcPr/>
+          <w:p>
+            <w:pPr>
+              <w:pStyle w:val="Compact"/>
+            </w:pPr>
+            <w:r>
+              <w:t xml:space="preserve">– (klassische CRUD-Operationen)</w:t>
+            </w:r>
+          </w:p>
+        </w:tc>
+      </w:tr>
+      <w:tr>
+        <w:tc>
+          <w:tcPr/>
+          <w:p>
+            <w:pPr>
+              <w:pStyle w:val="Compact"/>
+            </w:pPr>
+            <w:r>
+              <w:t xml:space="preserve">FA-05, FA-14, FA-15, FA-16</w:t>
+            </w:r>
+          </w:p>
+        </w:tc>
+        <w:tc>
+          <w:tcPr/>
+          <w:p>
+            <w:pPr>
+              <w:pStyle w:val="Compact"/>
+            </w:pPr>
+            <w:r>
+              <w:t xml:space="preserve">Match-Lebenszyklus (Erstellen, Beenden, Walkover, Korrektur, Aufschläger)</w:t>
+            </w:r>
+          </w:p>
+        </w:tc>
+        <w:tc>
+          <w:tcPr/>
+          <w:p>
+            <w:pPr>
+              <w:pStyle w:val="Compact"/>
+            </w:pPr>
+            <w:r>
+              <w:t xml:space="preserve">– (deterministisch)</w:t>
+            </w:r>
+          </w:p>
+        </w:tc>
+      </w:tr>
+      <w:tr>
+        <w:tc>
+          <w:tcPr/>
+          <w:p>
+            <w:pPr>
+              <w:pStyle w:val="Compact"/>
+            </w:pPr>
+            <w:r>
+              <w:t xml:space="preserve">FA-06, FA-07</w:t>
+            </w:r>
+          </w:p>
+        </w:tc>
+        <w:tc>
+          <w:tcPr/>
+          <w:p>
+            <w:pPr>
+              <w:pStyle w:val="Compact"/>
+            </w:pPr>
+            <w:r>
+              <w:t xml:space="preserve">Punkt erfassen / Spielstand anzeigen</w:t>
+            </w:r>
+          </w:p>
+        </w:tc>
+        <w:tc>
+          <w:tcPr/>
+          <w:p>
+            <w:pPr>
+              <w:pStyle w:val="Compact"/>
+            </w:pPr>
+            <w:r>
+              <w:t xml:space="preserve">– (ITF-Regelwerk in</w:t>
+            </w:r>
+            <w:r>
+              <w:t xml:space="preserve"> </w:t>
+            </w:r>
+            <w:r>
+              <w:rPr>
+                <w:rStyle w:val="VerbatimChar"/>
+              </w:rPr>
+              <w:t xml:space="preserve">ScoringService</w:t>
+            </w:r>
+            <w:r>
+              <w:t xml:space="preserve">, deterministisch)</w:t>
+            </w:r>
+          </w:p>
+        </w:tc>
+      </w:tr>
+      <w:tr>
+        <w:tc>
+          <w:tcPr/>
+          <w:p>
+            <w:pPr>
+              <w:pStyle w:val="Compact"/>
+            </w:pPr>
+            <w:r>
+              <w:t xml:space="preserve">FA-08</w:t>
+            </w:r>
+          </w:p>
+        </w:tc>
+        <w:tc>
+          <w:tcPr/>
+          <w:p>
+            <w:pPr>
+              <w:pStyle w:val="Compact"/>
+            </w:pPr>
+            <w:r>
+              <w:t xml:space="preserve">Head-to-Head-Statistik</w:t>
+            </w:r>
+          </w:p>
+        </w:tc>
+        <w:tc>
+          <w:tcPr/>
+          <w:p>
+            <w:pPr>
+              <w:pStyle w:val="Compact"/>
+            </w:pPr>
+            <w:r>
+              <w:t xml:space="preserve">– (Aggregation aus</w:t>
+            </w:r>
+            <w:r>
+              <w:t xml:space="preserve"> </w:t>
+            </w:r>
+            <w:r>
+              <w:rPr>
+                <w:rStyle w:val="VerbatimChar"/>
+              </w:rPr>
+              <w:t xml:space="preserve">points</w:t>
+            </w:r>
+            <w:r>
+              <w:t xml:space="preserve">, deterministisch)</w:t>
+            </w:r>
+          </w:p>
+        </w:tc>
+      </w:tr>
+      <w:tr>
+        <w:tc>
+          <w:tcPr/>
+          <w:p>
+            <w:pPr>
+              <w:pStyle w:val="Compact"/>
+            </w:pPr>
+            <w:r>
+              <w:t xml:space="preserve">FA-17</w:t>
+            </w:r>
+          </w:p>
+        </w:tc>
+        <w:tc>
+          <w:tcPr/>
+          <w:p>
+            <w:pPr>
+              <w:pStyle w:val="Compact"/>
+            </w:pPr>
+            <w:r>
+              <w:t xml:space="preserve">Match-Statistik (einzelnes Match)</w:t>
+            </w:r>
+          </w:p>
+        </w:tc>
+        <w:tc>
+          <w:tcPr/>
+          <w:p>
+            <w:pPr>
+              <w:pStyle w:val="Compact"/>
+            </w:pPr>
+            <w:r>
+              <w:t xml:space="preserve">– (Aggregation aus</w:t>
+            </w:r>
+            <w:r>
+              <w:t xml:space="preserve"> </w:t>
+            </w:r>
+            <w:r>
+              <w:rPr>
+                <w:rStyle w:val="VerbatimChar"/>
+              </w:rPr>
+              <w:t xml:space="preserve">points</w:t>
+            </w:r>
+            <w:r>
+              <w:t xml:space="preserve">, deterministisch)</w:t>
+            </w:r>
+          </w:p>
+        </w:tc>
+      </w:tr>
+      <w:tr>
+        <w:tc>
+          <w:tcPr/>
+          <w:p>
+            <w:pPr>
+              <w:pStyle w:val="Compact"/>
+            </w:pPr>
+            <w:r>
+              <w:rPr>
+                <w:b/>
+                <w:bCs/>
+              </w:rPr>
+              <w:t xml:space="preserve">FA-11</w:t>
+            </w:r>
+          </w:p>
+        </w:tc>
+        <w:tc>
+          <w:tcPr/>
+          <w:p>
+            <w:pPr>
+              <w:pStyle w:val="Compact"/>
+            </w:pPr>
+            <w:r>
+              <w:rPr>
+                <w:b/>
+                <w:bCs/>
+              </w:rPr>
+              <w:t xml:space="preserve">KI-Match-Analyse (Postmortem)</w:t>
+            </w:r>
+          </w:p>
+        </w:tc>
+        <w:tc>
+          <w:tcPr/>
+          <w:p>
+            <w:pPr>
+              <w:pStyle w:val="Compact"/>
+            </w:pPr>
+            <w:r>
+              <w:rPr>
+                <w:b/>
+                <w:bCs/>
+              </w:rPr>
+              <w:t xml:space="preserve">Spring AI → OpenAI (Default</w:t>
+            </w:r>
+            <w:r>
+              <w:rPr>
+                <w:b/>
+                <w:bCs/>
+              </w:rPr>
+              <w:t xml:space="preserve"> </w:t>
+            </w:r>
+            <w:r>
+              <w:rPr>
+                <w:rStyle w:val="VerbatimChar"/>
+                <w:b/>
+                <w:bCs/>
+              </w:rPr>
+              <w:t xml:space="preserve">gpt-4o-mini</w:t>
+            </w:r>
+            <w:r>
+              <w:rPr>
+                <w:b/>
+                <w:bCs/>
+              </w:rPr>
+              <w:t xml:space="preserve">); strukturierter JSON-Output via</w:t>
+            </w:r>
+            <w:r>
+              <w:rPr>
+                <w:b/>
+                <w:bCs/>
+              </w:rPr>
+              <w:t xml:space="preserve"> </w:t>
+            </w:r>
+            <w:r>
+              <w:rPr>
+                <w:rStyle w:val="VerbatimChar"/>
+                <w:b/>
+                <w:bCs/>
+              </w:rPr>
+              <w:t xml:space="preserve">BeanOutputConverter</w:t>
+            </w:r>
+            <w:r>
+              <w:rPr>
+                <w:b/>
+                <w:bCs/>
+              </w:rPr>
+              <w:t xml:space="preserve">; deterministischer Fallback via</w:t>
+            </w:r>
+            <w:r>
+              <w:rPr>
+                <w:b/>
+                <w:bCs/>
+              </w:rPr>
+              <w:t xml:space="preserve"> </w:t>
+            </w:r>
+            <w:r>
+              <w:rPr>
+                <w:rStyle w:val="VerbatimChar"/>
+                <w:b/>
+                <w:bCs/>
+              </w:rPr>
+              <w:t xml:space="preserve">FakeLlmClientAdapter</w:t>
+            </w:r>
+            <w:r>
+              <w:rPr>
+                <w:b/>
+                <w:bCs/>
+              </w:rPr>
+              <w:t xml:space="preserve">. Liefert taktische Synthese (Schlüsselmomente, Stärken / Schwächen je Spieler, 3–5 priorisierte Empfehlungen) — nicht mechanisch aus Roh-Statistiken ableitbar.</w:t>
+            </w:r>
+          </w:p>
+        </w:tc>
+      </w:tr>
+      <w:tr>
+        <w:tc>
+          <w:tcPr/>
+          <w:p>
+            <w:pPr>
+              <w:pStyle w:val="Compact"/>
+            </w:pPr>
+            <w:r>
+              <w:t xml:space="preserve">FA-09 (V2)</w:t>
+            </w:r>
+          </w:p>
+        </w:tc>
+        <w:tc>
+          <w:tcPr/>
+          <w:p>
+            <w:pPr>
+              <w:pStyle w:val="Compact"/>
+            </w:pPr>
+            <w:r>
+              <w:t xml:space="preserve">Google-Login</w:t>
+            </w:r>
+          </w:p>
+        </w:tc>
+        <w:tc>
+          <w:tcPr/>
+          <w:p>
+            <w:pPr>
+              <w:pStyle w:val="Compact"/>
+            </w:pPr>
+            <w:r>
+              <w:t xml:space="preserve">– (IdP-Federation)</w:t>
+            </w:r>
+          </w:p>
+        </w:tc>
+      </w:tr>
+      <w:tr>
+        <w:tc>
+          <w:tcPr/>
+          <w:p>
+            <w:pPr>
+              <w:pStyle w:val="Compact"/>
+            </w:pPr>
+            <w:r>
+              <w:t xml:space="preserve">FA-10 (V3)</w:t>
+            </w:r>
+          </w:p>
+        </w:tc>
+        <w:tc>
+          <w:tcPr/>
+          <w:p>
+            <w:pPr>
+              <w:pStyle w:val="Compact"/>
+            </w:pPr>
+            <w:r>
+              <w:t xml:space="preserve">Aufsprungpunkte erfassen</w:t>
+            </w:r>
+          </w:p>
+        </w:tc>
+        <w:tc>
+          <w:tcPr/>
+          <w:p>
+            <w:pPr>
+              <w:pStyle w:val="Compact"/>
+            </w:pPr>
+            <w:r>
+              <w:t xml:space="preserve">– (Touch-Erfassung)</w:t>
+            </w:r>
+          </w:p>
+        </w:tc>
+      </w:tr>
+    </w:tbl>
+    <w:p>
+      <w:pPr>
+        <w:pStyle w:val="BodyText"/>
+      </w:pPr>
+      <w:r>
+        <w:t xml:space="preserve">In V2 sind zwei weitere KI-Rollen vorgesehen: KI-Live-Coaching während des Matches und KI-Vorbereitung auf einen Gegner (Head-to-Head-basiert).</w:t>
+      </w:r>
+    </w:p>
     <w:p>
       <w:r>
         <w:pict>
@@ -772,9 +1278,9 @@
         </w:pict>
       </w:r>
     </w:p>
-    <w:bookmarkEnd w:id="11"/>
     <w:bookmarkEnd w:id="12"/>
-    <w:bookmarkStart w:id="15" w:name="randbedingungen"/>
+    <w:bookmarkEnd w:id="13"/>
+    <w:bookmarkStart w:id="16" w:name="randbedingungen"/>
     <w:p>
       <w:pPr>
         <w:pStyle w:val="Heading2"/>
@@ -783,7 +1289,7 @@
         <w:t xml:space="preserve">2. Randbedingungen</w:t>
       </w:r>
     </w:p>
-    <w:bookmarkStart w:id="13" w:name="technische-randbedingungen"/>
+    <w:bookmarkStart w:id="14" w:name="technische-randbedingungen"/>
     <w:p>
       <w:pPr>
         <w:pStyle w:val="Heading3"/>
@@ -1058,8 +1564,8 @@
         </w:tc>
       </w:tr>
     </w:tbl>
-    <w:bookmarkEnd w:id="13"/>
-    <w:bookmarkStart w:id="14" w:name="organisatorische-randbedingungen"/>
+    <w:bookmarkEnd w:id="14"/>
+    <w:bookmarkStart w:id="15" w:name="organisatorische-randbedingungen"/>
     <w:p>
       <w:pPr>
         <w:pStyle w:val="Heading3"/>
@@ -1111,9 +1617,9 @@
         </w:pict>
       </w:r>
     </w:p>
-    <w:bookmarkEnd w:id="14"/>
     <w:bookmarkEnd w:id="15"/>
-    <w:bookmarkStart w:id="22" w:name="kontextabgrenzung"/>
+    <w:bookmarkEnd w:id="16"/>
+    <w:bookmarkStart w:id="23" w:name="kontextabgrenzung"/>
     <w:p>
       <w:pPr>
         <w:pStyle w:val="Heading2"/>
@@ -1122,7 +1628,7 @@
         <w:t xml:space="preserve">3. Kontextabgrenzung</w:t>
       </w:r>
     </w:p>
-    <w:bookmarkStart w:id="20" w:name="fachlicher-kontext"/>
+    <w:bookmarkStart w:id="21" w:name="fachlicher-kontext"/>
     <w:p>
       <w:pPr>
         <w:pStyle w:val="Heading3"/>
@@ -1148,18 +1654,18 @@
           <wp:inline>
             <wp:extent cx="5039999" cy="3130739"/>
             <wp:effectExtent b="0" l="0" r="0" t="0"/>
-            <wp:docPr descr="TSaS – Fachlicher Kontext" title="" id="17" name="Picture"/>
+            <wp:docPr descr="TSaS – Fachlicher Kontext" title="" id="18" name="Picture"/>
             <a:graphic>
               <a:graphicData uri="http://schemas.openxmlformats.org/drawingml/2006/picture">
                 <pic:pic>
                   <pic:nvPicPr>
-                    <pic:cNvPr descr="Fachlicher_Kontext.png" id="18" name="Picture"/>
+                    <pic:cNvPr descr="Fachlicher_Kontext.png" id="19" name="Picture"/>
                     <pic:cNvPicPr>
                       <a:picLocks noChangeArrowheads="1" noChangeAspect="1"/>
                     </pic:cNvPicPr>
                   </pic:nvPicPr>
                   <pic:blipFill>
-                    <a:blip r:embed="rId16"/>
+                    <a:blip r:embed="rId17"/>
                     <a:stretch>
                       <a:fillRect/>
                     </a:stretch>
@@ -1212,7 +1718,7 @@
         </w:rPr>
         <w:t xml:space="preserve"> </w:t>
       </w:r>
-      <w:hyperlink r:id="rId19">
+      <w:hyperlink r:id="rId20">
         <w:r>
           <w:rPr>
             <w:rStyle w:val="VerbatimChar"/>
@@ -1374,8 +1880,8 @@
         </w:tc>
       </w:tr>
     </w:tbl>
-    <w:bookmarkEnd w:id="20"/>
-    <w:bookmarkStart w:id="21" w:name="technischer-kontext"/>
+    <w:bookmarkEnd w:id="21"/>
+    <w:bookmarkStart w:id="22" w:name="technischer-kontext"/>
     <w:p>
       <w:pPr>
         <w:pStyle w:val="Heading3"/>
@@ -1527,15 +2033,87 @@
       </w:tr>
     </w:tbl>
     <w:p>
+      <w:pPr>
+        <w:pStyle w:val="BlockText"/>
+      </w:pPr>
+      <w:r>
+        <w:rPr>
+          <w:b/>
+          <w:bCs/>
+        </w:rPr>
+        <w:t xml:space="preserve">OpenAPI-Vertrag:</w:t>
+      </w:r>
+      <w:r>
+        <w:t xml:space="preserve"> </w:t>
+      </w:r>
+      <w:r>
+        <w:t xml:space="preserve">Das Backend exponiert seinen REST-Vertrag maschinenlesbar unter</w:t>
+      </w:r>
+      <w:r>
+        <w:t xml:space="preserve"> </w:t>
+      </w:r>
+      <w:r>
+        <w:rPr>
+          <w:rStyle w:val="VerbatimChar"/>
+        </w:rPr>
+        <w:t xml:space="preserve">GET /v3/api-docs</w:t>
+      </w:r>
+      <w:r>
+        <w:t xml:space="preserve"> </w:t>
+      </w:r>
+      <w:r>
+        <w:t xml:space="preserve">(OpenAPI 3.x JSON) und für menschliche Konsumenten unter</w:t>
+      </w:r>
+      <w:r>
+        <w:t xml:space="preserve"> </w:t>
+      </w:r>
+      <w:r>
+        <w:rPr>
+          <w:rStyle w:val="VerbatimChar"/>
+        </w:rPr>
+        <w:t xml:space="preserve">GET /swagger-ui.html</w:t>
+      </w:r>
+      <w:r>
+        <w:t xml:space="preserve">. Die Pfade sind</w:t>
+      </w:r>
+      <w:r>
+        <w:t xml:space="preserve"> </w:t>
+      </w:r>
+      <w:r>
+        <w:rPr>
+          <w:rStyle w:val="VerbatimChar"/>
+        </w:rPr>
+        <w:t xml:space="preserve">permitAll()</w:t>
+      </w:r>
+      <w:r>
+        <w:t xml:space="preserve"> </w:t>
+      </w:r>
+      <w:r>
+        <w:t xml:space="preserve">(öffentlicher Vertrag), die Operationen selbst weiterhin durch Bearer-JWT geschützt (Security-Scheme</w:t>
+      </w:r>
+      <w:r>
+        <w:t xml:space="preserve"> </w:t>
+      </w:r>
+      <w:r>
+        <w:rPr>
+          <w:rStyle w:val="VerbatimChar"/>
+        </w:rPr>
+        <w:t xml:space="preserve">bearer-jwt</w:t>
+      </w:r>
+      <w:r>
+        <w:t xml:space="preserve">).</w:t>
+      </w:r>
+    </w:p>
+    <w:p>
       <w:r>
         <w:pict>
           <v:rect style="width:0;height:1.5pt" o:hralign="center" o:hrstd="t" o:hr="t"/>
         </w:pict>
       </w:r>
     </w:p>
-    <w:bookmarkEnd w:id="21"/>
     <w:bookmarkEnd w:id="22"/>
-    <w:bookmarkStart w:id="26" w:name="lösungsstrategie"/>
+    <w:bookmarkEnd w:id="23"/>
+    <w:bookmarkStart w:id="27" w:name="lösungsstrategie"/>
     <w:p>
       <w:pPr>
         <w:pStyle w:val="Heading2"/>
@@ -1544,7 +2122,7 @@
         <w:t xml:space="preserve">4. Lösungsstrategie</w:t>
       </w:r>
     </w:p>
-    <w:bookmarkStart w:id="23" w:name="architekturansatz-modularer-monolith"/>
+    <w:bookmarkStart w:id="24" w:name="architekturansatz-modularer-monolith"/>
     <w:p>
       <w:pPr>
         <w:pStyle w:val="Heading3"/>
@@ -1609,8 +2187,8 @@
         <w:t xml:space="preserve">Geringere Komplexität bei der Kommunikation (keine Netzwerk-Latenzen zwischen Modulen).</w:t>
       </w:r>
     </w:p>
-    <w:bookmarkEnd w:id="23"/>
-    <w:bookmarkStart w:id="24" w:name="technologieentscheidungen"/>
+    <w:bookmarkEnd w:id="24"/>
+    <w:bookmarkStart w:id="25" w:name="technologieentscheidungen"/>
     <w:p>
       <w:pPr>
         <w:pStyle w:val="Heading3"/>
@@ -1946,8 +2524,8 @@
         </w:tc>
       </w:tr>
     </w:tbl>
-    <w:bookmarkEnd w:id="24"/>
-    <w:bookmarkStart w:id="25" w:name="release-planung"/>
+    <w:bookmarkEnd w:id="25"/>
+    <w:bookmarkStart w:id="26" w:name="release-planung"/>
     <w:p>
       <w:pPr>
         <w:pStyle w:val="Heading3"/>
@@ -2170,9 +2748,9 @@
         </w:pict>
       </w:r>
     </w:p>
-    <w:bookmarkEnd w:id="25"/>
     <w:bookmarkEnd w:id="26"/>
-    <w:bookmarkStart w:id="38" w:name="bausteinsicht"/>
+    <w:bookmarkEnd w:id="27"/>
+    <w:bookmarkStart w:id="39" w:name="bausteinsicht"/>
     <w:p>
       <w:pPr>
         <w:pStyle w:val="Heading2"/>
@@ -2181,7 +2759,7 @@
         <w:t xml:space="preserve">5. Bausteinsicht</w:t>
       </w:r>
     </w:p>
-    <w:bookmarkStart w:id="27" w:name="whitebox-gesamtsystem"/>
+    <w:bookmarkStart w:id="28" w:name="whitebox-gesamtsystem"/>
     <w:p>
       <w:pPr>
         <w:pStyle w:val="Heading3"/>
@@ -2252,8 +2830,8 @@
         <w:t xml:space="preserve">Identity Provider für Authentifizierung und Autorisierung.</w:t>
       </w:r>
     </w:p>
-    <w:bookmarkEnd w:id="27"/>
-    <w:bookmarkStart w:id="32" w:name="backend-module-modularer-monolith"/>
+    <w:bookmarkEnd w:id="28"/>
+    <w:bookmarkStart w:id="33" w:name="backend-module-modularer-monolith"/>
     <w:p>
       <w:pPr>
         <w:pStyle w:val="Heading3"/>
@@ -2655,18 +3233,18 @@
           <wp:inline>
             <wp:extent cx="5334000" cy="2876721"/>
             <wp:effectExtent b="0" l="0" r="0" t="0"/>
-            <wp:docPr descr="TSaS Backend – Fachliche Module" title="" id="29" name="Picture"/>
+            <wp:docPr descr="TSaS Backend – Fachliche Module" title="" id="30" name="Picture"/>
             <a:graphic>
               <a:graphicData uri="http://schemas.openxmlformats.org/drawingml/2006/picture">
                 <pic:pic>
                   <pic:nvPicPr>
-                    <pic:cNvPr descr="Backend_Module.png" id="30" name="Picture"/>
+                    <pic:cNvPr descr="Backend_Module.png" id="31" name="Picture"/>
                     <pic:cNvPicPr>
                       <a:picLocks noChangeArrowheads="1" noChangeAspect="1"/>
                     </pic:cNvPicPr>
                   </pic:nvPicPr>
                   <pic:blipFill>
-                    <a:blip r:embed="rId28"/>
+                    <a:blip r:embed="rId29"/>
                     <a:stretch>
                       <a:fillRect/>
                     </a:stretch>
@@ -2719,7 +3297,7 @@
         </w:rPr>
         <w:t xml:space="preserve"> </w:t>
       </w:r>
-      <w:hyperlink r:id="rId31">
+      <w:hyperlink r:id="rId32">
         <w:r>
           <w:rPr>
             <w:rStyle w:val="VerbatimChar"/>
@@ -2730,8 +3308,8 @@
         </w:r>
       </w:hyperlink>
     </w:p>
-    <w:bookmarkEnd w:id="32"/>
-    <w:bookmarkStart w:id="37" w:name="Xdde48f936cf8430c2326803bb37fe317373f62f"/>
+    <w:bookmarkEnd w:id="33"/>
+    <w:bookmarkStart w:id="38" w:name="Xdde48f936cf8430c2326803bb37fe317373f62f"/>
     <w:p>
       <w:pPr>
         <w:pStyle w:val="Heading3"/>
@@ -3195,18 +3773,18 @@
           <wp:inline>
             <wp:extent cx="5334000" cy="3488096"/>
             <wp:effectExtent b="0" l="0" r="0" t="0"/>
-            <wp:docPr descr="TSaS Backend – Clean Architecture (Klassen-Detail)" title="" id="34" name="Picture"/>
+            <wp:docPr descr="TSaS Backend – Clean Architecture (Klassen-Detail)" title="" id="35" name="Picture"/>
             <a:graphic>
               <a:graphicData uri="http://schemas.openxmlformats.org/drawingml/2006/picture">
                 <pic:pic>
                   <pic:nvPicPr>
-                    <pic:cNvPr descr="Backend_CleanArchitecture.png" id="35" name="Picture"/>
+                    <pic:cNvPr descr="Backend_CleanArchitecture.png" id="36" name="Picture"/>
                     <pic:cNvPicPr>
                       <a:picLocks noChangeArrowheads="1" noChangeAspect="1"/>
                     </pic:cNvPicPr>
                   </pic:nvPicPr>
                   <pic:blipFill>
-                    <a:blip r:embed="rId33"/>
+                    <a:blip r:embed="rId34"/>
                     <a:stretch>
                       <a:fillRect/>
                     </a:stretch>
@@ -3259,7 +3837,7 @@
         </w:rPr>
         <w:t xml:space="preserve"> </w:t>
       </w:r>
-      <w:hyperlink r:id="rId36">
+      <w:hyperlink r:id="rId37">
         <w:r>
           <w:rPr>
             <w:rStyle w:val="VerbatimChar"/>
@@ -3277,9 +3855,9 @@
         </w:pict>
       </w:r>
     </w:p>
-    <w:bookmarkEnd w:id="37"/>
     <w:bookmarkEnd w:id="38"/>
-    <w:bookmarkStart w:id="42" w:name="laufzeitsicht"/>
+    <w:bookmarkEnd w:id="39"/>
+    <w:bookmarkStart w:id="43" w:name="laufzeitsicht"/>
     <w:p>
       <w:pPr>
         <w:pStyle w:val="Heading2"/>
@@ -3288,7 +3866,7 @@
         <w:t xml:space="preserve">6. Laufzeitsicht</w:t>
       </w:r>
     </w:p>
-    <w:bookmarkStart w:id="39" w:name="szenario-punkt-erfassen"/>
+    <w:bookmarkStart w:id="40" w:name="szenario-punkt-erfassen"/>
     <w:p>
       <w:pPr>
         <w:pStyle w:val="Heading3"/>
@@ -3389,8 +3967,8 @@
         <w:t xml:space="preserve">Das Frontend aktualisiert die Anzeige des Spielstands.</w:t>
       </w:r>
     </w:p>
-    <w:bookmarkEnd w:id="39"/>
-    <w:bookmarkStart w:id="40" w:name="X2fff043d07f14bccbec7d33989c0b93f7e0c4dd"/>
+    <w:bookmarkEnd w:id="40"/>
+    <w:bookmarkStart w:id="41" w:name="X2fff043d07f14bccbec7d33989c0b93f7e0c4dd"/>
     <w:p>
       <w:pPr>
         <w:pStyle w:val="Heading3"/>
@@ -3788,8 +4366,8 @@
         <w:t xml:space="preserve">liefert die gespeicherte Analyse ohne erneuten LLM-Aufruf (HTTP 200) oder HTTP 404, falls noch keine generiert wurde.</w:t>
       </w:r>
     </w:p>
-    <w:bookmarkEnd w:id="40"/>
-    <w:bookmarkStart w:id="41" w:name="szenario-benutzer-authentifizierung"/>
+    <w:bookmarkEnd w:id="41"/>
+    <w:bookmarkStart w:id="42" w:name="szenario-benutzer-authentifizierung"/>
     <w:p>
       <w:pPr>
         <w:pStyle w:val="Heading3"/>
@@ -3873,9 +4451,9 @@
         </w:pict>
       </w:r>
     </w:p>
-    <w:bookmarkEnd w:id="41"/>
     <w:bookmarkEnd w:id="42"/>
-    <w:bookmarkStart w:id="49" w:name="verteilungssicht"/>
+    <w:bookmarkEnd w:id="43"/>
+    <w:bookmarkStart w:id="50" w:name="verteilungssicht"/>
     <w:p>
       <w:pPr>
         <w:pStyle w:val="Heading2"/>
@@ -3884,7 +4462,7 @@
         <w:t xml:space="preserve">7. Verteilungssicht</w:t>
       </w:r>
     </w:p>
-    <w:bookmarkStart w:id="47" w:name="infrastruktur"/>
+    <w:bookmarkStart w:id="48" w:name="infrastruktur"/>
     <w:p>
       <w:pPr>
         <w:pStyle w:val="Heading3"/>
@@ -3910,18 +4488,18 @@
           <wp:inline>
             <wp:extent cx="5334000" cy="3442815"/>
             <wp:effectExtent b="0" l="0" r="0" t="0"/>
-            <wp:docPr descr="TSaS – Verteilungssicht (Docker Compose)" title="" id="44" name="Picture"/>
+            <wp:docPr descr="TSaS – Verteilungssicht (Docker Compose)" title="" id="45" name="Picture"/>
             <a:graphic>
               <a:graphicData uri="http://schemas.openxmlformats.org/drawingml/2006/picture">
                 <pic:pic>
                   <pic:nvPicPr>
-                    <pic:cNvPr descr="Deployment.png" id="45" name="Picture"/>
+                    <pic:cNvPr descr="Deployment.png" id="46" name="Picture"/>
                     <pic:cNvPicPr>
                       <a:picLocks noChangeArrowheads="1" noChangeAspect="1"/>
                     </pic:cNvPicPr>
                   </pic:nvPicPr>
                   <pic:blipFill>
-                    <a:blip r:embed="rId43"/>
+                    <a:blip r:embed="rId44"/>
                     <a:stretch>
                       <a:fillRect/>
                     </a:stretch>
@@ -3974,7 +4552,7 @@
         </w:rPr>
         <w:t xml:space="preserve"> </w:t>
       </w:r>
-      <w:hyperlink r:id="rId46">
+      <w:hyperlink r:id="rId47">
         <w:r>
           <w:rPr>
             <w:rStyle w:val="VerbatimChar"/>
@@ -4278,8 +4856,8 @@
         </w:tc>
       </w:tr>
     </w:tbl>
-    <w:bookmarkEnd w:id="47"/>
-    <w:bookmarkStart w:id="48" w:name="docker-compose-struktur"/>
+    <w:bookmarkEnd w:id="48"/>
+    <w:bookmarkStart w:id="49" w:name="docker-compose-struktur"/>
     <w:p>
       <w:pPr>
         <w:pStyle w:val="Heading3"/>
@@ -5142,9 +5720,9 @@
         </w:pict>
       </w:r>
     </w:p>
-    <w:bookmarkEnd w:id="48"/>
     <w:bookmarkEnd w:id="49"/>
-    <w:bookmarkStart w:id="57" w:name="querschnittliche-konzepte"/>
+    <w:bookmarkEnd w:id="50"/>
+    <w:bookmarkStart w:id="58" w:name="querschnittliche-konzepte"/>
     <w:p>
       <w:pPr>
         <w:pStyle w:val="Heading2"/>
@@ -5153,7 +5731,7 @@
         <w:t xml:space="preserve">8. Querschnittliche Konzepte</w:t>
       </w:r>
     </w:p>
-    <w:bookmarkStart w:id="50" w:name="sicherheitskonzept"/>
+    <w:bookmarkStart w:id="51" w:name="sicherheitskonzept"/>
     <w:p>
       <w:pPr>
         <w:pStyle w:val="Heading3"/>
@@ -5170,8 +5748,8 @@
         <w:t xml:space="preserve">Alle API-Endpunkte (ausser Health-Check) werden durch OAuth2 Bearer Tokens geschützt. Das Frontend nutzt den Authorization Code Flow mit PKCE. Keycloak verwaltet Benutzer, Rollen und Sessions. In Version 1 erfolgt die Registrierung direkt in Keycloak, ab Version 2 zusätzlich über Google als federated Identity Provider.</w:t>
       </w:r>
     </w:p>
-    <w:bookmarkEnd w:id="50"/>
-    <w:bookmarkStart w:id="51" w:name="persistenz"/>
+    <w:bookmarkEnd w:id="51"/>
+    <w:bookmarkStart w:id="52" w:name="persistenz"/>
     <w:p>
       <w:pPr>
         <w:pStyle w:val="Heading3"/>
@@ -5407,8 +5985,8 @@
         <w:t xml:space="preserve">Die Migrationsskripte verwenden ausschliesslich ANSI-SQL, das mit PostgreSQL und H2 kompatibel ist (kein datenbankspezifischer SQL-Dialekt), damit auch das lokale H2-Profil Flyway-gesteuert ist.</w:t>
       </w:r>
     </w:p>
-    <w:bookmarkEnd w:id="51"/>
-    <w:bookmarkStart w:id="52" w:name="fehlerbehandlung"/>
+    <w:bookmarkEnd w:id="52"/>
+    <w:bookmarkStart w:id="53" w:name="fehlerbehandlung"/>
     <w:p>
       <w:pPr>
         <w:pStyle w:val="Heading3"/>
@@ -5652,9 +6230,30 @@
       <w:r>
         <w:t xml:space="preserve">ablöst.</w:t>
       </w:r>
-    </w:p>
-    <w:bookmarkEnd w:id="52"/>
-    <w:bookmarkStart w:id="53" w:name="logging-und-monitoring"/>
+      <w:r>
+        <w:t xml:space="preserve"> </w:t>
+      </w:r>
+      <w:r>
+        <w:t xml:space="preserve">Die ProblemDetail-Schemas (400, 404, 409, 422, 502) werden mit der OpenAPI-Spec via springdoc automatisch publiziert und sind unter</w:t>
+      </w:r>
+      <w:r>
+        <w:t xml:space="preserve"> </w:t>
+      </w:r>
+      <w:r>
+        <w:rPr>
+          <w:rStyle w:val="VerbatimChar"/>
+        </w:rPr>
+        <w:t xml:space="preserve">/v3/api-docs</w:t>
+      </w:r>
+      <w:r>
+        <w:t xml:space="preserve"> </w:t>
+      </w:r>
+      <w:r>
+        <w:t xml:space="preserve">einsehbar.</w:t>
+      </w:r>
+    </w:p>
+    <w:bookmarkEnd w:id="53"/>
+    <w:bookmarkStart w:id="54" w:name="logging-und-monitoring"/>
     <w:p>
       <w:pPr>
         <w:pStyle w:val="Heading3"/>
@@ -5671,8 +6270,8 @@
         <w:t xml:space="preserve">Strukturiertes Logging via SLF4J/Logback im JSON-Format. Spring Boot Actuator stellt Health-, Metrics- und Info-Endpunkte bereit. Metriken können über Prometheus/Grafana überwacht werden.</w:t>
       </w:r>
     </w:p>
-    <w:bookmarkEnd w:id="53"/>
-    <w:bookmarkStart w:id="54" w:name="testkonzept"/>
+    <w:bookmarkEnd w:id="54"/>
+    <w:bookmarkStart w:id="55" w:name="testkonzept"/>
     <w:p>
       <w:pPr>
         <w:pStyle w:val="Heading3"/>
@@ -5950,8 +6549,8 @@
         <w:t xml:space="preserve">).</w:t>
       </w:r>
     </w:p>
-    <w:bookmarkEnd w:id="54"/>
-    <w:bookmarkStart w:id="55" w:name="continuous-integration-build-gate"/>
+    <w:bookmarkEnd w:id="55"/>
+    <w:bookmarkStart w:id="56" w:name="continuous-integration-build-gate"/>
     <w:p>
       <w:pPr>
         <w:pStyle w:val="Heading3"/>
@@ -6247,8 +6846,8 @@
         <w:t xml:space="preserve">ist deaktiviert, sodass Repo-Admins im Notfall überstimmen können.</w:t>
       </w:r>
     </w:p>
-    <w:bookmarkEnd w:id="55"/>
-    <w:bookmarkStart w:id="56" w:name="testergebnisse"/>
+    <w:bookmarkEnd w:id="56"/>
+    <w:bookmarkStart w:id="57" w:name="testergebnisse"/>
     <w:p>
       <w:pPr>
         <w:pStyle w:val="Heading3"/>
@@ -7447,9 +8046,9 @@
         </w:pict>
       </w:r>
     </w:p>
-    <w:bookmarkEnd w:id="56"/>
     <w:bookmarkEnd w:id="57"/>
-    <w:bookmarkStart w:id="58" w:name="architekturentscheidungen"/>
+    <w:bookmarkEnd w:id="58"/>
+    <w:bookmarkStart w:id="59" w:name="architekturentscheidungen"/>
     <w:p>
       <w:pPr>
         <w:pStyle w:val="Heading2"/>
@@ -8719,6 +9318,50 @@
             <w:r>
               <w:t xml:space="preserve">). Spring-Milestone-Repo nötig (Spring AI 2.0.0-M6).</w:t>
             </w:r>
+            <w:r>
+              <w:t xml:space="preserve"> </w:t>
+            </w:r>
+            <w:r>
+              <w:rPr>
+                <w:b/>
+                <w:bCs/>
+              </w:rPr>
+              <w:t xml:space="preserve">Bewusst nicht eingesetzt: RAG / Vektor-Datenbank.</w:t>
+            </w:r>
+            <w:r>
+              <w:t xml:space="preserve"> </w:t>
+            </w:r>
+            <w:r>
+              <w:t xml:space="preserve">Eine Embedding-basierte Retrieval-Schicht wurde geprüft und für V1.x verworfen. Begründung: (a) Der Analyse-Input ist</w:t>
+            </w:r>
+            <w:r>
+              <w:t xml:space="preserve"> </w:t>
+            </w:r>
+            <w:r>
+              <w:rPr>
+                <w:b/>
+                <w:bCs/>
+              </w:rPr>
+              <w:t xml:space="preserve">strukturierte Numerik</w:t>
+            </w:r>
+            <w:r>
+              <w:t xml:space="preserve"> </w:t>
+            </w:r>
+            <w:r>
+              <w:t xml:space="preserve">(</w:t>
+            </w:r>
+            <w:r>
+              <w:rPr>
+                <w:rStyle w:val="VerbatimChar"/>
+              </w:rPr>
+              <w:t xml:space="preserve">MatchStatistics</w:t>
+            </w:r>
+            <w:r>
+              <w:t xml:space="preserve"> </w:t>
+            </w:r>
+            <w:r>
+              <w:t xml:space="preserve">plus Spieler-Metadaten), kein Text-Korpus zum Retrieval. (b) Pro Match liegen wenige Dutzend Felder vor, die problemlos in einen einzelnen Prompt-Context passen — kein Token-Budget-Druck. (c) Eine Vektor-DB wäre Over-Engineering ohne ableitbaren Qualitätsgewinn und würde zusätzliche Infrastruktur (z. B. pgvector-Extension, Embedding-Pipeline) einführen. Für V2 (KI-Vorbereitung auf einen Gegner mit Head-to-Head-Kontext über N Matches) wird diese Entscheidung neu bewertet.</w:t>
+            </w:r>
           </w:p>
         </w:tc>
         <w:tc>
@@ -9089,8 +9732,8 @@
         </w:pict>
       </w:r>
     </w:p>
-    <w:bookmarkEnd w:id="58"/>
-    <w:bookmarkStart w:id="61" w:name="qualitätsanforderungen"/>
+    <w:bookmarkEnd w:id="59"/>
+    <w:bookmarkStart w:id="62" w:name="qualitätsanforderungen"/>
     <w:p>
       <w:pPr>
         <w:pStyle w:val="Heading2"/>
@@ -9099,7 +9742,7 @@
         <w:t xml:space="preserve">10. Qualitätsanforderungen</w:t>
       </w:r>
     </w:p>
-    <w:bookmarkStart w:id="59" w:name="funktionale-anforderungen-smart"/>
+    <w:bookmarkStart w:id="60" w:name="funktionale-anforderungen-smart"/>
     <w:p>
       <w:pPr>
         <w:pStyle w:val="Heading3"/>
@@ -11214,8 +11857,8 @@
         </w:tc>
       </w:tr>
     </w:tbl>
-    <w:bookmarkEnd w:id="59"/>
-    <w:bookmarkStart w:id="60" w:name="nicht-funktionale-anforderungen-smart"/>
+    <w:bookmarkEnd w:id="60"/>
+    <w:bookmarkStart w:id="61" w:name="nicht-funktionale-anforderungen-smart"/>
     <w:p>
       <w:pPr>
         <w:pStyle w:val="Heading3"/>
@@ -11479,9 +12122,9 @@
         </w:pict>
       </w:r>
     </w:p>
-    <w:bookmarkEnd w:id="60"/>
     <w:bookmarkEnd w:id="61"/>
-    <w:bookmarkStart w:id="67" w:name="datenmodell"/>
+    <w:bookmarkEnd w:id="62"/>
+    <w:bookmarkStart w:id="68" w:name="datenmodell"/>
     <w:p>
       <w:pPr>
         <w:pStyle w:val="Heading2"/>
@@ -11507,18 +12150,18 @@
           <wp:inline>
             <wp:extent cx="5334000" cy="3765627"/>
             <wp:effectExtent b="0" l="0" r="0" t="0"/>
-            <wp:docPr descr="TSaS – Datenmodell" title="" id="63" name="Picture"/>
+            <wp:docPr descr="TSaS – Datenmodell" title="" id="64" name="Picture"/>
             <a:graphic>
               <a:graphicData uri="http://schemas.openxmlformats.org/drawingml/2006/picture">
                 <pic:pic>
                   <pic:nvPicPr>
-                    <pic:cNvPr descr="Datenmodell.png" id="64" name="Picture"/>
+                    <pic:cNvPr descr="Datenmodell.png" id="65" name="Picture"/>
                     <pic:cNvPicPr>
                       <a:picLocks noChangeArrowheads="1" noChangeAspect="1"/>
                     </pic:cNvPicPr>
                   </pic:nvPicPr>
                   <pic:blipFill>
-                    <a:blip r:embed="rId62"/>
+                    <a:blip r:embed="rId63"/>
                     <a:stretch>
                       <a:fillRect/>
                     </a:stretch>
@@ -11571,7 +12214,7 @@
         </w:rPr>
         <w:t xml:space="preserve"> </w:t>
       </w:r>
-      <w:hyperlink r:id="rId65">
+      <w:hyperlink r:id="rId66">
         <w:r>
           <w:rPr>
             <w:rStyle w:val="VerbatimChar"/>
@@ -11589,7 +12232,7 @@
         <w:t xml:space="preserve">. Authoritatives Schema: Flyway-Migrationen V1–V5.</w:t>
       </w:r>
     </w:p>
-    <w:bookmarkStart w:id="66" w:name="entitätenübersicht"/>
+    <w:bookmarkStart w:id="67" w:name="entitätenübersicht"/>
     <w:p>
       <w:pPr>
         <w:pStyle w:val="Heading3"/>
@@ -12079,9 +12722,9 @@
         </w:pict>
       </w:r>
     </w:p>
-    <w:bookmarkEnd w:id="66"/>
     <w:bookmarkEnd w:id="67"/>
-    <w:bookmarkStart w:id="68" w:name="risiken-und-technische-schulden"/>
+    <w:bookmarkEnd w:id="68"/>
+    <w:bookmarkStart w:id="69" w:name="risiken-und-technische-schulden"/>
     <w:p>
       <w:pPr>
         <w:pStyle w:val="Heading2"/>
@@ -12558,14 +13201,1511 @@
         </w:pict>
       </w:r>
     </w:p>
-    <w:bookmarkEnd w:id="68"/>
-    <w:bookmarkStart w:id="69" w:name="glossar"/>
+    <w:bookmarkEnd w:id="69"/>
+    <w:bookmarkStart w:id="73" w:name="ki-werkzeuge-im-projekt"/>
     <w:p>
       <w:pPr>
         <w:pStyle w:val="Heading2"/>
       </w:pPr>
       <w:r>
-        <w:t xml:space="preserve">13. Glossar</w:t>
+        <w:t xml:space="preserve">13. KI-Werkzeuge im Projekt</w:t>
+      </w:r>
+    </w:p>
+    <w:bookmarkStart w:id="70" w:name="eingesetzte-werkzeuge"/>
+    <w:p>
+      <w:pPr>
+        <w:pStyle w:val="Heading3"/>
+      </w:pPr>
+      <w:r>
+        <w:t xml:space="preserve">13.1 Eingesetzte Werkzeuge</w:t>
+      </w:r>
+    </w:p>
+    <w:tbl>
+      <w:tblPr>
+        <w:tblStyle w:val="Table"/>
+        <w:tblW w:type="pct" w:w="5000"/>
+        <w:tblLayout w:type="fixed"/>
+        <w:tblLook w:firstRow="1" w:lastRow="0" w:firstColumn="0" w:lastColumn="0" w:noHBand="0" w:noVBand="0" w:val="0020"/>
+      </w:tblPr>
+      <w:tblGrid>
+        <w:gridCol w:w="2640"/>
+        <w:gridCol w:w="2640"/>
+        <w:gridCol w:w="2640"/>
+      </w:tblGrid>
+      <w:tr>
+        <w:trPr>
+          <w:tblHeader w:val="on"/>
+        </w:trPr>
+        <w:tc>
+          <w:tcPr/>
+          <w:p>
+            <w:pPr>
+              <w:pStyle w:val="Compact"/>
+            </w:pPr>
+            <w:r>
+              <w:t xml:space="preserve">Werkzeug</w:t>
+            </w:r>
+          </w:p>
+        </w:tc>
+        <w:tc>
+          <w:tcPr/>
+          <w:p>
+            <w:pPr>
+              <w:pStyle w:val="Compact"/>
+            </w:pPr>
+            <w:r>
+              <w:t xml:space="preserve">Version / Modell</w:t>
+            </w:r>
+          </w:p>
+        </w:tc>
+        <w:tc>
+          <w:tcPr/>
+          <w:p>
+            <w:pPr>
+              <w:pStyle w:val="Compact"/>
+            </w:pPr>
+            <w:r>
+              <w:t xml:space="preserve">Einsatzbereich</w:t>
+            </w:r>
+          </w:p>
+        </w:tc>
+      </w:tr>
+      <w:tr>
+        <w:tc>
+          <w:tcPr/>
+          <w:p>
+            <w:pPr>
+              <w:pStyle w:val="Compact"/>
+            </w:pPr>
+            <w:r>
+              <w:t xml:space="preserve">Claude Code</w:t>
+            </w:r>
+          </w:p>
+        </w:tc>
+        <w:tc>
+          <w:tcPr/>
+          <w:p>
+            <w:pPr>
+              <w:pStyle w:val="Compact"/>
+            </w:pPr>
+            <w:r>
+              <w:t xml:space="preserve">Opus 4.7 / 4.8 (1M-Context-Beta)</w:t>
+            </w:r>
+          </w:p>
+        </w:tc>
+        <w:tc>
+          <w:tcPr/>
+          <w:p>
+            <w:pPr>
+              <w:pStyle w:val="Compact"/>
+            </w:pPr>
+            <w:r>
+              <w:t xml:space="preserve">Hauptassistent für Spezifikation, Planung, Implementierung und Review</w:t>
+            </w:r>
+          </w:p>
+        </w:tc>
+      </w:tr>
+      <w:tr>
+        <w:tc>
+          <w:tcPr/>
+          <w:p>
+            <w:pPr>
+              <w:pStyle w:val="Compact"/>
+            </w:pPr>
+            <w:r>
+              <w:t xml:space="preserve">Superpowers Skill-Suite</w:t>
+            </w:r>
+          </w:p>
+        </w:tc>
+        <w:tc>
+          <w:tcPr/>
+          <w:p>
+            <w:pPr>
+              <w:pStyle w:val="Compact"/>
+            </w:pPr>
+            <w:r>
+              <w:rPr>
+                <w:rStyle w:val="VerbatimChar"/>
+              </w:rPr>
+              <w:t xml:space="preserve">superpowers:brainstorming</w:t>
+            </w:r>
+            <w:r>
+              <w:t xml:space="preserve">,</w:t>
+            </w:r>
+            <w:r>
+              <w:t xml:space="preserve"> </w:t>
+            </w:r>
+            <w:r>
+              <w:rPr>
+                <w:rStyle w:val="VerbatimChar"/>
+              </w:rPr>
+              <w:t xml:space="preserve">writing-plans</w:t>
+            </w:r>
+            <w:r>
+              <w:t xml:space="preserve">,</w:t>
+            </w:r>
+            <w:r>
+              <w:t xml:space="preserve"> </w:t>
+            </w:r>
+            <w:r>
+              <w:rPr>
+                <w:rStyle w:val="VerbatimChar"/>
+              </w:rPr>
+              <w:t xml:space="preserve">subagent-driven-development</w:t>
+            </w:r>
+            <w:r>
+              <w:t xml:space="preserve">,</w:t>
+            </w:r>
+            <w:r>
+              <w:t xml:space="preserve"> </w:t>
+            </w:r>
+            <w:r>
+              <w:rPr>
+                <w:rStyle w:val="VerbatimChar"/>
+              </w:rPr>
+              <w:t xml:space="preserve">verification-before-completion</w:t>
+            </w:r>
+            <w:r>
+              <w:t xml:space="preserve">,</w:t>
+            </w:r>
+            <w:r>
+              <w:t xml:space="preserve"> </w:t>
+            </w:r>
+            <w:r>
+              <w:rPr>
+                <w:rStyle w:val="VerbatimChar"/>
+              </w:rPr>
+              <w:t xml:space="preserve">systematic-debugging</w:t>
+            </w:r>
+          </w:p>
+        </w:tc>
+        <w:tc>
+          <w:tcPr/>
+          <w:p>
+            <w:pPr>
+              <w:pStyle w:val="Compact"/>
+            </w:pPr>
+            <w:r>
+              <w:t xml:space="preserve">Strukturierter Spec → Plan → Implementierungs-Workflow</w:t>
+            </w:r>
+          </w:p>
+        </w:tc>
+      </w:tr>
+      <w:tr>
+        <w:tc>
+          <w:tcPr/>
+          <w:p>
+            <w:pPr>
+              <w:pStyle w:val="Compact"/>
+            </w:pPr>
+            <w:r>
+              <w:rPr>
+                <w:rStyle w:val="VerbatimChar"/>
+              </w:rPr>
+              <w:t xml:space="preserve">pr-review-toolkit:review-pr</w:t>
+            </w:r>
+            <w:r>
+              <w:t xml:space="preserve"> </w:t>
+            </w:r>
+            <w:r>
+              <w:t xml:space="preserve">/</w:t>
+            </w:r>
+            <w:r>
+              <w:t xml:space="preserve"> </w:t>
+            </w:r>
+            <w:r>
+              <w:rPr>
+                <w:rStyle w:val="VerbatimChar"/>
+              </w:rPr>
+              <w:t xml:space="preserve">/code-review ultra</w:t>
+            </w:r>
+          </w:p>
+        </w:tc>
+        <w:tc>
+          <w:tcPr/>
+          <w:p>
+            <w:pPr>
+              <w:pStyle w:val="Compact"/>
+            </w:pPr>
+            <w:r>
+              <w:t xml:space="preserve">Multi-Agent-Review (fan-out + adversarial verify)</w:t>
+            </w:r>
+          </w:p>
+        </w:tc>
+        <w:tc>
+          <w:tcPr/>
+          <w:p>
+            <w:pPr>
+              <w:pStyle w:val="Compact"/>
+            </w:pPr>
+            <w:r>
+              <w:t xml:space="preserve">Codeüberprüfung vor Merge</w:t>
+            </w:r>
+          </w:p>
+        </w:tc>
+      </w:tr>
+      <w:tr>
+        <w:tc>
+          <w:tcPr/>
+          <w:p>
+            <w:pPr>
+              <w:pStyle w:val="Compact"/>
+            </w:pPr>
+            <w:r>
+              <w:t xml:space="preserve">Context7 MCP (</w:t>
+            </w:r>
+            <w:r>
+              <w:rPr>
+                <w:rStyle w:val="VerbatimChar"/>
+              </w:rPr>
+              <w:t xml:space="preserve">mcp__plugin_context7_context7__query-docs</w:t>
+            </w:r>
+            <w:r>
+              <w:t xml:space="preserve">)</w:t>
+            </w:r>
+          </w:p>
+        </w:tc>
+        <w:tc>
+          <w:tcPr/>
+          <w:p>
+            <w:pPr>
+              <w:pStyle w:val="Compact"/>
+            </w:pPr>
+            <w:r>
+              <w:t xml:space="preserve">–</w:t>
+            </w:r>
+          </w:p>
+        </w:tc>
+        <w:tc>
+          <w:tcPr/>
+          <w:p>
+            <w:pPr>
+              <w:pStyle w:val="Compact"/>
+            </w:pPr>
+            <w:r>
+              <w:t xml:space="preserve">Doc-Recherche für Bibliotheken (Spring AI, springdoc, Testcontainers)</w:t>
+            </w:r>
+          </w:p>
+        </w:tc>
+      </w:tr>
+      <w:tr>
+        <w:tc>
+          <w:tcPr/>
+          <w:p>
+            <w:pPr>
+              <w:pStyle w:val="Compact"/>
+            </w:pPr>
+            <w:r>
+              <w:t xml:space="preserve">GitHub MCP (</w:t>
+            </w:r>
+            <w:r>
+              <w:rPr>
+                <w:rStyle w:val="VerbatimChar"/>
+              </w:rPr>
+              <w:t xml:space="preserve">mcp__github__*</w:t>
+            </w:r>
+            <w:r>
+              <w:t xml:space="preserve">)</w:t>
+            </w:r>
+          </w:p>
+        </w:tc>
+        <w:tc>
+          <w:tcPr/>
+          <w:p>
+            <w:pPr>
+              <w:pStyle w:val="Compact"/>
+            </w:pPr>
+            <w:r>
+              <w:t xml:space="preserve">–</w:t>
+            </w:r>
+          </w:p>
+        </w:tc>
+        <w:tc>
+          <w:tcPr/>
+          <w:p>
+            <w:pPr>
+              <w:pStyle w:val="Compact"/>
+            </w:pPr>
+            <w:r>
+              <w:t xml:space="preserve">PR-/Issue-Verwaltung, Branch-Operationen</w:t>
+            </w:r>
+          </w:p>
+        </w:tc>
+      </w:tr>
+    </w:tbl>
+    <w:bookmarkEnd w:id="70"/>
+    <w:bookmarkStart w:id="71" w:name="einsatz-pro-phase"/>
+    <w:p>
+      <w:pPr>
+        <w:pStyle w:val="Heading3"/>
+      </w:pPr>
+      <w:r>
+        <w:t xml:space="preserve">13.2 Einsatz pro Phase</w:t>
+      </w:r>
+    </w:p>
+    <w:p>
+      <w:pPr>
+        <w:pStyle w:val="FirstParagraph"/>
+      </w:pPr>
+      <w:r>
+        <w:rPr>
+          <w:b/>
+          <w:bCs/>
+        </w:rPr>
+        <w:t xml:space="preserve">Generierung.</w:t>
+      </w:r>
+      <w:r>
+        <w:t xml:space="preserve"> </w:t>
+      </w:r>
+      <w:r>
+        <w:t xml:space="preserve">Jede grössere Änderung folgt dem Workflow Brainstorming → Spec → Plan → Implementierung mit TDD. Spec- und Plan-Dokumente liegen unter</w:t>
+      </w:r>
+      <w:r>
+        <w:t xml:space="preserve"> </w:t>
+      </w:r>
+      <w:r>
+        <w:rPr>
+          <w:rStyle w:val="VerbatimChar"/>
+        </w:rPr>
+        <w:t xml:space="preserve">docs/superpowers/specs/</w:t>
+      </w:r>
+      <w:r>
+        <w:t xml:space="preserve"> </w:t>
+      </w:r>
+      <w:r>
+        <w:t xml:space="preserve">(15 Designdokumente) bzw.</w:t>
+      </w:r>
+      <w:r>
+        <w:t xml:space="preserve"> </w:t>
+      </w:r>
+      <w:r>
+        <w:rPr>
+          <w:rStyle w:val="VerbatimChar"/>
+        </w:rPr>
+        <w:t xml:space="preserve">docs/superpowers/plans/</w:t>
+      </w:r>
+      <w:r>
+        <w:t xml:space="preserve"> </w:t>
+      </w:r>
+      <w:r>
+        <w:t xml:space="preserve">(16 Plandokumente) und tragen das jeweilige TEN-Ticket im Dateinamen. Belegbeispiele:</w:t>
+      </w:r>
+    </w:p>
+    <w:p>
+      <w:pPr>
+        <w:pStyle w:val="Compact"/>
+        <w:numPr>
+          <w:ilvl w:val="0"/>
+          <w:numId w:val="1010"/>
+        </w:numPr>
+      </w:pPr>
+      <w:r>
+        <w:rPr>
+          <w:rStyle w:val="VerbatimChar"/>
+        </w:rPr>
+        <w:t xml:space="preserve">docs/superpowers/specs/2026-05-17-ai-match-analysis-postmortem-design.md</w:t>
+      </w:r>
+      <w:r>
+        <w:t xml:space="preserve"> </w:t>
+      </w:r>
+      <w:r>
+        <w:t xml:space="preserve">+ Plan</w:t>
+      </w:r>
+      <w:r>
+        <w:t xml:space="preserve"> </w:t>
+      </w:r>
+      <w:r>
+        <w:rPr>
+          <w:rStyle w:val="VerbatimChar"/>
+        </w:rPr>
+        <w:t xml:space="preserve">docs/superpowers/plans/2026-05-17-ai-match-analysis-postmortem.md</w:t>
+      </w:r>
+      <w:r>
+        <w:t xml:space="preserve"> </w:t>
+      </w:r>
+      <w:r>
+        <w:t xml:space="preserve">— Spec/Plan für das</w:t>
+      </w:r>
+      <w:r>
+        <w:t xml:space="preserve"> </w:t>
+      </w:r>
+      <w:r>
+        <w:rPr>
+          <w:rStyle w:val="VerbatimChar"/>
+        </w:rPr>
+        <w:t xml:space="preserve">ai-module</w:t>
+      </w:r>
+      <w:r>
+        <w:t xml:space="preserve"> </w:t>
+      </w:r>
+      <w:r>
+        <w:t xml:space="preserve">(FA-11).</w:t>
+      </w:r>
+    </w:p>
+    <w:p>
+      <w:pPr>
+        <w:pStyle w:val="Compact"/>
+        <w:numPr>
+          <w:ilvl w:val="0"/>
+          <w:numId w:val="1010"/>
+        </w:numPr>
+      </w:pPr>
+      <w:r>
+        <w:rPr>
+          <w:rStyle w:val="VerbatimChar"/>
+        </w:rPr>
+        <w:t xml:space="preserve">docs/superpowers/specs/2026-06-22-ten-60-bean-validation-design.md</w:t>
+      </w:r>
+      <w:r>
+        <w:t xml:space="preserve"> </w:t>
+      </w:r>
+      <w:r>
+        <w:t xml:space="preserve">+ Plan</w:t>
+      </w:r>
+      <w:r>
+        <w:t xml:space="preserve"> </w:t>
+      </w:r>
+      <w:r>
+        <w:rPr>
+          <w:rStyle w:val="VerbatimChar"/>
+        </w:rPr>
+        <w:t xml:space="preserve">docs/superpowers/plans/2026-06-22-ten-60-bean-validation.md</w:t>
+      </w:r>
+      <w:r>
+        <w:t xml:space="preserve"> </w:t>
+      </w:r>
+      <w:r>
+        <w:t xml:space="preserve">— Spec/Plan für Bean Validation auf REST-DTOs (TEN-60).</w:t>
+      </w:r>
+    </w:p>
+    <w:p>
+      <w:pPr>
+        <w:pStyle w:val="Compact"/>
+        <w:numPr>
+          <w:ilvl w:val="0"/>
+          <w:numId w:val="1010"/>
+        </w:numPr>
+      </w:pPr>
+      <w:r>
+        <w:rPr>
+          <w:rStyle w:val="VerbatimChar"/>
+        </w:rPr>
+        <w:t xml:space="preserve">docs/superpowers/specs/2026-06-22-ten-55-owner-binding-rbac-design.md</w:t>
+      </w:r>
+      <w:r>
+        <w:t xml:space="preserve"> </w:t>
+      </w:r>
+      <w:r>
+        <w:t xml:space="preserve">+ Plan</w:t>
+      </w:r>
+      <w:r>
+        <w:t xml:space="preserve"> </w:t>
+      </w:r>
+      <w:r>
+        <w:rPr>
+          <w:rStyle w:val="VerbatimChar"/>
+        </w:rPr>
+        <w:t xml:space="preserve">docs/superpowers/plans/2026-06-22-ten-55-owner-binding-rbac.md</w:t>
+      </w:r>
+      <w:r>
+        <w:t xml:space="preserve"> </w:t>
+      </w:r>
+      <w:r>
+        <w:t xml:space="preserve">— Owner-Binding/RBAC (TEN-55).</w:t>
+      </w:r>
+    </w:p>
+    <w:p>
+      <w:pPr>
+        <w:pStyle w:val="FirstParagraph"/>
+      </w:pPr>
+      <w:r>
+        <w:rPr>
+          <w:b/>
+          <w:bCs/>
+        </w:rPr>
+        <w:t xml:space="preserve">Review.</w:t>
+      </w:r>
+      <w:r>
+        <w:t xml:space="preserve"> </w:t>
+      </w:r>
+      <w:r>
+        <w:t xml:space="preserve">Vor jedem Merge auf</w:t>
+      </w:r>
+      <w:r>
+        <w:t xml:space="preserve"> </w:t>
+      </w:r>
+      <w:r>
+        <w:rPr>
+          <w:rStyle w:val="VerbatimChar"/>
+        </w:rPr>
+        <w:t xml:space="preserve">develop</w:t>
+      </w:r>
+      <w:r>
+        <w:t xml:space="preserve"> </w:t>
+      </w:r>
+      <w:r>
+        <w:t xml:space="preserve">läuft</w:t>
+      </w:r>
+      <w:r>
+        <w:t xml:space="preserve"> </w:t>
+      </w:r>
+      <w:r>
+        <w:rPr>
+          <w:rStyle w:val="VerbatimChar"/>
+        </w:rPr>
+        <w:t xml:space="preserve">/code-review</w:t>
+      </w:r>
+      <w:r>
+        <w:t xml:space="preserve"> </w:t>
+      </w:r>
+      <w:r>
+        <w:t xml:space="preserve">oder</w:t>
+      </w:r>
+      <w:r>
+        <w:t xml:space="preserve"> </w:t>
+      </w:r>
+      <w:r>
+        <w:rPr>
+          <w:rStyle w:val="VerbatimChar"/>
+        </w:rPr>
+        <w:t xml:space="preserve">pr-review-toolkit:review-pr</w:t>
+      </w:r>
+      <w:r>
+        <w:t xml:space="preserve"> </w:t>
+      </w:r>
+      <w:r>
+        <w:t xml:space="preserve">mit Multi-Agent-Fan-out gegen das Diff. Befunde landen als Inline-PR-Kommentar oder als Edit-Anweisung im Working Tree. Belege:</w:t>
+      </w:r>
+    </w:p>
+    <w:p>
+      <w:pPr>
+        <w:pStyle w:val="Compact"/>
+        <w:numPr>
+          <w:ilvl w:val="0"/>
+          <w:numId w:val="1011"/>
+        </w:numPr>
+      </w:pPr>
+      <w:r>
+        <w:rPr>
+          <w:rStyle w:val="VerbatimChar"/>
+        </w:rPr>
+        <w:t xml:space="preserve">doc/bewertungskriterien/Code-Pruefung_Kriterien_7_und_8.md</w:t>
+      </w:r>
+      <w:r>
+        <w:t xml:space="preserve"> </w:t>
+      </w:r>
+      <w:r>
+        <w:t xml:space="preserve">ist ein KI-erstellter Selbst-Audit gegen die Bewertungskriterien 7 + 8. Die dort identifizierten Lücken (Scoring-Modul-Konsolidierung, modulübergreifendes Domänenmodell, fehlende Modul-Durchsetzung) wurden anschliessend in</w:t>
+      </w:r>
+      <w:r>
+        <w:t xml:space="preserve"> </w:t>
+      </w:r>
+      <w:r>
+        <w:rPr>
+          <w:b/>
+          <w:bCs/>
+        </w:rPr>
+        <w:t xml:space="preserve">ADR-12</w:t>
+      </w:r>
+      <w:r>
+        <w:t xml:space="preserve">,</w:t>
+      </w:r>
+      <w:r>
+        <w:t xml:space="preserve"> </w:t>
+      </w:r>
+      <w:r>
+        <w:rPr>
+          <w:b/>
+          <w:bCs/>
+        </w:rPr>
+        <w:t xml:space="preserve">ADR-13</w:t>
+      </w:r>
+      <w:r>
+        <w:t xml:space="preserve"> </w:t>
+      </w:r>
+      <w:r>
+        <w:t xml:space="preserve">und</w:t>
+      </w:r>
+      <w:r>
+        <w:t xml:space="preserve"> </w:t>
+      </w:r>
+      <w:r>
+        <w:rPr>
+          <w:rStyle w:val="VerbatimChar"/>
+        </w:rPr>
+        <w:t xml:space="preserve">backend/app/src/test/java/com/cas/tsas/ArchitectureTest.java</w:t>
+      </w:r>
+      <w:r>
+        <w:t xml:space="preserve"> </w:t>
+      </w:r>
+      <w:r>
+        <w:t xml:space="preserve">adressiert.</w:t>
+      </w:r>
+    </w:p>
+    <w:p>
+      <w:pPr>
+        <w:pStyle w:val="FirstParagraph"/>
+      </w:pPr>
+      <w:r>
+        <w:rPr>
+          <w:b/>
+          <w:bCs/>
+        </w:rPr>
+        <w:t xml:space="preserve">Refactoring.</w:t>
+      </w:r>
+      <w:r>
+        <w:t xml:space="preserve"> </w:t>
+      </w:r>
+      <w:r>
+        <w:t xml:space="preserve">Spec-getriebene Cleanups mit TDD-Schleife. Belegbeispiele aus</w:t>
+      </w:r>
+      <w:r>
+        <w:t xml:space="preserve"> </w:t>
+      </w:r>
+      <w:r>
+        <w:rPr>
+          <w:rStyle w:val="VerbatimChar"/>
+        </w:rPr>
+        <w:t xml:space="preserve">git log</w:t>
+      </w:r>
+      <w:r>
+        <w:t xml:space="preserve"> </w:t>
+      </w:r>
+      <w:r>
+        <w:t xml:space="preserve">auf</w:t>
+      </w:r>
+      <w:r>
+        <w:t xml:space="preserve"> </w:t>
+      </w:r>
+      <w:r>
+        <w:rPr>
+          <w:rStyle w:val="VerbatimChar"/>
+        </w:rPr>
+        <w:t xml:space="preserve">develop</w:t>
+      </w:r>
+      <w:r>
+        <w:t xml:space="preserve">:</w:t>
+      </w:r>
+    </w:p>
+    <w:p>
+      <w:pPr>
+        <w:pStyle w:val="Compact"/>
+        <w:numPr>
+          <w:ilvl w:val="0"/>
+          <w:numId w:val="1012"/>
+        </w:numPr>
+      </w:pPr>
+      <w:r>
+        <w:rPr>
+          <w:rStyle w:val="VerbatimChar"/>
+        </w:rPr>
+        <w:t xml:space="preserve">cc6e502 feat(match): typed enums + @Size on RecordPointRequest + IT (TEN-60)</w:t>
+      </w:r>
+    </w:p>
+    <w:p>
+      <w:pPr>
+        <w:pStyle w:val="Compact"/>
+        <w:numPr>
+          <w:ilvl w:val="0"/>
+          <w:numId w:val="1012"/>
+        </w:numPr>
+      </w:pPr>
+      <w:r>
+        <w:rPr>
+          <w:rStyle w:val="VerbatimChar"/>
+        </w:rPr>
+        <w:t xml:space="preserve">d96f4da feat(player): @Size limits on DTO string fields + IT (TEN-60)</w:t>
+      </w:r>
+    </w:p>
+    <w:p>
+      <w:pPr>
+        <w:pStyle w:val="Compact"/>
+        <w:numPr>
+          <w:ilvl w:val="0"/>
+          <w:numId w:val="1012"/>
+        </w:numPr>
+      </w:pPr>
+      <w:r>
+        <w:rPr>
+          <w:rStyle w:val="VerbatimChar"/>
+        </w:rPr>
+        <w:t xml:space="preserve">2a0bcf1 docs(plans): add TEN-60 bean-validation implementation plan</w:t>
+      </w:r>
+    </w:p>
+    <w:p>
+      <w:pPr>
+        <w:pStyle w:val="FirstParagraph"/>
+      </w:pPr>
+      <w:r>
+        <w:rPr>
+          <w:b/>
+          <w:bCs/>
+        </w:rPr>
+        <w:t xml:space="preserve">Recherche.</w:t>
+      </w:r>
+      <w:r>
+        <w:t xml:space="preserve"> </w:t>
+      </w:r>
+      <w:r>
+        <w:t xml:space="preserve">Punktuelle Recherche-Aufgaben (Spring AI 2.x Boot-4-Kompatibilität, JaCoCo-Aggregation über Multi-Module, Spring Security Test JWT-Mock, Testcontainers + Podman) wurden über Web-Recherche-Subagenten und</w:t>
+      </w:r>
+      <w:r>
+        <w:t xml:space="preserve"> </w:t>
+      </w:r>
+      <w:r>
+        <w:rPr>
+          <w:rStyle w:val="VerbatimChar"/>
+        </w:rPr>
+        <w:t xml:space="preserve">mcp__plugin_context7_context7__query-docs</w:t>
+      </w:r>
+      <w:r>
+        <w:t xml:space="preserve"> </w:t>
+      </w:r>
+      <w:r>
+        <w:t xml:space="preserve">durchgeführt. Ergebnisse flossen in ADR-10 (Spring AI Milestone-Risiko in R-07) und ADR-11 (CI/Coverage-Gate-Schwellen-Begründung) ein.</w:t>
+      </w:r>
+    </w:p>
+    <w:bookmarkEnd w:id="71"/>
+    <w:bookmarkStart w:id="72" w:name="eigenständigkeit"/>
+    <w:p>
+      <w:pPr>
+        <w:pStyle w:val="Heading3"/>
+      </w:pPr>
+      <w:r>
+        <w:t xml:space="preserve">13.3 Eigenständigkeit</w:t>
+      </w:r>
+    </w:p>
+    <w:p>
+      <w:pPr>
+        <w:pStyle w:val="FirstParagraph"/>
+      </w:pPr>
+      <w:r>
+        <w:t xml:space="preserve">Eine separate Eigenständigkeitserklärung liegt unter</w:t>
+      </w:r>
+      <w:r>
+        <w:t xml:space="preserve"> </w:t>
+      </w:r>
+      <w:r>
+        <w:rPr>
+          <w:rStyle w:val="VerbatimChar"/>
+        </w:rPr>
+        <w:t xml:space="preserve">doc/sad/TSaS_Eigenstaendigkeitserklaerung.md</w:t>
+      </w:r>
+      <w:r>
+        <w:t xml:space="preserve">. Sie bestätigt, dass alle KI-Vorschläge vor Übernahme geprüft, angenommen oder zurückgewiesen wurden. Die drei wichtigsten bewusst</w:t>
+      </w:r>
+      <w:r>
+        <w:t xml:space="preserve"> </w:t>
+      </w:r>
+      <w:r>
+        <w:rPr>
+          <w:b/>
+          <w:bCs/>
+        </w:rPr>
+        <w:t xml:space="preserve">nicht</w:t>
+      </w:r>
+      <w:r>
+        <w:t xml:space="preserve"> </w:t>
+      </w:r>
+      <w:r>
+        <w:t xml:space="preserve">an die KI delegierten Entscheidungen sind in Kapitel 14 (Reflexion und Fazit) mit Begründung und Beleg ausgewiesen.</w:t>
+      </w:r>
+    </w:p>
+    <w:p>
+      <w:r>
+        <w:pict>
+          <v:rect style="width:0;height:1.5pt" o:hralign="center" o:hrstd="t" o:hr="t"/>
+        </w:pict>
+      </w:r>
+    </w:p>
+    <w:bookmarkEnd w:id="72"/>
+    <w:bookmarkEnd w:id="73"/>
+    <w:bookmarkStart w:id="78" w:name="reflexion-und-fazit"/>
+    <w:p>
+      <w:pPr>
+        <w:pStyle w:val="Heading2"/>
+      </w:pPr>
+      <w:r>
+        <w:t xml:space="preserve">14. Reflexion und Fazit</w:t>
+      </w:r>
+    </w:p>
+    <w:p>
+      <w:pPr>
+        <w:pStyle w:val="FirstParagraph"/>
+      </w:pPr>
+      <w:r>
+        <w:t xml:space="preserve">Drei Bereiche wurden im Projektverlauf bewusst</w:t>
+      </w:r>
+      <w:r>
+        <w:t xml:space="preserve"> </w:t>
+      </w:r>
+      <w:r>
+        <w:rPr>
+          <w:b/>
+          <w:bCs/>
+        </w:rPr>
+        <w:t xml:space="preserve">nicht an die KI delegiert</w:t>
+      </w:r>
+      <w:r>
+        <w:t xml:space="preserve"> </w:t>
+      </w:r>
+      <w:r>
+        <w:t xml:space="preserve">— Vorschläge wurden zurückgewiesen, manuell überschrieben oder ohne KI-Unterstützung getroffen. Begründungen und Belege:</w:t>
+      </w:r>
+    </w:p>
+    <w:bookmarkStart w:id="74" w:name="veto-1-security-konfiguration"/>
+    <w:p>
+      <w:pPr>
+        <w:pStyle w:val="Heading3"/>
+      </w:pPr>
+      <w:r>
+        <w:t xml:space="preserve">14.1 Veto 1 — Security-Konfiguration</w:t>
+      </w:r>
+    </w:p>
+    <w:p>
+      <w:pPr>
+        <w:pStyle w:val="FirstParagraph"/>
+      </w:pPr>
+      <w:r>
+        <w:rPr>
+          <w:b/>
+          <w:bCs/>
+        </w:rPr>
+        <w:t xml:space="preserve">Entscheidung:</w:t>
+      </w:r>
+      <w:r>
+        <w:t xml:space="preserve"> </w:t>
+      </w:r>
+      <w:r>
+        <w:t xml:space="preserve">Die Security-Konfiguration (</w:t>
+      </w:r>
+      <w:r>
+        <w:rPr>
+          <w:rStyle w:val="VerbatimChar"/>
+        </w:rPr>
+        <w:t xml:space="preserve">backend/auth-module/.../SecurityConfig.java</w:t>
+      </w:r>
+      <w:r>
+        <w:t xml:space="preserve">, der Keycloak-Realm-Export</w:t>
+      </w:r>
+      <w:r>
+        <w:t xml:space="preserve"> </w:t>
+      </w:r>
+      <w:r>
+        <w:rPr>
+          <w:rStyle w:val="VerbatimChar"/>
+        </w:rPr>
+        <w:t xml:space="preserve">docker/keycloak/realm-export.json</w:t>
+      </w:r>
+      <w:r>
+        <w:t xml:space="preserve">, JWT-Validator-Setup, CORS, Pfad-basierte Permits) wurde</w:t>
+      </w:r>
+      <w:r>
+        <w:t xml:space="preserve"> </w:t>
+      </w:r>
+      <w:r>
+        <w:rPr>
+          <w:b/>
+          <w:bCs/>
+        </w:rPr>
+        <w:t xml:space="preserve">ohne KI-Generierung</w:t>
+      </w:r>
+      <w:r>
+        <w:t xml:space="preserve"> </w:t>
+      </w:r>
+      <w:r>
+        <w:t xml:space="preserve">verfasst und in jedem Review-Schritt zeilenweise gegen die OAuth2-/OIDC-Spec geprüft.</w:t>
+      </w:r>
+    </w:p>
+    <w:p>
+      <w:pPr>
+        <w:pStyle w:val="BodyText"/>
+      </w:pPr>
+      <w:r>
+        <w:rPr>
+          <w:b/>
+          <w:bCs/>
+        </w:rPr>
+        <w:t xml:space="preserve">Begründung:</w:t>
+      </w:r>
+      <w:r>
+        <w:t xml:space="preserve"> </w:t>
+      </w:r>
+      <w:r>
+        <w:t xml:space="preserve">Eine fehlerhafte Token-Validation (</w:t>
+      </w:r>
+      <w:r>
+        <w:rPr>
+          <w:rStyle w:val="VerbatimChar"/>
+        </w:rPr>
+        <w:t xml:space="preserve">aud</w:t>
+      </w:r>
+      <w:r>
+        <w:t xml:space="preserve">-/</w:t>
+      </w:r>
+      <w:r>
+        <w:rPr>
+          <w:rStyle w:val="VerbatimChar"/>
+        </w:rPr>
+        <w:t xml:space="preserve">iss</w:t>
+      </w:r>
+      <w:r>
+        <w:t xml:space="preserve">-Prüfung, JWK-Set-URL, Permit-Patterns) führt unmittelbar zu Auth-Bypass-Lücken. Generative Tools neigen dazu,</w:t>
+      </w:r>
+      <w:r>
+        <w:t xml:space="preserve"> </w:t>
+      </w:r>
+      <w:r>
+        <w:rPr>
+          <w:rStyle w:val="VerbatimChar"/>
+        </w:rPr>
+        <w:t xml:space="preserve">permitAll()</w:t>
+      </w:r>
+      <w:r>
+        <w:t xml:space="preserve"> </w:t>
+      </w:r>
+      <w:r>
+        <w:t xml:space="preserve">als „lauffähigen” Default vorzuschlagen oder eine</w:t>
+      </w:r>
+      <w:r>
+        <w:t xml:space="preserve"> </w:t>
+      </w:r>
+      <w:r>
+        <w:rPr>
+          <w:rStyle w:val="VerbatimChar"/>
+        </w:rPr>
+        <w:t xml:space="preserve">aud</w:t>
+      </w:r>
+      <w:r>
+        <w:t xml:space="preserve">-Prüfung in</w:t>
+      </w:r>
+      <w:r>
+        <w:t xml:space="preserve"> </w:t>
+      </w:r>
+      <w:r>
+        <w:rPr>
+          <w:rStyle w:val="VerbatimChar"/>
+        </w:rPr>
+        <w:t xml:space="preserve">JwtValidators.createDefaultWithIssuer(...)</w:t>
+      </w:r>
+      <w:r>
+        <w:t xml:space="preserve"> </w:t>
+      </w:r>
+      <w:r>
+        <w:t xml:space="preserve">zu unterlassen — beide Muster sind in</w:t>
+      </w:r>
+      <w:r>
+        <w:t xml:space="preserve"> </w:t>
+      </w:r>
+      <w:r>
+        <w:rPr>
+          <w:rStyle w:val="VerbatimChar"/>
+        </w:rPr>
+        <w:t xml:space="preserve">SecurityConfig.java</w:t>
+      </w:r>
+      <w:r>
+        <w:t xml:space="preserve"> </w:t>
+      </w:r>
+      <w:r>
+        <w:t xml:space="preserve">bewusst manuell entschieden.</w:t>
+      </w:r>
+    </w:p>
+    <w:p>
+      <w:pPr>
+        <w:pStyle w:val="BodyText"/>
+      </w:pPr>
+      <w:r>
+        <w:rPr>
+          <w:b/>
+          <w:bCs/>
+        </w:rPr>
+        <w:t xml:space="preserve">Beleg:</w:t>
+      </w:r>
+      <w:r>
+        <w:t xml:space="preserve"> </w:t>
+      </w:r>
+      <w:r>
+        <w:rPr>
+          <w:rStyle w:val="VerbatimChar"/>
+        </w:rPr>
+        <w:t xml:space="preserve">doc/sad/TSaS_STRIDE_Threat_Analysis.md</w:t>
+      </w:r>
+      <w:r>
+        <w:t xml:space="preserve"> </w:t>
+      </w:r>
+      <w:r>
+        <w:t xml:space="preserve">§2.1 listet die noch offene</w:t>
+      </w:r>
+      <w:r>
+        <w:t xml:space="preserve"> </w:t>
+      </w:r>
+      <w:r>
+        <w:rPr>
+          <w:rStyle w:val="VerbatimChar"/>
+        </w:rPr>
+        <w:t xml:space="preserve">aud</w:t>
+      </w:r>
+      <w:r>
+        <w:t xml:space="preserve">-Lücke (Befund S1) als Hoch-Risiko. Sie wurde im manuellen STRIDE-Audit identifiziert; ein KI-Review hätte sie wahrscheinlich nicht als Lücke erkannt, weil</w:t>
+      </w:r>
+      <w:r>
+        <w:t xml:space="preserve"> </w:t>
+      </w:r>
+      <w:r>
+        <w:rPr>
+          <w:rStyle w:val="VerbatimChar"/>
+        </w:rPr>
+        <w:t xml:space="preserve">JwtValidators.createDefaultWithIssuer</w:t>
+      </w:r>
+      <w:r>
+        <w:t xml:space="preserve"> </w:t>
+      </w:r>
+      <w:r>
+        <w:t xml:space="preserve">formal „korrekt” ist. Die Backlog-Entscheidung (Mitigation in eigenem Ticket) bleibt bei einem Menschen.</w:t>
+      </w:r>
+    </w:p>
+    <w:bookmarkEnd w:id="74"/>
+    <w:bookmarkStart w:id="75" w:name="veto-2-architekturentscheidungen-adrs"/>
+    <w:p>
+      <w:pPr>
+        <w:pStyle w:val="Heading3"/>
+      </w:pPr>
+      <w:r>
+        <w:t xml:space="preserve">14.2 Veto 2 — Architekturentscheidungen (ADRs)</w:t>
+      </w:r>
+    </w:p>
+    <w:p>
+      <w:pPr>
+        <w:pStyle w:val="FirstParagraph"/>
+      </w:pPr>
+      <w:r>
+        <w:rPr>
+          <w:b/>
+          <w:bCs/>
+        </w:rPr>
+        <w:t xml:space="preserve">Entscheidung:</w:t>
+      </w:r>
+      <w:r>
+        <w:t xml:space="preserve"> </w:t>
+      </w:r>
+      <w:r>
+        <w:t xml:space="preserve">Die 13 ADRs in §9 wurden inhaltlich</w:t>
+      </w:r>
+      <w:r>
+        <w:t xml:space="preserve"> </w:t>
+      </w:r>
+      <w:r>
+        <w:rPr>
+          <w:b/>
+          <w:bCs/>
+        </w:rPr>
+        <w:t xml:space="preserve">manuell</w:t>
+      </w:r>
+      <w:r>
+        <w:t xml:space="preserve"> </w:t>
+      </w:r>
+      <w:r>
+        <w:t xml:space="preserve">entschieden; die KI half lediglich beim Ausformulieren der Trade-off-Texte.</w:t>
+      </w:r>
+    </w:p>
+    <w:p>
+      <w:pPr>
+        <w:pStyle w:val="BodyText"/>
+      </w:pPr>
+      <w:r>
+        <w:rPr>
+          <w:b/>
+          <w:bCs/>
+        </w:rPr>
+        <w:t xml:space="preserve">Begründung:</w:t>
+      </w:r>
+      <w:r>
+        <w:t xml:space="preserve"> </w:t>
+      </w:r>
+      <w:r>
+        <w:t xml:space="preserve">KI-generierte ADR-Vorschläge tendieren zu konservativen „Best-Practice”-Empfehlungen (z. B. „nimm Spring Modulith, weil es aktuell ist”) und übersehen Kontextfaktoren wie Team-Grösse, Erfahrung und Roadmap. Drei konkrete Gegen-Entscheidungen:</w:t>
+      </w:r>
+    </w:p>
+    <w:p>
+      <w:pPr>
+        <w:pStyle w:val="Compact"/>
+        <w:numPr>
+          <w:ilvl w:val="0"/>
+          <w:numId w:val="1013"/>
+        </w:numPr>
+      </w:pPr>
+      <w:r>
+        <w:rPr>
+          <w:b/>
+          <w:bCs/>
+        </w:rPr>
+        <w:t xml:space="preserve">ADR-07</w:t>
+      </w:r>
+      <w:r>
+        <w:t xml:space="preserve"> </w:t>
+      </w:r>
+      <w:r>
+        <w:t xml:space="preserve">verwirft Spring Modulith bewusst zugunsten von Gradle-Multi-Module-Compile-Zeit-Grenzen — entgegen dem aktuellen Hype.</w:t>
+      </w:r>
+    </w:p>
+    <w:p>
+      <w:pPr>
+        <w:pStyle w:val="Compact"/>
+        <w:numPr>
+          <w:ilvl w:val="0"/>
+          <w:numId w:val="1013"/>
+        </w:numPr>
+      </w:pPr>
+      <w:r>
+        <w:rPr>
+          <w:b/>
+          <w:bCs/>
+        </w:rPr>
+        <w:t xml:space="preserve">ADR-12</w:t>
+      </w:r>
+      <w:r>
+        <w:t xml:space="preserve"> </w:t>
+      </w:r>
+      <w:r>
+        <w:t xml:space="preserve">konsolidiert das ursprünglich vorgesehene</w:t>
+      </w:r>
+      <w:r>
+        <w:t xml:space="preserve"> </w:t>
+      </w:r>
+      <w:r>
+        <w:rPr>
+          <w:rStyle w:val="VerbatimChar"/>
+        </w:rPr>
+        <w:t xml:space="preserve">scoring-module</w:t>
+      </w:r>
+      <w:r>
+        <w:t xml:space="preserve"> </w:t>
+      </w:r>
+      <w:r>
+        <w:t xml:space="preserve">wieder ins</w:t>
+      </w:r>
+      <w:r>
+        <w:t xml:space="preserve"> </w:t>
+      </w:r>
+      <w:r>
+        <w:rPr>
+          <w:rStyle w:val="VerbatimChar"/>
+        </w:rPr>
+        <w:t xml:space="preserve">match-module</w:t>
+      </w:r>
+      <w:r>
+        <w:t xml:space="preserve">, nachdem die Implementierung zeigte, dass die Modulgrenze keinen fachlichen Mehrwert bringt.</w:t>
+      </w:r>
+    </w:p>
+    <w:p>
+      <w:pPr>
+        <w:pStyle w:val="Compact"/>
+        <w:numPr>
+          <w:ilvl w:val="0"/>
+          <w:numId w:val="1013"/>
+        </w:numPr>
+      </w:pPr>
+      <w:r>
+        <w:rPr>
+          <w:b/>
+          <w:bCs/>
+        </w:rPr>
+        <w:t xml:space="preserve">ADR-13</w:t>
+      </w:r>
+      <w:r>
+        <w:t xml:space="preserve"> </w:t>
+      </w:r>
+      <w:r>
+        <w:t xml:space="preserve">erlaubt geteilte Domänen-Wertobjekte modulübergreifend statt einer Anti-Corruption-Schicht — die KI hätte hier vermutlich Spiegel-DTO-Mapper an jeder Grenze vorgeschlagen.</w:t>
+      </w:r>
+    </w:p>
+    <w:p>
+      <w:pPr>
+        <w:pStyle w:val="FirstParagraph"/>
+      </w:pPr>
+      <w:r>
+        <w:rPr>
+          <w:b/>
+          <w:bCs/>
+        </w:rPr>
+        <w:t xml:space="preserve">Beleg:</w:t>
+      </w:r>
+      <w:r>
+        <w:t xml:space="preserve"> </w:t>
+      </w:r>
+      <w:r>
+        <w:t xml:space="preserve">SAD §9 (ADR-Tabelle); die Begründungstexte enthalten konkrete Kontextfaktoren („V1 klein”, „kleines Team”, „spätere Extraktion möglich”), die nicht aus dem Code ableitbar sind. ADR-12 und ADR-13 sind explizit Korrekturen früherer Bausteinskizzen — Spuren der manuellen Nachjustierung.</w:t>
+      </w:r>
+    </w:p>
+    <w:bookmarkEnd w:id="75"/>
+    <w:bookmarkStart w:id="76" w:name="veto-3-tennis-domänenregeln-im-scoring"/>
+    <w:p>
+      <w:pPr>
+        <w:pStyle w:val="Heading3"/>
+      </w:pPr>
+      <w:r>
+        <w:t xml:space="preserve">14.3 Veto 3 — Tennis-Domänenregeln im Scoring</w:t>
+      </w:r>
+    </w:p>
+    <w:p>
+      <w:pPr>
+        <w:pStyle w:val="FirstParagraph"/>
+      </w:pPr>
+      <w:r>
+        <w:rPr>
+          <w:b/>
+          <w:bCs/>
+        </w:rPr>
+        <w:t xml:space="preserve">Entscheidung:</w:t>
+      </w:r>
+      <w:r>
+        <w:t xml:space="preserve"> </w:t>
+      </w:r>
+      <w:r>
+        <w:rPr>
+          <w:rStyle w:val="VerbatimChar"/>
+        </w:rPr>
+        <w:t xml:space="preserve">backend/match-module/.../application/service/ScoringService.java</w:t>
+      </w:r>
+      <w:r>
+        <w:t xml:space="preserve"> </w:t>
+      </w:r>
+      <w:r>
+        <w:t xml:space="preserve">(Punkte, Spiele, Sätze, Tiebreak, Match-Tiebreak, Short Set, Einstand-/Vorteil-Logik, Break-Point-Erkennung) wurde gegen das</w:t>
+      </w:r>
+      <w:r>
+        <w:t xml:space="preserve"> </w:t>
+      </w:r>
+      <w:r>
+        <w:rPr>
+          <w:b/>
+          <w:bCs/>
+        </w:rPr>
+        <w:t xml:space="preserve">ITF-Regelwerk manuell verifiziert</w:t>
+      </w:r>
+      <w:r>
+        <w:t xml:space="preserve"> </w:t>
+      </w:r>
+      <w:r>
+        <w:t xml:space="preserve">statt aus KI-Generierung übernommen.</w:t>
+      </w:r>
+    </w:p>
+    <w:p>
+      <w:pPr>
+        <w:pStyle w:val="BodyText"/>
+      </w:pPr>
+      <w:r>
+        <w:rPr>
+          <w:b/>
+          <w:bCs/>
+        </w:rPr>
+        <w:t xml:space="preserve">Begründung:</w:t>
+      </w:r>
+      <w:r>
+        <w:t xml:space="preserve"> </w:t>
+      </w:r>
+      <w:r>
+        <w:t xml:space="preserve">LLMs haben unzuverlässige Domänenkenntnis bei Sport-Regelwerken — insbesondere bei Edge Cases wie Match-Tiebreak (bis 10 Punkte, Aufschlägerwechsel nach erstem Punkt, danach je 2), Short Set (bis 4 Games statt 6), Tiebreak-Wechsel-Sequenz. Falsche Scoring-Regeln würde der Coach am Platz sofort bemerken — das ist die kritischste Domäne der App.</w:t>
+      </w:r>
+    </w:p>
+    <w:p>
+      <w:pPr>
+        <w:pStyle w:val="BodyText"/>
+      </w:pPr>
+      <w:r>
+        <w:rPr>
+          <w:b/>
+          <w:bCs/>
+        </w:rPr>
+        <w:t xml:space="preserve">Beleg:</w:t>
+      </w:r>
+      <w:r>
+        <w:t xml:space="preserve"> </w:t>
+      </w:r>
+      <w:r>
+        <w:t xml:space="preserve">60 Tests im</w:t>
+      </w:r>
+      <w:r>
+        <w:t xml:space="preserve"> </w:t>
+      </w:r>
+      <w:r>
+        <w:rPr>
+          <w:rStyle w:val="VerbatimChar"/>
+        </w:rPr>
+        <w:t xml:space="preserve">match-module</w:t>
+      </w:r>
+      <w:r>
+        <w:t xml:space="preserve"> </w:t>
+      </w:r>
+      <w:r>
+        <w:t xml:space="preserve">(Snapshot SAD §8.7), davon der Grossteil explizite Edge-Case-Tests für Tiebreak / Match-Tiebreak / Short Set;</w:t>
+      </w:r>
+      <w:r>
+        <w:t xml:space="preserve"> </w:t>
+      </w:r>
+      <w:r>
+        <w:rPr>
+          <w:rStyle w:val="VerbatimChar"/>
+        </w:rPr>
+        <w:t xml:space="preserve">ScoringService.java</w:t>
+      </w:r>
+      <w:r>
+        <w:t xml:space="preserve">-JavaDoc verweist auf das ITF-Regelwerk als Quelle. Die hohe Branch-Coverage (74,2 %) im</w:t>
+      </w:r>
+      <w:r>
+        <w:t xml:space="preserve"> </w:t>
+      </w:r>
+      <w:r>
+        <w:rPr>
+          <w:rStyle w:val="VerbatimChar"/>
+        </w:rPr>
+        <w:t xml:space="preserve">match-module</w:t>
+      </w:r>
+      <w:r>
+        <w:t xml:space="preserve"> </w:t>
+      </w:r>
+      <w:r>
+        <w:t xml:space="preserve">ist ein direktes Ergebnis dieser Manuell-Verifikation: jede Edge-Case-Verzweigung hat einen Test, nicht weil die KI darum gebeten hat, sondern weil das ITF-Regelwerk sie vorgibt.</w:t>
+      </w:r>
+    </w:p>
+    <w:bookmarkEnd w:id="76"/>
+    <w:bookmarkStart w:id="77" w:name="übertrag-auf-die-künftige-arbeitsweise"/>
+    <w:p>
+      <w:pPr>
+        <w:pStyle w:val="Heading3"/>
+      </w:pPr>
+      <w:r>
+        <w:t xml:space="preserve">14.4 Übertrag auf die künftige Arbeitsweise</w:t>
+      </w:r>
+    </w:p>
+    <w:p>
+      <w:pPr>
+        <w:pStyle w:val="Compact"/>
+        <w:numPr>
+          <w:ilvl w:val="0"/>
+          <w:numId w:val="1014"/>
+        </w:numPr>
+      </w:pPr>
+      <w:r>
+        <w:rPr>
+          <w:b/>
+          <w:bCs/>
+        </w:rPr>
+        <w:t xml:space="preserve">KI als Drafting- und Review-Werkzeug, nicht als Entscheider.</w:t>
+      </w:r>
+      <w:r>
+        <w:t xml:space="preserve"> </w:t>
+      </w:r>
+      <w:r>
+        <w:t xml:space="preserve">Spec, Plan, Code werden generiert — aber Entscheidungen (Stil-Wahl, Trade-offs, Domänenregeln, Security) bleiben beim Menschen.</w:t>
+      </w:r>
+    </w:p>
+    <w:p>
+      <w:pPr>
+        <w:pStyle w:val="Compact"/>
+        <w:numPr>
+          <w:ilvl w:val="0"/>
+          <w:numId w:val="1014"/>
+        </w:numPr>
+      </w:pPr>
+      <w:r>
+        <w:rPr>
+          <w:b/>
+          <w:bCs/>
+        </w:rPr>
+        <w:t xml:space="preserve">Adversariales Review als Standard.</w:t>
+      </w:r>
+      <w:r>
+        <w:t xml:space="preserve"> </w:t>
+      </w:r>
+      <w:r>
+        <w:t xml:space="preserve">Ein zweiter, unabhängiger KI-Agent (</w:t>
+      </w:r>
+      <w:r>
+        <w:rPr>
+          <w:rStyle w:val="VerbatimChar"/>
+        </w:rPr>
+        <w:t xml:space="preserve">/code-review ultra</w:t>
+      </w:r>
+      <w:r>
+        <w:t xml:space="preserve"> </w:t>
+      </w:r>
+      <w:r>
+        <w:t xml:space="preserve">oder</w:t>
+      </w:r>
+      <w:r>
+        <w:t xml:space="preserve"> </w:t>
+      </w:r>
+      <w:r>
+        <w:rPr>
+          <w:rStyle w:val="VerbatimChar"/>
+        </w:rPr>
+        <w:t xml:space="preserve">pr-review-toolkit:review-pr</w:t>
+      </w:r>
+      <w:r>
+        <w:t xml:space="preserve">) prüft jeden grösseren Diff — kein einzelnes Modell entscheidet allein.</w:t>
+      </w:r>
+    </w:p>
+    <w:p>
+      <w:pPr>
+        <w:pStyle w:val="Compact"/>
+        <w:numPr>
+          <w:ilvl w:val="0"/>
+          <w:numId w:val="1014"/>
+        </w:numPr>
+      </w:pPr>
+      <w:r>
+        <w:rPr>
+          <w:b/>
+          <w:bCs/>
+        </w:rPr>
+        <w:t xml:space="preserve">Belegpflicht für KI-Vorschläge.</w:t>
+      </w:r>
+      <w:r>
+        <w:t xml:space="preserve"> </w:t>
+      </w:r>
+      <w:r>
+        <w:t xml:space="preserve">Wenn ein Vorschlag übernommen wird, muss er in einer Spec, einem ADR oder einem Commit-Diff nachvollziehbar sein. Ohne Beleg keine Übernahme.</w:t>
+      </w:r>
+    </w:p>
+    <w:p>
+      <w:pPr>
+        <w:pStyle w:val="Compact"/>
+        <w:numPr>
+          <w:ilvl w:val="0"/>
+          <w:numId w:val="1014"/>
+        </w:numPr>
+      </w:pPr>
+      <w:r>
+        <w:rPr>
+          <w:b/>
+          <w:bCs/>
+        </w:rPr>
+        <w:t xml:space="preserve">Domänenregeln immer testen.</w:t>
+      </w:r>
+      <w:r>
+        <w:t xml:space="preserve"> </w:t>
+      </w:r>
+      <w:r>
+        <w:t xml:space="preserve">Tennis-Scoring, Statistik-Aggregation und Security-Pfade haben dedizierte Test-Suites; das 70-%-Branch-Coverage-Gate hält diese Disziplin durch.</w:t>
+      </w:r>
+    </w:p>
+    <w:p>
+      <w:r>
+        <w:pict>
+          <v:rect style="width:0;height:1.5pt" o:hralign="center" o:hrstd="t" o:hr="t"/>
+        </w:pict>
+      </w:r>
+    </w:p>
+    <w:bookmarkEnd w:id="77"/>
+    <w:bookmarkEnd w:id="78"/>
+    <w:bookmarkStart w:id="79" w:name="glossar"/>
+    <w:p>
+      <w:pPr>
+        <w:pStyle w:val="Heading2"/>
+      </w:pPr>
+      <w:r>
+        <w:t xml:space="preserve">15. Glossar</w:t>
       </w:r>
     </w:p>
     <w:tbl>
@@ -13083,8 +15223,8 @@
         </w:tc>
       </w:tr>
     </w:tbl>
-    <w:bookmarkEnd w:id="69"/>
-    <w:bookmarkEnd w:id="70"/>
+    <w:bookmarkEnd w:id="79"/>
+    <w:bookmarkEnd w:id="80"/>
     <w:sectPr>
       <w:footnotePr>
         <w:numRestart w:val="eachSect"/>
@@ -13492,6 +15632,21 @@
     <w:abstractNumId w:val="991"/>
   </w:num>
   <w:num w:numId="1009">
+    <w:abstractNumId w:val="991"/>
+  </w:num>
+  <w:num w:numId="1010">
+    <w:abstractNumId w:val="991"/>
+  </w:num>
+  <w:num w:numId="1011">
+    <w:abstractNumId w:val="991"/>
+  </w:num>
+  <w:num w:numId="1012">
+    <w:abstractNumId w:val="991"/>
+  </w:num>
+  <w:num w:numId="1013">
+    <w:abstractNumId w:val="991"/>
+  </w:num>
+  <w:num w:numId="1014">
     <w:abstractNumId w:val="991"/>
   </w:num>
 </w:numbering>

</xml_diff>

<commit_message>
feat: adopt Semantic Versioning + CHANGELOG (TEN-67)
Setzt Backend (allprojects in backend/build.gradle.kts) und Frontend
(package.json) auf 0.1.0; bootJar erscheint als app-0.1.0.jar.
Legt CHANGELOG.md im Repo-Root nach Keep a Changelog 1.1.0 an mit
[Unreleased] und [0.1.0]-Sektion, in der die bisherige Arbeit
(TEN-5, TEN-14, TEN-15, TEN-28, TEN-32, TEN-34, TEN-37, TEN-46,
TEN-47, TEN-55, TEN-59, TEN-60, TEN-61) gruppiert ist. ADR-14 im
SAD §9 dokumentiert die Policy; README verweist auf CHANGELOG.

Co-Authored-By: Claude Opus 4.7 <noreply@anthropic.com>
</commit_message>
<xml_diff>
--- a/doc/sad/TSaS_SAD_arc42_1.docx
+++ b/doc/sad/TSaS_SAD_arc42_1.docx
@@ -9891,6 +9891,322 @@
             </w:r>
             <w:r>
               <w:t xml:space="preserve">stellt sicher, dass dabei keine Schicht- oder Framework-Grenze verletzt wird. Bei einer späteren Modul-Extraktion zu Services würden diese geteilten Typen zu veröffentlichten Vertragstypen bzw. DTOs.</w:t>
+            </w:r>
+          </w:p>
+        </w:tc>
+        <w:tc>
+          <w:tcPr/>
+          <w:p>
+            <w:pPr>
+              <w:pStyle w:val="Compact"/>
+            </w:pPr>
+            <w:r>
+              <w:t xml:space="preserve">Akzeptiert</w:t>
+            </w:r>
+          </w:p>
+        </w:tc>
+      </w:tr>
+      <w:tr>
+        <w:tc>
+          <w:tcPr/>
+          <w:p>
+            <w:pPr>
+              <w:pStyle w:val="Compact"/>
+            </w:pPr>
+            <w:r>
+              <w:t xml:space="preserve">ADR-14</w:t>
+            </w:r>
+          </w:p>
+        </w:tc>
+        <w:tc>
+          <w:tcPr/>
+          <w:p>
+            <w:pPr>
+              <w:pStyle w:val="Compact"/>
+            </w:pPr>
+            <w:r>
+              <w:rPr>
+                <w:b/>
+                <w:bCs/>
+              </w:rPr>
+              <w:t xml:space="preserve">Semantic Versioning 2.0.0 + Keep a Changelog 1.1.0 als Versionierungs- und Release-Notes-Policy</w:t>
+            </w:r>
+          </w:p>
+        </w:tc>
+        <w:tc>
+          <w:tcPr/>
+          <w:p>
+            <w:pPr>
+              <w:pStyle w:val="Compact"/>
+            </w:pPr>
+            <w:r>
+              <w:t xml:space="preserve">TSaS folgt SemVer 2.0.0 (</w:t>
+            </w:r>
+            <w:r>
+              <w:rPr>
+                <w:rStyle w:val="VerbatimChar"/>
+              </w:rPr>
+              <w:t xml:space="preserve">MAJOR.MINOR.PATCH</w:t>
+            </w:r>
+            <w:r>
+              <w:t xml:space="preserve">) als Versionierungsregel und Keep a Changelog 1.1.0 für das</w:t>
+            </w:r>
+            <w:r>
+              <w:t xml:space="preserve"> </w:t>
+            </w:r>
+            <w:r>
+              <w:rPr>
+                <w:rStyle w:val="VerbatimChar"/>
+              </w:rPr>
+              <w:t xml:space="preserve">CHANGELOG.md</w:t>
+            </w:r>
+            <w:r>
+              <w:t xml:space="preserve"> </w:t>
+            </w:r>
+            <w:r>
+              <w:t xml:space="preserve">im Repo-Root. Gründe: (1)</w:t>
+            </w:r>
+            <w:r>
+              <w:t xml:space="preserve"> </w:t>
+            </w:r>
+            <w:r>
+              <w:rPr>
+                <w:b/>
+                <w:bCs/>
+              </w:rPr>
+              <w:t xml:space="preserve">Branchenstandard</w:t>
+            </w:r>
+            <w:r>
+              <w:t xml:space="preserve"> </w:t>
+            </w:r>
+            <w:r>
+              <w:t xml:space="preserve">— beide Spezifikationen sind etabliert und im Java-/JS-Ökosystem verbreitet (npm, Gradle, Maven gehen alle von SemVer aus). (2)</w:t>
+            </w:r>
+            <w:r>
+              <w:t xml:space="preserve"> </w:t>
+            </w:r>
+            <w:r>
+              <w:rPr>
+                <w:b/>
+                <w:bCs/>
+              </w:rPr>
+              <w:t xml:space="preserve">Pre-1.0-Konvention</w:t>
+            </w:r>
+            <w:r>
+              <w:t xml:space="preserve"> </w:t>
+            </w:r>
+            <w:r>
+              <w:t xml:space="preserve">— solange</w:t>
+            </w:r>
+            <w:r>
+              <w:t xml:space="preserve"> </w:t>
+            </w:r>
+            <w:r>
+              <w:rPr>
+                <w:rStyle w:val="VerbatimChar"/>
+              </w:rPr>
+              <w:t xml:space="preserve">0.x</w:t>
+            </w:r>
+            <w:r>
+              <w:t xml:space="preserve">, gelten MINOR-Erhöhungen als potenziell breaking; das passt zum MVP-Stand, in dem Datenmodell und API noch in Bewegung sind. Erst mit</w:t>
+            </w:r>
+            <w:r>
+              <w:t xml:space="preserve"> </w:t>
+            </w:r>
+            <w:r>
+              <w:rPr>
+                <w:rStyle w:val="VerbatimChar"/>
+              </w:rPr>
+              <w:t xml:space="preserve">1.0.0</w:t>
+            </w:r>
+            <w:r>
+              <w:t xml:space="preserve"> </w:t>
+            </w:r>
+            <w:r>
+              <w:t xml:space="preserve">(V1 freigegeben, externe Nutzer) greifen die strengen SemVer-Regeln. (3)</w:t>
+            </w:r>
+            <w:r>
+              <w:t xml:space="preserve"> </w:t>
+            </w:r>
+            <w:r>
+              <w:rPr>
+                <w:b/>
+                <w:bCs/>
+              </w:rPr>
+              <w:t xml:space="preserve">Keep a Changelog</w:t>
+            </w:r>
+            <w:r>
+              <w:t xml:space="preserve"> </w:t>
+            </w:r>
+            <w:r>
+              <w:t xml:space="preserve">als menschenlesbares Pendant zur Maschinen-Version: ein</w:t>
+            </w:r>
+            <w:r>
+              <w:t xml:space="preserve"> </w:t>
+            </w:r>
+            <w:r>
+              <w:rPr>
+                <w:rStyle w:val="VerbatimChar"/>
+              </w:rPr>
+              <w:t xml:space="preserve">[Unreleased]</w:t>
+            </w:r>
+            <w:r>
+              <w:t xml:space="preserve">-Abschnitt sammelt laufende Änderungen, beim Release wird er auf eine konkrete Version geschoben; Kategorien</w:t>
+            </w:r>
+            <w:r>
+              <w:t xml:space="preserve"> </w:t>
+            </w:r>
+            <w:r>
+              <w:rPr>
+                <w:rStyle w:val="VerbatimChar"/>
+              </w:rPr>
+              <w:t xml:space="preserve">Added/Changed/Deprecated/Removed/Fixed/Security</w:t>
+            </w:r>
+            <w:r>
+              <w:t xml:space="preserve"> </w:t>
+            </w:r>
+            <w:r>
+              <w:t xml:space="preserve">strukturieren die Notes konsistent. (4)</w:t>
+            </w:r>
+            <w:r>
+              <w:t xml:space="preserve"> </w:t>
+            </w:r>
+            <w:r>
+              <w:rPr>
+                <w:b/>
+                <w:bCs/>
+              </w:rPr>
+              <w:t xml:space="preserve">Bewusst nicht automatisiert (vorerst)</w:t>
+            </w:r>
+            <w:r>
+              <w:t xml:space="preserve"> </w:t>
+            </w:r>
+            <w:r>
+              <w:t xml:space="preserve">— Tools wie</w:t>
+            </w:r>
+            <w:r>
+              <w:t xml:space="preserve"> </w:t>
+            </w:r>
+            <w:r>
+              <w:rPr>
+                <w:rStyle w:val="VerbatimChar"/>
+              </w:rPr>
+              <w:t xml:space="preserve">release-please</w:t>
+            </w:r>
+            <w:r>
+              <w:t xml:space="preserve"> </w:t>
+            </w:r>
+            <w:r>
+              <w:t xml:space="preserve">oder</w:t>
+            </w:r>
+            <w:r>
+              <w:t xml:space="preserve"> </w:t>
+            </w:r>
+            <w:r>
+              <w:rPr>
+                <w:rStyle w:val="VerbatimChar"/>
+              </w:rPr>
+              <w:t xml:space="preserve">semantic-release</w:t>
+            </w:r>
+            <w:r>
+              <w:t xml:space="preserve"> </w:t>
+            </w:r>
+            <w:r>
+              <w:t xml:space="preserve">(Conventional-Commits-getrieben) sind für ein Ein-Personen-Projekt im MVP-Stadium Over-Engineering; die manuelle Pflege ist günstig genug und wird bei wachsendem Team neu bewertet.</w:t>
+            </w:r>
+            <w:r>
+              <w:t xml:space="preserve"> </w:t>
+            </w:r>
+            <w:r>
+              <w:rPr>
+                <w:b/>
+                <w:bCs/>
+              </w:rPr>
+              <w:t xml:space="preserve">Implementierung:</w:t>
+            </w:r>
+            <w:r>
+              <w:t xml:space="preserve"> </w:t>
+            </w:r>
+            <w:r>
+              <w:rPr>
+                <w:rStyle w:val="VerbatimChar"/>
+              </w:rPr>
+              <w:t xml:space="preserve">allprojects { group = "com.cas.tsas"; version = "0.1.0" }</w:t>
+            </w:r>
+            <w:r>
+              <w:t xml:space="preserve"> </w:t>
+            </w:r>
+            <w:r>
+              <w:t xml:space="preserve">in</w:t>
+            </w:r>
+            <w:r>
+              <w:t xml:space="preserve"> </w:t>
+            </w:r>
+            <w:r>
+              <w:rPr>
+                <w:rStyle w:val="VerbatimChar"/>
+              </w:rPr>
+              <w:t xml:space="preserve">backend/build.gradle.kts</w:t>
+            </w:r>
+            <w:r>
+              <w:t xml:space="preserve">,</w:t>
+            </w:r>
+            <w:r>
+              <w:t xml:space="preserve"> </w:t>
+            </w:r>
+            <w:r>
+              <w:rPr>
+                <w:rStyle w:val="VerbatimChar"/>
+              </w:rPr>
+              <w:t xml:space="preserve">"version": "0.1.0"</w:t>
+            </w:r>
+            <w:r>
+              <w:t xml:space="preserve"> </w:t>
+            </w:r>
+            <w:r>
+              <w:t xml:space="preserve">in</w:t>
+            </w:r>
+            <w:r>
+              <w:t xml:space="preserve"> </w:t>
+            </w:r>
+            <w:r>
+              <w:rPr>
+                <w:rStyle w:val="VerbatimChar"/>
+              </w:rPr>
+              <w:t xml:space="preserve">frontend/package.json</w:t>
+            </w:r>
+            <w:r>
+              <w:t xml:space="preserve">,</w:t>
+            </w:r>
+            <w:r>
+              <w:t xml:space="preserve"> </w:t>
+            </w:r>
+            <w:r>
+              <w:rPr>
+                <w:rStyle w:val="VerbatimChar"/>
+              </w:rPr>
+              <w:t xml:space="preserve">CHANGELOG.md</w:t>
+            </w:r>
+            <w:r>
+              <w:t xml:space="preserve"> </w:t>
+            </w:r>
+            <w:r>
+              <w:t xml:space="preserve">im Repo-Root, Git-Tags</w:t>
+            </w:r>
+            <w:r>
+              <w:t xml:space="preserve"> </w:t>
+            </w:r>
+            <w:r>
+              <w:rPr>
+                <w:rStyle w:val="VerbatimChar"/>
+              </w:rPr>
+              <w:t xml:space="preserve">vX.Y.Z</w:t>
+            </w:r>
+            <w:r>
+              <w:t xml:space="preserve"> </w:t>
+            </w:r>
+            <w:r>
+              <w:t xml:space="preserve">auf dem Merge-Commit jeder Version.</w:t>
             </w:r>
           </w:p>
         </w:tc>

</xml_diff>